<commit_message>
Normalize supplementary section numbering
</commit_message>
<xml_diff>
--- a/supplementary_material/Demand_Polarity_Map_Supplementary_v40_final.docx
+++ b/supplementary_material/Demand_Polarity_Map_Supplementary_v40_final.docx
@@ -11,8 +11,6 @@
           <w:lang w:val="en-US"/>
         </w:rPr>
       </w:pPr>
-      <w:bookmarkStart w:id="0" w:name="_GoBack"/>
-      <w:bookmarkEnd w:id="0"/>
       <w:r>
         <w:rPr>
           <w:rFonts w:cs="Times New Roman"/>
@@ -100,6 +98,7 @@
       <w:r>
         <w:rPr>
           <w:rFonts w:cs="Times New Roman"/>
+          <w:b/>
           <w:lang w:val="en-US"/>
         </w:rPr>
         <w:t>Table S1. External literature evidence classes used in the consistency audit.</w:t>
@@ -996,6 +995,7 @@
       <w:r>
         <w:rPr>
           <w:rFonts w:cs="Times New Roman"/>
+          <w:b/>
           <w:lang w:val="en-US"/>
         </w:rPr>
         <w:t>Table S2. Zhang and Far (2024) period-ratio extraction summary.</w:t>
@@ -1384,12 +1384,14 @@
         <w:jc w:val="both"/>
         <w:rPr>
           <w:rFonts w:cs="Times New Roman"/>
+          <w:b/>
           <w:lang w:val="en-US"/>
         </w:rPr>
       </w:pPr>
       <w:r>
         <w:rPr>
           <w:rFonts w:cs="Times New Roman"/>
+          <w:b/>
           <w:lang w:val="en-US"/>
         </w:rPr>
         <w:t>Table S3. Claim gap matrix for screening-level contribution.</w:t>
@@ -2208,6 +2210,7 @@
         <w:jc w:val="both"/>
         <w:rPr>
           <w:rFonts w:cs="Times New Roman"/>
+          <w:b/>
           <w:lang w:val="en-US"/>
         </w:rPr>
       </w:pPr>
@@ -2217,7 +2220,22 @@
           <w:b/>
           <w:lang w:val="en-US"/>
         </w:rPr>
+        <w:lastRenderedPageBreak/>
         <w:t>S4. Detailed methodological hierarchy and claim-boundary gates moved from main text</w:t>
+      </w:r>
+    </w:p>
+    <w:p>
+      <w:pPr>
+        <w:pStyle w:val="Heading2"/>
+        <w:rPr>
+          <w:lang w:val="en-US"/>
+        </w:rPr>
+      </w:pPr>
+      <w:r>
+        <w:rPr>
+          <w:lang w:val="en-US"/>
+        </w:rPr>
+        <w:t>S4.1 Methodological framework</w:t>
       </w:r>
     </w:p>
     <w:p>
@@ -2233,56 +2251,21 @@
           <w:rFonts w:cs="Times New Roman"/>
           <w:lang w:val="en-US"/>
         </w:rPr>
-        <w:t>5 Methodological framework</w:t>
+        <w:t>This study evaluates the SSI Demand-Polarity Map through a hierarchical, falsable protocol rather than through an undifferentiated collection of checks. Each layer has a distinct purpose, data type, independence level, pass/fail gate and claim boundary. Verification, spectral consistency, synthetic stress testing, external mapping, solver consistency and field benchmark falsification are therefore treated as separate evidence classes.</w:t>
       </w:r>
     </w:p>
     <w:p>
       <w:pPr>
-        <w:jc w:val="both"/>
-        <w:rPr>
-          <w:rFonts w:cs="Times New Roman"/>
+        <w:pStyle w:val="Heading2"/>
+        <w:rPr>
           <w:lang w:val="en-US"/>
         </w:rPr>
       </w:pPr>
       <w:r>
         <w:rPr>
-          <w:rFonts w:cs="Times New Roman"/>
-          <w:lang w:val="en-US"/>
-        </w:rPr>
-        <w:t>This study evaluates the SSI Demand-Polarity Map through a hierarchical, falsable protocol rather than through an undifferentiated collection of checks. Each layer has a distinct purpose, data type, independence level, pass/fail gate and claim boundary. Verification, spectral consistency, synthetic stress testing, external mapping, solver consistency and field benchmark falsification are therefore treated as separate evidence classes.</w:t>
-      </w:r>
-    </w:p>
-    <w:p>
-      <w:pPr>
-        <w:jc w:val="both"/>
-        <w:rPr>
-          <w:rFonts w:cs="Times New Roman"/>
-          <w:lang w:val="en-US"/>
-        </w:rPr>
-      </w:pPr>
-      <w:r>
-        <w:rPr>
-          <w:rFonts w:cs="Times New Roman"/>
-          <w:lang w:val="en-US"/>
-        </w:rPr>
-        <w:t>5.1 Evidence hierarchy and claim boundaries</w:t>
-      </w:r>
-    </w:p>
-    <w:p>
-      <w:pPr>
-        <w:keepNext/>
-        <w:jc w:val="both"/>
-        <w:rPr>
-          <w:rFonts w:cs="Times New Roman"/>
-          <w:lang w:val="en-US"/>
-        </w:rPr>
-      </w:pPr>
-      <w:r>
-        <w:rPr>
-          <w:rFonts w:cs="Times New Roman"/>
-          <w:lang w:val="en-US"/>
-        </w:rPr>
-        <w:t>Table M1. Methodological evidence hierarchy and claim boundaries.</w:t>
+          <w:lang w:val="en-US"/>
+        </w:rPr>
+        <w:t>S4.2 Evidence hierarchy and claim boundaries</w:t>
       </w:r>
     </w:p>
     <w:tbl>
@@ -3199,7 +3182,16 @@
                 <w:sz w:val="20"/>
                 <w:lang w:val="en-US"/>
               </w:rPr>
-              <w:t>OpenSees period error &lt; 1 percent and mesh-change gate documented</w:t>
+              <w:t xml:space="preserve">OpenSees period error &lt; 1 percent and mesh-change </w:t>
+            </w:r>
+            <w:r>
+              <w:rPr>
+                <w:rFonts w:cs="Times New Roman"/>
+                <w:sz w:val="20"/>
+                <w:lang w:val="en-US"/>
+              </w:rPr>
+              <w:lastRenderedPageBreak/>
+              <w:t>gate documented</w:t>
             </w:r>
           </w:p>
         </w:tc>
@@ -3220,6 +3212,7 @@
                 <w:rFonts w:cs="Times New Roman"/>
                 <w:sz w:val="20"/>
               </w:rPr>
+              <w:lastRenderedPageBreak/>
               <w:t>linear solver-chain consistency</w:t>
             </w:r>
           </w:p>
@@ -3412,18 +3405,16 @@
     </w:tbl>
     <w:p>
       <w:pPr>
-        <w:jc w:val="both"/>
-        <w:rPr>
-          <w:rFonts w:cs="Times New Roman"/>
+        <w:pStyle w:val="Heading2"/>
+        <w:rPr>
           <w:lang w:val="en-US"/>
         </w:rPr>
       </w:pPr>
       <w:r>
         <w:rPr>
-          <w:rFonts w:cs="Times New Roman"/>
-          <w:lang w:val="en-US"/>
-        </w:rPr>
-        <w:t>5.2 Predefined gates and negative evidence</w:t>
+          <w:lang w:val="en-US"/>
+        </w:rPr>
+        <w:t>S4.3 Predefined gates and negative evidence</w:t>
       </w:r>
     </w:p>
     <w:p>
@@ -3440,23 +3431,6 @@
           <w:lang w:val="en-US"/>
         </w:rPr>
         <w:t>Each result is interpreted through a gate declared before the corresponding claim is allowed. Passing a gate expands only the claim associated with that layer; failing a gate narrows the claim or converts the evidence into falsification.</w:t>
-      </w:r>
-    </w:p>
-    <w:p>
-      <w:pPr>
-        <w:keepNext/>
-        <w:jc w:val="both"/>
-        <w:rPr>
-          <w:rFonts w:cs="Times New Roman"/>
-          <w:lang w:val="en-US"/>
-        </w:rPr>
-      </w:pPr>
-      <w:r>
-        <w:rPr>
-          <w:rFonts w:cs="Times New Roman"/>
-          <w:lang w:val="en-US"/>
-        </w:rPr>
-        <w:t>Table M2. Predefined methodological gates and observed status.</w:t>
       </w:r>
     </w:p>
     <w:tbl>
@@ -4477,16 +4451,10 @@
     </w:tbl>
     <w:p>
       <w:pPr>
-        <w:jc w:val="both"/>
-        <w:rPr>
-          <w:rFonts w:cs="Times New Roman"/>
-        </w:rPr>
+        <w:pStyle w:val="Heading2"/>
       </w:pPr>
       <w:r>
-        <w:rPr>
-          <w:rFonts w:cs="Times New Roman"/>
-        </w:rPr>
-        <w:t>5.3 Field benchmark falsification protocol</w:t>
+        <w:t>S4.4 Field benchmark falsification protocol</w:t>
       </w:r>
     </w:p>
     <w:p>
@@ -4503,23 +4471,6 @@
           <w:lang w:val="en-US"/>
         </w:rPr>
         <w:t>Negative evidence is not treated as failed validation to be hidden; it is treated as an explicit falsification layer that bounds the claim. Garner Valley is therefore named a validation-falsification benchmark: base-channel waveform handling and timing are data-traceability evidence, while failed polarity, FRF, OpenSees predictive and auxiliary-sensor gates reject a positive nonlinear 3D SFSI validation claim for the current implementation.</w:t>
-      </w:r>
-    </w:p>
-    <w:p>
-      <w:pPr>
-        <w:keepNext/>
-        <w:jc w:val="both"/>
-        <w:rPr>
-          <w:rFonts w:cs="Times New Roman"/>
-          <w:lang w:val="en-US"/>
-        </w:rPr>
-      </w:pPr>
-      <w:r>
-        <w:rPr>
-          <w:rFonts w:cs="Times New Roman"/>
-          <w:lang w:val="en-US"/>
-        </w:rPr>
-        <w:t>Table M3. Garner Valley validation-falsification gate table.</w:t>
       </w:r>
     </w:p>
     <w:tbl>
@@ -4740,6 +4691,7 @@
                 <w:sz w:val="20"/>
                 <w:lang w:val="en-US"/>
               </w:rPr>
+              <w:lastRenderedPageBreak/>
               <w:t>Full-resolution auxiliary SFSI channels</w:t>
             </w:r>
           </w:p>
@@ -5356,18 +5308,16 @@
     </w:tbl>
     <w:p>
       <w:pPr>
-        <w:jc w:val="both"/>
-        <w:rPr>
-          <w:rFonts w:cs="Times New Roman"/>
+        <w:pStyle w:val="Heading2"/>
+        <w:rPr>
           <w:lang w:val="en-US"/>
         </w:rPr>
       </w:pPr>
       <w:r>
         <w:rPr>
-          <w:rFonts w:cs="Times New Roman"/>
-          <w:lang w:val="en-US"/>
-        </w:rPr>
-        <w:t>5.4 Ablation, uncertainty and controls</w:t>
+          <w:lang w:val="en-US"/>
+        </w:rPr>
+        <w:t>S4.5 Ablation, uncertainty and controls</w:t>
       </w:r>
     </w:p>
     <w:p>
@@ -5436,23 +5386,6 @@
           <w:lang w:val="en-US"/>
         </w:rPr>
         <w:t>; cases inside the uncertainty band are not promoted to decisive beneficial or detrimental classifications.</w:t>
-      </w:r>
-    </w:p>
-    <w:p>
-      <w:pPr>
-        <w:keepNext/>
-        <w:jc w:val="both"/>
-        <w:rPr>
-          <w:rFonts w:cs="Times New Roman"/>
-          <w:lang w:val="en-US"/>
-        </w:rPr>
-      </w:pPr>
-      <w:r>
-        <w:rPr>
-          <w:rFonts w:cs="Times New Roman"/>
-          <w:lang w:val="en-US"/>
-        </w:rPr>
-        <w:t>Table M4. Claim-evidence traceability matrix.</w:t>
       </w:r>
     </w:p>
     <w:tbl>
@@ -5484,6 +5417,8 @@
                 <w:sz w:val="20"/>
               </w:rPr>
             </w:pPr>
+            <w:bookmarkStart w:id="0" w:name="_GoBack"/>
+            <w:bookmarkEnd w:id="0"/>
             <w:r>
               <w:rPr>
                 <w:rFonts w:cs="Times New Roman"/>
@@ -6310,6 +6245,7 @@
         <w:jc w:val="both"/>
         <w:rPr>
           <w:rFonts w:cs="Times New Roman"/>
+          <w:b/>
           <w:lang w:val="en-US"/>
         </w:rPr>
       </w:pPr>
@@ -6319,7 +6255,22 @@
           <w:b/>
           <w:lang w:val="en-US"/>
         </w:rPr>
+        <w:lastRenderedPageBreak/>
         <w:t>S5. Extended validation, falsification, decision-value and false-safe audits moved from main text</w:t>
+      </w:r>
+    </w:p>
+    <w:p>
+      <w:pPr>
+        <w:pStyle w:val="Heading2"/>
+        <w:rPr>
+          <w:lang w:val="en-US"/>
+        </w:rPr>
+      </w:pPr>
+      <w:r>
+        <w:rPr>
+          <w:lang w:val="en-US"/>
+        </w:rPr>
+        <w:t>S5.1 Predictive field SFSI validation protocol</w:t>
       </w:r>
     </w:p>
     <w:p>
@@ -6335,7 +6286,7 @@
           <w:rFonts w:cs="Times New Roman"/>
           <w:lang w:val="en-US"/>
         </w:rPr>
-        <w:t>8.5 Predictive field SFSI validation protocol</w:t>
+        <w:t>The field_validation supplementary module is retained as a protocol scaffold and source-audit layer, not as the main positive validation route. The current hierarchy uses FoRDy/FoRCy as the primary experimental proxy-validation layer, ERIES-RESPOND/POLIS as secondary controlled-dynamic support, and Garner Valley SFSI/GVDA as an independent falsification and instrumentation-audit case.</w:t>
       </w:r>
     </w:p>
     <w:p>
@@ -6351,7 +6302,21 @@
           <w:rFonts w:cs="Times New Roman"/>
           <w:lang w:val="en-US"/>
         </w:rPr>
-        <w:t>The field_validation supplementary module is retained as a protocol scaffold and source-audit layer, not as the main positive validation route. The current hierarchy uses FoRDy/FoRCy as the primary experimental proxy-validation layer, ERIES-RESPOND/POLIS as secondary controlled-dynamic support, and Garner Valley SFSI/GVDA as an independent falsification and instrumentation-audit case.</w:t>
+        <w:t>The protocol requires raw record acquisition, sensor and test manifests, a low-amplitude calibration set, frozen parameters, blind prediction of medium/high-amplitude tests, and sensor-level residual tables for transfer functions, time histories, phase, coherence, roof/foundation ratios, foundation/free-field ratios, displacement measurements and demand-polarity classes. The current package checks source availability and provides all required CSV templates, but it intentionally reports zero residual rows until real records are downloaded, processed and compared. Therefore, the manuscript does not claim completed predictive nonlinear 3D field SFSI validation in this version.</w:t>
+      </w:r>
+    </w:p>
+    <w:p>
+      <w:pPr>
+        <w:pStyle w:val="Heading2"/>
+        <w:rPr>
+          <w:lang w:val="en-US"/>
+        </w:rPr>
+      </w:pPr>
+      <w:r>
+        <w:rPr>
+          <w:lang w:val="en-US"/>
+        </w:rPr>
+        <w:t>S5.2 Real-record ERIES-POLIS blind sensor check</w:t>
       </w:r>
     </w:p>
     <w:p>
@@ -6367,7 +6332,7 @@
           <w:rFonts w:cs="Times New Roman"/>
           <w:lang w:val="en-US"/>
         </w:rPr>
-        <w:t>The protocol requires raw record acquisition, sensor and test manifests, a low-amplitude calibration set, frozen parameters, blind prediction of medium/high-amplitude tests, and sensor-level residual tables for transfer functions, time histories, phase, coherence, roof/foundation ratios, foundation/free-field ratios, displacement measurements and demand-polarity classes. The current package checks source availability and provides all required CSV templates, but it intentionally reports zero residual rows until real records are downloaded, processed and compared. Therefore, the manuscript does not claim completed predictive nonlinear 3D field SFSI validation in this version.</w:t>
+        <w:t>As a v17 supplement-level upgrade from protocol to real-record evidence, the validation hierarchy was reorganized around ERIES-RESPOND as the primary dataset, ERIES-POLIS as the secondary EuroProteas dataset, and Garner Valley SFSI/GVDA as an independent site/structure check. RESPOND and POLIS were processed from local ZIP archives without bundling the raw third-party data in the public package. Garner Valley was processed through public SFSI/GVDA documentation, the NEES channel-history API, published fixed/flexible frequency mapping, and public NEES viewer waveform-bin records.</w:t>
       </w:r>
     </w:p>
     <w:p>
@@ -6383,7 +6348,7 @@
           <w:rFonts w:cs="Times New Roman"/>
           <w:lang w:val="en-US"/>
         </w:rPr>
-        <w:t>8.6 Real-record ERIES-POLIS blind sensor check</w:t>
+        <w:t>The resulting RESPOND primary layer uses the 20240523 group-pile campaign, calibrates a frozen FVA roof/foundation transfer predictor, and blindly checks FVAB, FVABC and FVABCD. It adds 72 processed synchronized records, 27 blind residual rows, 27 transfer-function error rows and 27 sensor-proxy demand-polarity rows, with median NRMSE 0.064. The POLIS secondary layer indexes 276 XY records and adds 9 blind residual rows, 9 transfer-function error rows and 9 sensor-proxy demand-polarity rows, with median NRMSE 0.054. The Garner Valley independent layer adds 50 SFSI channel-history rows, 178 GVDA channel-history rows, 4 published fixed/flexible frequency-shift rows, 8 NEES viewer waveform-bin events with 21 GVDA-to-SFSI transfer residual rows, and a successful full-resolution NEES MiniSEED cart for the selected Garner Valley events. The v18 cart was generated through a user-provided NEES cart email, returned progress 100%, and downloaded a 401,882-byte archive with 88 entries, 80 non-empty files and exactly 48 MiniSEED waveform files: six requested GVDA/SFSI channels for each of the eight retained events. These results support a narrow real-record blind sensor-level check of the reduced screening workflow for the EuroProteas datasets plus independent Garner Valley site/structure/frequency-shift, waveform-bin transfer and full-resolution raw waveform extraction evidence. They do not constitute predictive nonlinear three-dimensional OpenSeesPy field-SFSI validation. The ERIES full-scale data layers are treated only as secondary transfer checks and are cited through their dataset publications (Pitilakis et al., 2025a; Pitilakis et al., 2025b).</w:t>
       </w:r>
     </w:p>
     <w:p>
@@ -6399,55 +6364,29 @@
           <w:rFonts w:cs="Times New Roman"/>
           <w:lang w:val="en-US"/>
         </w:rPr>
-        <w:t>As a v17 supplement-level upgrade from protocol to real-record evidence, the validation hierarchy was reorganized around ERIES-RESPOND as the primary dataset, ERIES-POLIS as the secondary EuroProteas dataset, and Garner Valley SFSI/GVDA as an independent site/structure check. RESPOND and POLIS were processed from local ZIP archives without bundling the raw third-party data in the public package. Garner Valley was processed through public SFSI/GVDA documentation, the NEES channel-history API, published fixed/flexible frequency mapping, and public NEES viewer waveform-bin records.</w:t>
+        <w:t xml:space="preserve">This distinction is important for interpretation: the RESPOND/POLIS real-record layers close the previous empty-residual-table problem, and the Garner Valley layer now closes the prior raw-cart acquisition gap by documenting usable full-resolution MiniSEED records for the requested </w:t>
+      </w:r>
+      <w:r>
+        <w:rPr>
+          <w:rFonts w:cs="Times New Roman"/>
+          <w:lang w:val="en-US"/>
+        </w:rPr>
+        <w:lastRenderedPageBreak/>
+        <w:t>GVDA/SFSI channels. The stronger claim of nonlinear 3D field validation remains a future validation stage requiring a frozen nonlinear OpenSeesPy model, sensor-coordinate model mapping and blind residuals from model predictions rather than transfer-predictor checks or data-availability validation alone.</w:t>
       </w:r>
     </w:p>
     <w:p>
       <w:pPr>
-        <w:jc w:val="both"/>
-        <w:rPr>
-          <w:rFonts w:cs="Times New Roman"/>
+        <w:pStyle w:val="Heading2"/>
+        <w:rPr>
           <w:lang w:val="en-US"/>
         </w:rPr>
       </w:pPr>
       <w:r>
         <w:rPr>
-          <w:rFonts w:cs="Times New Roman"/>
-          <w:lang w:val="en-US"/>
-        </w:rPr>
-        <w:t>The resulting RESPOND primary layer uses the 20240523 group-pile campaign, calibrates a frozen FVA roof/foundation transfer predictor, and blindly checks FVAB, FVABC and FVABCD. It adds 72 processed synchronized records, 27 blind residual rows, 27 transfer-function error rows and 27 sensor-proxy demand-polarity rows, with median NRMSE 0.064. The POLIS secondary layer indexes 276 XY records and adds 9 blind residual rows, 9 transfer-function error rows and 9 sensor-proxy demand-polarity rows, with median NRMSE 0.054. The Garner Valley independent layer adds 50 SFSI channel-history rows, 178 GVDA channel-history rows, 4 published fixed/flexible frequency-shift rows, 8 NEES viewer waveform-bin events with 21 GVDA-to-SFSI transfer residual rows, and a successful full-resolution NEES MiniSEED cart for the selected Garner Valley events. The v18 cart was generated through a user-provided NEES cart email, returned progress 100%, and downloaded a 401,882-byte archive with 88 entries, 80 non-empty files and exactly 48 MiniSEED waveform files: six requested GVDA/SFSI channels for each of the eight retained events. These results support a narrow real-record blind sensor-level check of the reduced screening workflow for the EuroProteas datasets plus independent Garner Valley site/structure/frequency-shift, waveform-bin transfer and full-resolution raw waveform extraction evidence. They do not constitute predictive nonlinear three-dimensional OpenSeesPy field-SFSI validation. The ERIES full-scale data layers are treated only as secondary transfer checks and are cited through their dataset publications (Pitilakis et al., 2025a; Pitilakis et al., 2025b).</w:t>
-      </w:r>
-    </w:p>
-    <w:p>
-      <w:pPr>
-        <w:jc w:val="both"/>
-        <w:rPr>
-          <w:rFonts w:cs="Times New Roman"/>
-          <w:lang w:val="en-US"/>
-        </w:rPr>
-      </w:pPr>
-      <w:r>
-        <w:rPr>
-          <w:rFonts w:cs="Times New Roman"/>
-          <w:lang w:val="en-US"/>
-        </w:rPr>
-        <w:t>This distinction is important for interpretation: the RESPOND/POLIS real-record layers close the previous empty-residual-table problem, and the Garner Valley layer now closes the prior raw-cart acquisition gap by documenting usable full-resolution MiniSEED records for the requested GVDA/SFSI channels. The stronger claim of nonlinear 3D field validation remains a future validation stage requiring a frozen nonlinear OpenSeesPy model, sensor-coordinate model mapping and blind residuals from model predictions rather than transfer-predictor checks or data-availability validation alone.</w:t>
-      </w:r>
-    </w:p>
-    <w:p>
-      <w:pPr>
-        <w:jc w:val="both"/>
-        <w:rPr>
-          <w:rFonts w:cs="Times New Roman"/>
-          <w:lang w:val="en-US"/>
-        </w:rPr>
-      </w:pPr>
-      <w:r>
-        <w:rPr>
-          <w:rFonts w:cs="Times New Roman"/>
-          <w:lang w:val="en-US"/>
-        </w:rPr>
-        <w:t>8.7 Garner Valley validation-falsification gate outcome</w:t>
+          <w:lang w:val="en-US"/>
+        </w:rPr>
+        <w:t>S5.3 Garner Valley validation-falsification gate outcome</w:t>
       </w:r>
     </w:p>
     <w:p>
@@ -6503,18 +6442,16 @@
     </w:p>
     <w:p>
       <w:pPr>
-        <w:jc w:val="both"/>
-        <w:rPr>
-          <w:rFonts w:cs="Times New Roman"/>
+        <w:pStyle w:val="Heading2"/>
+        <w:rPr>
           <w:lang w:val="en-US"/>
         </w:rPr>
       </w:pPr>
       <w:r>
         <w:rPr>
-          <w:rFonts w:cs="Times New Roman"/>
-          <w:lang w:val="en-US"/>
-        </w:rPr>
-        <w:t>8.8 Executed FoRDy/FoRCy experimental proxy validation</w:t>
+          <w:lang w:val="en-US"/>
+        </w:rPr>
+        <w:t>S5.4 Executed FoRDy/FoRCy experimental proxy validation</w:t>
       </w:r>
     </w:p>
     <w:p>
@@ -6610,6 +6547,7 @@
         <w:jc w:val="center"/>
         <w:rPr>
           <w:rFonts w:cs="Times New Roman"/>
+          <w:b/>
           <w:sz w:val="20"/>
           <w:lang w:val="en-US"/>
         </w:rPr>
@@ -6617,6 +6555,7 @@
       <w:r>
         <w:rPr>
           <w:rFonts w:cs="Times New Roman"/>
+          <w:b/>
           <w:lang w:val="en-US"/>
         </w:rPr>
         <w:t>Table S4. FoRDy/FoRCy experimental proxy-class validation metrics.</w:t>
@@ -7389,18 +7328,16 @@
     </w:p>
     <w:p>
       <w:pPr>
-        <w:jc w:val="both"/>
-        <w:rPr>
-          <w:rFonts w:cs="Times New Roman"/>
+        <w:pStyle w:val="Heading2"/>
+        <w:rPr>
           <w:lang w:val="en-US"/>
         </w:rPr>
       </w:pPr>
       <w:r>
         <w:rPr>
-          <w:rFonts w:cs="Times New Roman"/>
-          <w:lang w:val="en-US"/>
-        </w:rPr>
-        <w:t>8.9 Independent predictive proxy validation</w:t>
+          <w:lang w:val="en-US"/>
+        </w:rPr>
+        <w:t>S5.5 Independent predictive proxy validation</w:t>
       </w:r>
     </w:p>
     <w:p>
@@ -7507,6 +7444,7 @@
       <w:pPr>
         <w:rPr>
           <w:rFonts w:cs="Times New Roman"/>
+          <w:b/>
           <w:bCs/>
           <w:lang w:val="en-US"/>
         </w:rPr>
@@ -7514,6 +7452,7 @@
       <w:r>
         <w:rPr>
           <w:rFonts w:cs="Times New Roman"/>
+          <w:b/>
           <w:lang w:val="en-US"/>
         </w:rPr>
         <w:t>Table S5. Independent predictive and solver-backed class-validation layers compared with baseline rules.</w:t>
@@ -8664,18 +8603,16 @@
     </w:p>
     <w:p>
       <w:pPr>
-        <w:jc w:val="both"/>
-        <w:rPr>
-          <w:rFonts w:cs="Times New Roman"/>
+        <w:pStyle w:val="Heading2"/>
+        <w:rPr>
           <w:lang w:val="en-US"/>
         </w:rPr>
       </w:pPr>
       <w:r>
         <w:rPr>
-          <w:rFonts w:cs="Times New Roman"/>
-          <w:lang w:val="en-US"/>
-        </w:rPr>
-        <w:t>8.10 Decision-value validation of false-safe screening</w:t>
+          <w:lang w:val="en-US"/>
+        </w:rPr>
+        <w:t>S5.6 Decision-value validation of false-safe screening</w:t>
       </w:r>
     </w:p>
     <w:p>
@@ -8768,6 +8705,7 @@
         <w:jc w:val="center"/>
         <w:rPr>
           <w:rFonts w:cs="Times New Roman"/>
+          <w:b/>
           <w:sz w:val="20"/>
           <w:lang w:val="en-US"/>
         </w:rPr>
@@ -8775,6 +8713,7 @@
       <w:r>
         <w:rPr>
           <w:rFonts w:cs="Times New Roman"/>
+          <w:b/>
           <w:lang w:val="en-US"/>
         </w:rPr>
         <w:t>Table S6. Decision-value false-safe audit under asymmetric screening loss.</w:t>
@@ -9628,18 +9567,16 @@
     </w:p>
     <w:p>
       <w:pPr>
-        <w:jc w:val="both"/>
-        <w:rPr>
-          <w:rFonts w:cs="Times New Roman"/>
+        <w:pStyle w:val="Heading2"/>
+        <w:rPr>
           <w:lang w:val="en-US"/>
         </w:rPr>
       </w:pPr>
       <w:r>
         <w:rPr>
-          <w:rFonts w:cs="Times New Roman"/>
-          <w:lang w:val="en-US"/>
-        </w:rPr>
-        <w:t>8.11 Failure-mode atlas and empirical guardrails</w:t>
+          <w:lang w:val="en-US"/>
+        </w:rPr>
+        <w:t>S5.7 Failure-mode atlas and empirical guardrails</w:t>
       </w:r>
     </w:p>
     <w:p>
@@ -9771,6 +9708,7 @@
         <w:jc w:val="center"/>
         <w:rPr>
           <w:rFonts w:cs="Times New Roman"/>
+          <w:b/>
           <w:sz w:val="20"/>
           <w:lang w:val="en-US"/>
         </w:rPr>
@@ -9778,6 +9716,7 @@
       <w:r>
         <w:rPr>
           <w:rFonts w:cs="Times New Roman"/>
+          <w:b/>
           <w:lang w:val="en-US"/>
         </w:rPr>
         <w:t>Table S7. Failure-mode atlas and low-margin guardrail audit.</w:t>
@@ -10762,18 +10701,16 @@
     </w:p>
     <w:p>
       <w:pPr>
-        <w:jc w:val="both"/>
-        <w:rPr>
-          <w:rFonts w:cs="Times New Roman"/>
+        <w:pStyle w:val="Heading2"/>
+        <w:rPr>
           <w:lang w:val="en-US"/>
         </w:rPr>
       </w:pPr>
       <w:r>
         <w:rPr>
-          <w:rFonts w:cs="Times New Roman"/>
-          <w:lang w:val="en-US"/>
-        </w:rPr>
-        <w:t>8.12 External FLIQ liquefaction-oriented false-safe audit</w:t>
+          <w:lang w:val="en-US"/>
+        </w:rPr>
+        <w:t>S5.8 External FLIQ liquefaction-oriented false-safe audit</w:t>
       </w:r>
     </w:p>
     <w:p>
@@ -10853,6 +10790,7 @@
         <w:jc w:val="center"/>
         <w:rPr>
           <w:rFonts w:cs="Times New Roman"/>
+          <w:b/>
           <w:sz w:val="20"/>
           <w:lang w:val="en-US"/>
         </w:rPr>
@@ -10860,6 +10798,7 @@
       <w:r>
         <w:rPr>
           <w:rFonts w:cs="Times New Roman"/>
+          <w:b/>
           <w:lang w:val="en-US"/>
         </w:rPr>
         <w:t>Table S8. External FLIQ liquefaction-oriented false-safe audit.</w:t>
@@ -11374,18 +11313,10 @@
     </w:p>
     <w:p>
       <w:pPr>
-        <w:jc w:val="both"/>
-        <w:rPr>
-          <w:rFonts w:cs="Times New Roman"/>
-          <w:b/>
-        </w:rPr>
+        <w:pStyle w:val="Heading2"/>
       </w:pPr>
       <w:r>
-        <w:rPr>
-          <w:rFonts w:cs="Times New Roman"/>
-          <w:b/>
-        </w:rPr>
-        <w:t>8.13 External literature consistency benchmark</w:t>
+        <w:t>S5.9 External literature consistency benchmark</w:t>
       </w:r>
     </w:p>
     <w:p>
@@ -11456,6 +11387,7 @@
         <w:jc w:val="both"/>
         <w:rPr>
           <w:rFonts w:cs="Times New Roman"/>
+          <w:b/>
           <w:lang w:val="en-US"/>
         </w:rPr>
       </w:pPr>
@@ -11536,7 +11468,15 @@
       </w:r>
     </w:p>
     <w:p>
-      <w:r>
+      <w:pPr>
+        <w:rPr>
+          <w:b/>
+        </w:rPr>
+      </w:pPr>
+      <w:r>
+        <w:rPr>
+          <w:b/>
+        </w:rPr>
         <w:t>Figure S5.1. Experimental FoRDy/FoRCy proxy points on the SSI Demand-Polarity Map.</w:t>
       </w:r>
     </w:p>
@@ -11608,7 +11548,15 @@
       </w:r>
     </w:p>
     <w:p>
-      <w:r>
+      <w:pPr>
+        <w:rPr>
+          <w:b/>
+        </w:rPr>
+      </w:pPr>
+      <w:r>
+        <w:rPr>
+          <w:b/>
+        </w:rPr>
         <w:t>Figure S5.2. Independent predictive validation confusion matrix.</w:t>
       </w:r>
     </w:p>
@@ -11680,7 +11628,15 @@
       </w:r>
     </w:p>
     <w:p>
-      <w:r>
+      <w:pPr>
+        <w:rPr>
+          <w:b/>
+        </w:rPr>
+      </w:pPr>
+      <w:r>
+        <w:rPr>
+          <w:b/>
+        </w:rPr>
         <w:t>Figure S5.3. Decision-value loss-ratio sweep.</w:t>
       </w:r>
     </w:p>
@@ -11752,7 +11708,15 @@
       </w:r>
     </w:p>
     <w:p>
-      <w:r>
+      <w:pPr>
+        <w:rPr>
+          <w:b/>
+        </w:rPr>
+      </w:pPr>
+      <w:r>
+        <w:rPr>
+          <w:b/>
+        </w:rPr>
         <w:t>Figure S5.4. Guardrail tradeoff and failure-mode map.</w:t>
       </w:r>
     </w:p>
@@ -11824,7 +11788,15 @@
       </w:r>
     </w:p>
     <w:p>
-      <w:r>
+      <w:pPr>
+        <w:rPr>
+          <w:b/>
+        </w:rPr>
+      </w:pPr>
+      <w:r>
+        <w:rPr>
+          <w:b/>
+        </w:rPr>
         <w:t>Figure S5.5. Solver-backed demand-polarity map.</w:t>
       </w:r>
     </w:p>
@@ -12242,6 +12214,28 @@
       <w:rFonts w:ascii="Times New Roman" w:hAnsi="Times New Roman"/>
     </w:rPr>
   </w:style>
+  <w:style w:type="paragraph" w:styleId="Heading2">
+    <w:name w:val="heading 2"/>
+    <w:basedOn w:val="Normal"/>
+    <w:next w:val="Normal"/>
+    <w:link w:val="Heading2Char"/>
+    <w:uiPriority w:val="9"/>
+    <w:unhideWhenUsed/>
+    <w:qFormat/>
+    <w:rsid w:val="00E72EA5"/>
+    <w:pPr>
+      <w:keepNext/>
+      <w:keepLines/>
+      <w:spacing w:before="40" w:after="0"/>
+      <w:outlineLvl w:val="1"/>
+    </w:pPr>
+    <w:rPr>
+      <w:rFonts w:asciiTheme="majorHAnsi" w:eastAsiaTheme="majorEastAsia" w:hAnsiTheme="majorHAnsi" w:cstheme="majorBidi"/>
+      <w:color w:val="2E74B5" w:themeColor="accent1" w:themeShade="BF"/>
+      <w:sz w:val="26"/>
+      <w:szCs w:val="26"/>
+    </w:rPr>
+  </w:style>
   <w:style w:type="character" w:default="1" w:styleId="DefaultParagraphFont">
     <w:name w:val="Default Paragraph Font"/>
     <w:uiPriority w:val="1"/>
@@ -12348,6 +12342,19 @@
         </w:tcBorders>
       </w:tcPr>
     </w:tblStylePr>
+  </w:style>
+  <w:style w:type="character" w:customStyle="1" w:styleId="Heading2Char">
+    <w:name w:val="Heading 2 Char"/>
+    <w:basedOn w:val="DefaultParagraphFont"/>
+    <w:link w:val="Heading2"/>
+    <w:uiPriority w:val="9"/>
+    <w:rsid w:val="00E72EA5"/>
+    <w:rPr>
+      <w:rFonts w:asciiTheme="majorHAnsi" w:eastAsiaTheme="majorEastAsia" w:hAnsiTheme="majorHAnsi" w:cstheme="majorBidi"/>
+      <w:color w:val="2E74B5" w:themeColor="accent1" w:themeShade="BF"/>
+      <w:sz w:val="26"/>
+      <w:szCs w:val="26"/>
+    </w:rPr>
   </w:style>
 </w:styles>
 </file>

</xml_diff>

<commit_message>
Improve supplementary figure readability and table titles
</commit_message>
<xml_diff>
--- a/supplementary_material/Demand_Polarity_Map_Supplementary_v40_final.docx
+++ b/supplementary_material/Demand_Polarity_Map_Supplementary_v40_final.docx
@@ -11,6 +11,8 @@
           <w:lang w:val="en-US"/>
         </w:rPr>
       </w:pPr>
+      <w:bookmarkStart w:id="0" w:name="_GoBack"/>
+      <w:bookmarkEnd w:id="0"/>
       <w:r>
         <w:rPr>
           <w:rFonts w:cs="Times New Roman"/>
@@ -1873,6 +1875,7 @@
                 <w:b w:val="0"/>
                 <w:sz w:val="20"/>
               </w:rPr>
+              <w:lastRenderedPageBreak/>
               <w:t>Robust/marginal classification</w:t>
             </w:r>
           </w:p>
@@ -1985,7 +1988,6 @@
                 <w:b w:val="0"/>
                 <w:sz w:val="20"/>
               </w:rPr>
-              <w:lastRenderedPageBreak/>
               <w:t>Experimental proxy class audit</w:t>
             </w:r>
           </w:p>
@@ -2220,7 +2222,6 @@
           <w:b/>
           <w:lang w:val="en-US"/>
         </w:rPr>
-        <w:lastRenderedPageBreak/>
         <w:t>S4. Detailed methodological hierarchy and claim-boundary gates moved from main text</w:t>
       </w:r>
     </w:p>
@@ -2266,6 +2267,20 @@
           <w:lang w:val="en-US"/>
         </w:rPr>
         <w:t>S4.2 Evidence hierarchy and claim boundaries</w:t>
+      </w:r>
+    </w:p>
+    <w:p>
+      <w:pPr>
+        <w:rPr>
+          <w:b/>
+        </w:rPr>
+      </w:pPr>
+      <w:r>
+        <w:rPr>
+          <w:b/>
+          <w:sz w:val="20"/>
+        </w:rPr>
+        <w:t>Table S4.1. Methodological evidence hierarchy and claim boundaries.</w:t>
       </w:r>
     </w:p>
     <w:tbl>
@@ -3182,16 +3197,7 @@
                 <w:sz w:val="20"/>
                 <w:lang w:val="en-US"/>
               </w:rPr>
-              <w:t xml:space="preserve">OpenSees period error &lt; 1 percent and mesh-change </w:t>
-            </w:r>
-            <w:r>
-              <w:rPr>
-                <w:rFonts w:cs="Times New Roman"/>
-                <w:sz w:val="20"/>
-                <w:lang w:val="en-US"/>
-              </w:rPr>
-              <w:lastRenderedPageBreak/>
-              <w:t>gate documented</w:t>
+              <w:t>OpenSees period error &lt; 1 percent and mesh-change gate documented</w:t>
             </w:r>
           </w:p>
         </w:tc>
@@ -3212,7 +3218,6 @@
                 <w:rFonts w:cs="Times New Roman"/>
                 <w:sz w:val="20"/>
               </w:rPr>
-              <w:lastRenderedPageBreak/>
               <w:t>linear solver-chain consistency</w:t>
             </w:r>
           </w:p>
@@ -3431,6 +3436,20 @@
           <w:lang w:val="en-US"/>
         </w:rPr>
         <w:t>Each result is interpreted through a gate declared before the corresponding claim is allowed. Passing a gate expands only the claim associated with that layer; failing a gate narrows the claim or converts the evidence into falsification.</w:t>
+      </w:r>
+    </w:p>
+    <w:p>
+      <w:pPr>
+        <w:rPr>
+          <w:b/>
+        </w:rPr>
+      </w:pPr>
+      <w:r>
+        <w:rPr>
+          <w:b/>
+          <w:sz w:val="20"/>
+        </w:rPr>
+        <w:t>Table S4.2. Predefined methodological gates and observed status.</w:t>
       </w:r>
     </w:p>
     <w:tbl>
@@ -4473,6 +4492,20 @@
         <w:t>Negative evidence is not treated as failed validation to be hidden; it is treated as an explicit falsification layer that bounds the claim. Garner Valley is therefore named a validation-falsification benchmark: base-channel waveform handling and timing are data-traceability evidence, while failed polarity, FRF, OpenSees predictive and auxiliary-sensor gates reject a positive nonlinear 3D SFSI validation claim for the current implementation.</w:t>
       </w:r>
     </w:p>
+    <w:p>
+      <w:pPr>
+        <w:rPr>
+          <w:b/>
+        </w:rPr>
+      </w:pPr>
+      <w:r>
+        <w:rPr>
+          <w:b/>
+          <w:sz w:val="20"/>
+        </w:rPr>
+        <w:t>Table S4.3. Garner Valley validation-falsification gate table.</w:t>
+      </w:r>
+    </w:p>
     <w:tbl>
       <w:tblPr>
         <w:tblStyle w:val="PlainTable2"/>
@@ -4691,7 +4724,6 @@
                 <w:sz w:val="20"/>
                 <w:lang w:val="en-US"/>
               </w:rPr>
-              <w:lastRenderedPageBreak/>
               <w:t>Full-resolution auxiliary SFSI channels</w:t>
             </w:r>
           </w:p>
@@ -5386,6 +5418,20 @@
           <w:lang w:val="en-US"/>
         </w:rPr>
         <w:t>; cases inside the uncertainty band are not promoted to decisive beneficial or detrimental classifications.</w:t>
+      </w:r>
+    </w:p>
+    <w:p>
+      <w:pPr>
+        <w:rPr>
+          <w:b/>
+        </w:rPr>
+      </w:pPr>
+      <w:r>
+        <w:rPr>
+          <w:b/>
+          <w:sz w:val="20"/>
+        </w:rPr>
+        <w:t>Table S4.4. Claim-evidence traceability matrix.</w:t>
       </w:r>
     </w:p>
     <w:tbl>
@@ -5417,8 +5463,6 @@
                 <w:sz w:val="20"/>
               </w:rPr>
             </w:pPr>
-            <w:bookmarkStart w:id="0" w:name="_GoBack"/>
-            <w:bookmarkEnd w:id="0"/>
             <w:r>
               <w:rPr>
                 <w:rFonts w:cs="Times New Roman"/>
@@ -6255,7 +6299,6 @@
           <w:b/>
           <w:lang w:val="en-US"/>
         </w:rPr>
-        <w:lastRenderedPageBreak/>
         <w:t>S5. Extended validation, falsification, decision-value and false-safe audits moved from main text</w:t>
       </w:r>
     </w:p>
@@ -6364,15 +6407,7 @@
           <w:rFonts w:cs="Times New Roman"/>
           <w:lang w:val="en-US"/>
         </w:rPr>
-        <w:t xml:space="preserve">This distinction is important for interpretation: the RESPOND/POLIS real-record layers close the previous empty-residual-table problem, and the Garner Valley layer now closes the prior raw-cart acquisition gap by documenting usable full-resolution MiniSEED records for the requested </w:t>
-      </w:r>
-      <w:r>
-        <w:rPr>
-          <w:rFonts w:cs="Times New Roman"/>
-          <w:lang w:val="en-US"/>
-        </w:rPr>
-        <w:lastRenderedPageBreak/>
-        <w:t>GVDA/SFSI channels. The stronger claim of nonlinear 3D field validation remains a future validation stage requiring a frozen nonlinear OpenSeesPy model, sensor-coordinate model mapping and blind residuals from model predictions rather than transfer-predictor checks or data-availability validation alone.</w:t>
+        <w:t>This distinction is important for interpretation: the RESPOND/POLIS real-record layers close the previous empty-residual-table problem, and the Garner Valley layer now closes the prior raw-cart acquisition gap by documenting usable full-resolution MiniSEED records for the requested GVDA/SFSI channels. The stronger claim of nonlinear 3D field validation remains a future validation stage requiring a frozen nonlinear OpenSeesPy model, sensor-coordinate model mapping and blind residuals from model predictions rather than transfer-predictor checks or data-availability validation alone.</w:t>
       </w:r>
     </w:p>
     <w:p>
@@ -6523,19 +6558,22 @@
         <w:jc w:val="both"/>
         <w:rPr>
           <w:rFonts w:cs="Times New Roman"/>
+          <w:b/>
           <w:lang w:val="en-US"/>
         </w:rPr>
       </w:pPr>
       <w:r>
         <w:rPr>
           <w:rFonts w:cs="Times New Roman"/>
-          <w:lang w:val="en-US"/>
-        </w:rPr>
-        <w:t>Table S4 reports</w:t>
-      </w:r>
-      <w:r>
-        <w:rPr>
-          <w:rFonts w:cs="Times New Roman"/>
+          <w:b/>
+          <w:lang w:val="en-US"/>
+        </w:rPr>
+        <w:t>Table S5.1 reports</w:t>
+      </w:r>
+      <w:r>
+        <w:rPr>
+          <w:rFonts w:cs="Times New Roman"/>
+          <w:b/>
           <w:lang w:val="en-US"/>
         </w:rPr>
         <w:t xml:space="preserve"> the FoRDy/FoRCy experimental proxy-class validation metrics used to evaluate class-level screening performance.</w:t>
@@ -6558,7 +6596,7 @@
           <w:b/>
           <w:lang w:val="en-US"/>
         </w:rPr>
-        <w:t>Table S4. FoRDy/FoRCy experimental proxy-class validation metrics.</w:t>
+        <w:t>Table S5.1. FoRDy/FoRCy experimental proxy-class validation metrics.</w:t>
       </w:r>
     </w:p>
     <w:tbl>
@@ -7422,19 +7460,22 @@
         <w:jc w:val="both"/>
         <w:rPr>
           <w:rFonts w:cs="Times New Roman"/>
+          <w:b/>
           <w:lang w:val="en-US"/>
         </w:rPr>
       </w:pPr>
       <w:r>
         <w:rPr>
           <w:rFonts w:cs="Times New Roman"/>
-          <w:lang w:val="en-US"/>
-        </w:rPr>
-        <w:t>Table S5 compares</w:t>
-      </w:r>
-      <w:r>
-        <w:rPr>
-          <w:rFonts w:cs="Times New Roman"/>
+          <w:b/>
+          <w:lang w:val="en-US"/>
+        </w:rPr>
+        <w:t>Table S5.2 compares</w:t>
+      </w:r>
+      <w:r>
+        <w:rPr>
+          <w:rFonts w:cs="Times New Roman"/>
+          <w:b/>
           <w:lang w:val="en-US"/>
         </w:rPr>
         <w:t xml:space="preserve"> the independent predictive proxy-validation layer, the V2 OpenSeesPy solver-backed class-prediction layer, and simpler baseline rules.</w:t>
@@ -7455,7 +7496,7 @@
           <w:b/>
           <w:lang w:val="en-US"/>
         </w:rPr>
-        <w:t>Table S5. Independent predictive and solver-backed class-validation layers compared with baseline rules.</w:t>
+        <w:t>Table S5.2. Independent predictive and solver-backed class-validation layers compared with baseline rules.</w:t>
       </w:r>
     </w:p>
     <w:tbl>
@@ -8681,19 +8722,22 @@
         <w:jc w:val="both"/>
         <w:rPr>
           <w:rFonts w:cs="Times New Roman"/>
+          <w:b/>
           <w:lang w:val="en-US"/>
         </w:rPr>
       </w:pPr>
       <w:r>
         <w:rPr>
           <w:rFonts w:cs="Times New Roman"/>
-          <w:lang w:val="en-US"/>
-        </w:rPr>
-        <w:t>Table S6 reports</w:t>
-      </w:r>
-      <w:r>
-        <w:rPr>
-          <w:rFonts w:cs="Times New Roman"/>
+          <w:b/>
+          <w:lang w:val="en-US"/>
+        </w:rPr>
+        <w:t>Table S5.3 reports</w:t>
+      </w:r>
+      <w:r>
+        <w:rPr>
+          <w:rFonts w:cs="Times New Roman"/>
+          <w:b/>
           <w:lang w:val="en-US"/>
         </w:rPr>
         <w:t xml:space="preserve"> the decision-value false-safe audit under asymmetric screening loss.</w:t>
@@ -8716,7 +8760,7 @@
           <w:b/>
           <w:lang w:val="en-US"/>
         </w:rPr>
-        <w:t>Table S6. Decision-value false-safe audit under asymmetric screening loss.</w:t>
+        <w:t>Table S5.3. Decision-value false-safe audit under asymmetric screening loss.</w:t>
       </w:r>
     </w:p>
     <w:tbl>
@@ -9684,19 +9728,22 @@
         <w:jc w:val="both"/>
         <w:rPr>
           <w:rFonts w:cs="Times New Roman"/>
+          <w:b/>
           <w:lang w:val="en-US"/>
         </w:rPr>
       </w:pPr>
       <w:r>
         <w:rPr>
           <w:rFonts w:cs="Times New Roman"/>
-          <w:lang w:val="en-US"/>
-        </w:rPr>
-        <w:t>Table S7 reports</w:t>
-      </w:r>
-      <w:r>
-        <w:rPr>
-          <w:rFonts w:cs="Times New Roman"/>
+          <w:b/>
+          <w:lang w:val="en-US"/>
+        </w:rPr>
+        <w:t>Table S5.4 reports</w:t>
+      </w:r>
+      <w:r>
+        <w:rPr>
+          <w:rFonts w:cs="Times New Roman"/>
+          <w:b/>
           <w:lang w:val="en-US"/>
         </w:rPr>
         <w:t xml:space="preserve"> the failure-mode atlas and low-margin guardrail audit.</w:t>
@@ -9719,7 +9766,7 @@
           <w:b/>
           <w:lang w:val="en-US"/>
         </w:rPr>
-        <w:t>Table S7. Failure-mode atlas and low-margin guardrail audit.</w:t>
+        <w:t>Table S5.4. Failure-mode atlas and low-margin guardrail audit.</w:t>
       </w:r>
     </w:p>
     <w:tbl>
@@ -10676,13 +10723,7 @@
         <w:rPr>
           <w:lang w:val="en-US"/>
         </w:rPr>
-        <w:t>Figure S5.4 shows</w:t>
-      </w:r>
-      <w:r>
-        <w:rPr>
-          <w:lang w:val="en-US"/>
-        </w:rPr>
-        <w:t xml:space="preserve"> the failure-mode atlas on the Demand-Polarity Map and the associated guardrail tradeoff.</w:t>
+        <w:t>Figure S5.4 shows the failure-mode atlas on the Demand-Polarity Map, and Figure S5.5 reports the associated guardrail tradeoff.</w:t>
       </w:r>
     </w:p>
     <w:p>
@@ -10766,19 +10807,22 @@
         <w:jc w:val="both"/>
         <w:rPr>
           <w:rFonts w:cs="Times New Roman"/>
+          <w:b/>
           <w:lang w:val="en-US"/>
         </w:rPr>
       </w:pPr>
       <w:r>
         <w:rPr>
           <w:rFonts w:cs="Times New Roman"/>
-          <w:lang w:val="en-US"/>
-        </w:rPr>
-        <w:t>Table S8 reports</w:t>
-      </w:r>
-      <w:r>
-        <w:rPr>
-          <w:rFonts w:cs="Times New Roman"/>
+          <w:b/>
+          <w:lang w:val="en-US"/>
+        </w:rPr>
+        <w:t>Table S5.5 reports</w:t>
+      </w:r>
+      <w:r>
+        <w:rPr>
+          <w:rFonts w:cs="Times New Roman"/>
+          <w:b/>
           <w:lang w:val="en-US"/>
         </w:rPr>
         <w:t xml:space="preserve"> the external FLIQ liquefaction-oriented false-safe audit.</w:t>
@@ -10801,7 +10845,7 @@
           <w:b/>
           <w:lang w:val="en-US"/>
         </w:rPr>
-        <w:t>Table S8. External FLIQ liquefaction-oriented false-safe audit.</w:t>
+        <w:t>Table S5.5. External FLIQ liquefaction-oriented false-safe audit.</w:t>
       </w:r>
     </w:p>
     <w:tbl>
@@ -11404,11 +11448,22 @@
       <w:pPr>
         <w:rPr>
           <w:rFonts w:cs="Times New Roman"/>
+          <w:lang w:val="en-US"/>
         </w:rPr>
       </w:pPr>
     </w:p>
     <w:p>
-      <w:r>
+      <w:pPr>
+        <w:rPr>
+          <w:rFonts w:cs="Times New Roman"/>
+          <w:lang w:val="en-US"/>
+        </w:rPr>
+      </w:pPr>
+      <w:r>
+        <w:rPr>
+          <w:rFonts w:cs="Times New Roman"/>
+          <w:lang w:val="en-US"/>
+        </w:rPr>
         <w:t>Figure S5.1 shows the FoRDy/FoRCy experimental proxy points on the SSI Demand-Polarity Map, providing the visual basis for the proxy-class validation layer.</w:t>
       </w:r>
     </w:p>
@@ -11416,6 +11471,7 @@
       <w:pPr>
         <w:rPr>
           <w:rFonts w:cs="Times New Roman"/>
+          <w:lang w:val="en-US"/>
         </w:rPr>
       </w:pPr>
       <w:r>
@@ -11428,7 +11484,7 @@
           <wp:inline distT="0" distB="0" distL="0" distR="0">
             <wp:extent cx="5612130" cy="3766185"/>
             <wp:effectExtent l="0" t="0" r="7620" b="5715"/>
-            <wp:docPr id="4" name="Picture 4"/>
+            <wp:docPr id="2" name="Picture 2"/>
             <wp:cNvGraphicFramePr>
               <a:graphicFrameLocks xmlns:a="http://schemas.openxmlformats.org/drawingml/2006/main" noChangeAspect="1"/>
             </wp:cNvGraphicFramePr>
@@ -11436,7 +11492,7 @@
               <a:graphicData uri="http://schemas.openxmlformats.org/drawingml/2006/picture">
                 <pic:pic xmlns:pic="http://schemas.openxmlformats.org/drawingml/2006/picture">
                   <pic:nvPicPr>
-                    <pic:cNvPr id="4" name=""/>
+                    <pic:cNvPr id="2" name=""/>
                     <pic:cNvPicPr/>
                   </pic:nvPicPr>
                   <pic:blipFill>
@@ -11470,12 +11526,16 @@
     <w:p>
       <w:pPr>
         <w:rPr>
+          <w:rFonts w:cs="Times New Roman"/>
           <w:b/>
+          <w:lang w:val="en-US"/>
         </w:rPr>
       </w:pPr>
       <w:r>
         <w:rPr>
+          <w:rFonts w:cs="Times New Roman"/>
           <w:b/>
+          <w:lang w:val="en-US"/>
         </w:rPr>
         <w:t>Figure S5.1. Experimental FoRDy/FoRCy proxy points on the SSI Demand-Polarity Map.</w:t>
       </w:r>
@@ -11484,11 +11544,22 @@
       <w:pPr>
         <w:rPr>
           <w:rFonts w:cs="Times New Roman"/>
+          <w:lang w:val="en-US"/>
         </w:rPr>
       </w:pPr>
     </w:p>
     <w:p>
-      <w:r>
+      <w:pPr>
+        <w:rPr>
+          <w:rFonts w:cs="Times New Roman"/>
+          <w:lang w:val="en-US"/>
+        </w:rPr>
+      </w:pPr>
+      <w:r>
+        <w:rPr>
+          <w:rFonts w:cs="Times New Roman"/>
+          <w:lang w:val="en-US"/>
+        </w:rPr>
         <w:t>Figure S5.2 reports the confusion matrix for the independent predictive validation layer, showing how the pre-response classifier distributes safe, mixed and detrimental cases.</w:t>
       </w:r>
     </w:p>
@@ -11496,6 +11567,7 @@
       <w:pPr>
         <w:rPr>
           <w:rFonts w:cs="Times New Roman"/>
+          <w:lang w:val="en-US"/>
         </w:rPr>
       </w:pPr>
       <w:r>
@@ -11508,7 +11580,7 @@
           <wp:inline distT="0" distB="0" distL="0" distR="0">
             <wp:extent cx="4754889" cy="4023368"/>
             <wp:effectExtent l="0" t="0" r="7620" b="0"/>
-            <wp:docPr id="7" name="Picture 7"/>
+            <wp:docPr id="3" name="Picture 3"/>
             <wp:cNvGraphicFramePr>
               <a:graphicFrameLocks xmlns:a="http://schemas.openxmlformats.org/drawingml/2006/main" noChangeAspect="1"/>
             </wp:cNvGraphicFramePr>
@@ -11516,7 +11588,7 @@
               <a:graphicData uri="http://schemas.openxmlformats.org/drawingml/2006/picture">
                 <pic:pic xmlns:pic="http://schemas.openxmlformats.org/drawingml/2006/picture">
                   <pic:nvPicPr>
-                    <pic:cNvPr id="7" name=""/>
+                    <pic:cNvPr id="3" name=""/>
                     <pic:cNvPicPr/>
                   </pic:nvPicPr>
                   <pic:blipFill>
@@ -11550,12 +11622,16 @@
     <w:p>
       <w:pPr>
         <w:rPr>
+          <w:rFonts w:cs="Times New Roman"/>
           <w:b/>
+          <w:lang w:val="en-US"/>
         </w:rPr>
       </w:pPr>
       <w:r>
         <w:rPr>
+          <w:rFonts w:cs="Times New Roman"/>
           <w:b/>
+          <w:lang w:val="en-US"/>
         </w:rPr>
         <w:t>Figure S5.2. Independent predictive validation confusion matrix.</w:t>
       </w:r>
@@ -11564,11 +11640,22 @@
       <w:pPr>
         <w:rPr>
           <w:rFonts w:cs="Times New Roman"/>
+          <w:lang w:val="en-US"/>
         </w:rPr>
       </w:pPr>
     </w:p>
     <w:p>
-      <w:r>
+      <w:pPr>
+        <w:rPr>
+          <w:rFonts w:cs="Times New Roman"/>
+          <w:lang w:val="en-US"/>
+        </w:rPr>
+      </w:pPr>
+      <w:r>
+        <w:rPr>
+          <w:rFonts w:cs="Times New Roman"/>
+          <w:lang w:val="en-US"/>
+        </w:rPr>
         <w:t>Figure S5.3 presents the decision-value loss-ratio sweep used to evaluate false-safe risk under asymmetric screening loss.</w:t>
       </w:r>
     </w:p>
@@ -11576,6 +11663,7 @@
       <w:pPr>
         <w:rPr>
           <w:rFonts w:cs="Times New Roman"/>
+          <w:lang w:val="en-US"/>
         </w:rPr>
       </w:pPr>
       <w:r>
@@ -11588,7 +11676,7 @@
           <wp:inline distT="0" distB="0" distL="0" distR="0">
             <wp:extent cx="5612130" cy="3581400"/>
             <wp:effectExtent l="0" t="0" r="7620" b="0"/>
-            <wp:docPr id="8" name="Picture 8"/>
+            <wp:docPr id="5" name="Picture 5"/>
             <wp:cNvGraphicFramePr>
               <a:graphicFrameLocks xmlns:a="http://schemas.openxmlformats.org/drawingml/2006/main" noChangeAspect="1"/>
             </wp:cNvGraphicFramePr>
@@ -11596,7 +11684,7 @@
               <a:graphicData uri="http://schemas.openxmlformats.org/drawingml/2006/picture">
                 <pic:pic xmlns:pic="http://schemas.openxmlformats.org/drawingml/2006/picture">
                   <pic:nvPicPr>
-                    <pic:cNvPr id="8" name=""/>
+                    <pic:cNvPr id="5" name=""/>
                     <pic:cNvPicPr/>
                   </pic:nvPicPr>
                   <pic:blipFill>
@@ -11630,12 +11718,16 @@
     <w:p>
       <w:pPr>
         <w:rPr>
+          <w:rFonts w:cs="Times New Roman"/>
           <w:b/>
+          <w:lang w:val="en-US"/>
         </w:rPr>
       </w:pPr>
       <w:r>
         <w:rPr>
+          <w:rFonts w:cs="Times New Roman"/>
           <w:b/>
+          <w:lang w:val="en-US"/>
         </w:rPr>
         <w:t>Figure S5.3. Decision-value loss-ratio sweep.</w:t>
       </w:r>
@@ -11644,18 +11736,30 @@
       <w:pPr>
         <w:rPr>
           <w:rFonts w:cs="Times New Roman"/>
+          <w:lang w:val="en-US"/>
         </w:rPr>
       </w:pPr>
     </w:p>
     <w:p>
-      <w:r>
-        <w:t>Figure S5.4 combines the guardrail tradeoff and failure-mode map to show where low-margin releases are escalated to prevent false-safe screening decisions.</w:t>
+      <w:pPr>
+        <w:rPr>
+          <w:rFonts w:cs="Times New Roman"/>
+          <w:lang w:val="en-US"/>
+        </w:rPr>
+      </w:pPr>
+      <w:r>
+        <w:rPr>
+          <w:rFonts w:cs="Times New Roman"/>
+          <w:lang w:val="en-US"/>
+        </w:rPr>
+        <w:t>Figure S5.4 shows the failure-mode atlas on the Demand-Polarity Map, identifying where robust, marginal, false-conservative and false-safe screening outcomes occur.</w:t>
       </w:r>
     </w:p>
     <w:p>
       <w:pPr>
         <w:rPr>
           <w:rFonts w:cs="Times New Roman"/>
+          <w:lang w:val="en-US"/>
         </w:rPr>
       </w:pPr>
       <w:r>
@@ -11666,9 +11770,9 @@
         </w:rPr>
         <w:drawing>
           <wp:inline distT="0" distB="0" distL="0" distR="0">
-            <wp:extent cx="5612130" cy="2035175"/>
-            <wp:effectExtent l="0" t="0" r="7620" b="3175"/>
-            <wp:docPr id="1" name="Picture 1"/>
+            <wp:extent cx="5612130" cy="3848100"/>
+            <wp:effectExtent l="0" t="0" r="7620" b="0"/>
+            <wp:docPr id="6" name="Picture 6"/>
             <wp:cNvGraphicFramePr>
               <a:graphicFrameLocks xmlns:a="http://schemas.openxmlformats.org/drawingml/2006/main" noChangeAspect="1"/>
             </wp:cNvGraphicFramePr>
@@ -11676,7 +11780,7 @@
               <a:graphicData uri="http://schemas.openxmlformats.org/drawingml/2006/picture">
                 <pic:pic xmlns:pic="http://schemas.openxmlformats.org/drawingml/2006/picture">
                   <pic:nvPicPr>
-                    <pic:cNvPr id="1" name=""/>
+                    <pic:cNvPr id="6" name=""/>
                     <pic:cNvPicPr/>
                   </pic:nvPicPr>
                   <pic:blipFill>
@@ -11694,7 +11798,7 @@
                   <pic:spPr>
                     <a:xfrm>
                       <a:off x="0" y="0"/>
-                      <a:ext cx="5612130" cy="2035175"/>
+                      <a:ext cx="5612130" cy="3848100"/>
                     </a:xfrm>
                     <a:prstGeom prst="rect">
                       <a:avLst/>
@@ -11710,32 +11814,48 @@
     <w:p>
       <w:pPr>
         <w:rPr>
+          <w:rFonts w:cs="Times New Roman"/>
           <w:b/>
+          <w:lang w:val="en-US"/>
         </w:rPr>
       </w:pPr>
       <w:r>
         <w:rPr>
+          <w:rFonts w:cs="Times New Roman"/>
           <w:b/>
-        </w:rPr>
-        <w:t>Figure S5.4. Guardrail tradeoff and failure-mode map.</w:t>
+          <w:lang w:val="en-US"/>
+        </w:rPr>
+        <w:t>Figure S5.4. Failure-mode atlas on the Demand-Polarity Map.</w:t>
       </w:r>
     </w:p>
     <w:p>
       <w:pPr>
         <w:rPr>
           <w:rFonts w:cs="Times New Roman"/>
+          <w:lang w:val="en-US"/>
         </w:rPr>
       </w:pPr>
     </w:p>
     <w:p>
-      <w:r>
-        <w:t>Figure S5.5 shows the solver-backed demand-polarity map used as a class-prediction check rather than as a full nonlinear response-history validation.</w:t>
+      <w:pPr>
+        <w:rPr>
+          <w:rFonts w:cs="Times New Roman"/>
+          <w:lang w:val="en-US"/>
+        </w:rPr>
+      </w:pPr>
+      <w:r>
+        <w:rPr>
+          <w:rFonts w:cs="Times New Roman"/>
+          <w:lang w:val="en-US"/>
+        </w:rPr>
+        <w:t>Figure S5.5 reports the guardrail tradeoff used to escalate low-margin releases and reduce false-safe screening decisions.</w:t>
       </w:r>
     </w:p>
     <w:p>
       <w:pPr>
         <w:rPr>
           <w:rFonts w:cs="Times New Roman"/>
+          <w:lang w:val="en-US"/>
         </w:rPr>
       </w:pPr>
       <w:r>
@@ -11746,9 +11866,9 @@
         </w:rPr>
         <w:drawing>
           <wp:inline distT="0" distB="0" distL="0" distR="0">
-            <wp:extent cx="5612130" cy="4344670"/>
+            <wp:extent cx="5612130" cy="3640455"/>
             <wp:effectExtent l="0" t="0" r="7620" b="0"/>
-            <wp:docPr id="10" name="Picture 10"/>
+            <wp:docPr id="9" name="Picture 9"/>
             <wp:cNvGraphicFramePr>
               <a:graphicFrameLocks xmlns:a="http://schemas.openxmlformats.org/drawingml/2006/main" noChangeAspect="1"/>
             </wp:cNvGraphicFramePr>
@@ -11756,11 +11876,107 @@
               <a:graphicData uri="http://schemas.openxmlformats.org/drawingml/2006/picture">
                 <pic:pic xmlns:pic="http://schemas.openxmlformats.org/drawingml/2006/picture">
                   <pic:nvPicPr>
-                    <pic:cNvPr id="10" name=""/>
+                    <pic:cNvPr id="9" name=""/>
                     <pic:cNvPicPr/>
                   </pic:nvPicPr>
                   <pic:blipFill>
-                    <a:blip r:embed="rId8">
+                    <a:blip r:embed="rId8" cstate="print">
+                      <a:extLst>
+                        <a:ext uri="{28A0092B-C50C-407E-A947-70E740481C1C}">
+                          <a14:useLocalDpi xmlns:a14="http://schemas.microsoft.com/office/drawing/2010/main" val="0"/>
+                        </a:ext>
+                      </a:extLst>
+                    </a:blip>
+                    <a:stretch>
+                      <a:fillRect/>
+                    </a:stretch>
+                  </pic:blipFill>
+                  <pic:spPr>
+                    <a:xfrm>
+                      <a:off x="0" y="0"/>
+                      <a:ext cx="5612130" cy="3640455"/>
+                    </a:xfrm>
+                    <a:prstGeom prst="rect">
+                      <a:avLst/>
+                    </a:prstGeom>
+                  </pic:spPr>
+                </pic:pic>
+              </a:graphicData>
+            </a:graphic>
+          </wp:inline>
+        </w:drawing>
+      </w:r>
+    </w:p>
+    <w:p>
+      <w:pPr>
+        <w:rPr>
+          <w:rFonts w:cs="Times New Roman"/>
+          <w:b/>
+          <w:lang w:val="en-US"/>
+        </w:rPr>
+      </w:pPr>
+      <w:r>
+        <w:rPr>
+          <w:rFonts w:cs="Times New Roman"/>
+          <w:b/>
+          <w:lang w:val="en-US"/>
+        </w:rPr>
+        <w:t>Figure S5.5. Guardrail tradeoff for map releases.</w:t>
+      </w:r>
+    </w:p>
+    <w:p>
+      <w:pPr>
+        <w:rPr>
+          <w:rFonts w:cs="Times New Roman"/>
+          <w:lang w:val="en-US"/>
+        </w:rPr>
+      </w:pPr>
+    </w:p>
+    <w:p>
+      <w:pPr>
+        <w:rPr>
+          <w:rFonts w:cs="Times New Roman"/>
+          <w:lang w:val="en-US"/>
+        </w:rPr>
+      </w:pPr>
+      <w:r>
+        <w:rPr>
+          <w:rFonts w:cs="Times New Roman"/>
+          <w:lang w:val="en-US"/>
+        </w:rPr>
+        <w:t>Figure S5.6 shows the solver-backed demand-polarity map used as a class-prediction check rather than as a full nonlinear response-history validation.</w:t>
+      </w:r>
+    </w:p>
+    <w:p>
+      <w:pPr>
+        <w:rPr>
+          <w:rFonts w:cs="Times New Roman"/>
+          <w:lang w:val="en-US"/>
+        </w:rPr>
+      </w:pPr>
+      <w:r>
+        <w:rPr>
+          <w:rFonts w:cs="Times New Roman"/>
+          <w:noProof/>
+          <w:lang w:eastAsia="es-PA"/>
+        </w:rPr>
+        <w:drawing>
+          <wp:inline distT="0" distB="0" distL="0" distR="0">
+            <wp:extent cx="5612130" cy="4344670"/>
+            <wp:effectExtent l="0" t="0" r="7620" b="0"/>
+            <wp:docPr id="11" name="Picture 11"/>
+            <wp:cNvGraphicFramePr>
+              <a:graphicFrameLocks xmlns:a="http://schemas.openxmlformats.org/drawingml/2006/main" noChangeAspect="1"/>
+            </wp:cNvGraphicFramePr>
+            <a:graphic xmlns:a="http://schemas.openxmlformats.org/drawingml/2006/main">
+              <a:graphicData uri="http://schemas.openxmlformats.org/drawingml/2006/picture">
+                <pic:pic xmlns:pic="http://schemas.openxmlformats.org/drawingml/2006/picture">
+                  <pic:nvPicPr>
+                    <pic:cNvPr id="11" name=""/>
+                    <pic:cNvPicPr/>
+                  </pic:nvPicPr>
+                  <pic:blipFill>
+                    <a:blip r:embed="rId9">
                       <a:extLst>
                         <a:ext uri="{28A0092B-C50C-407E-A947-70E740481C1C}">
                           <a14:useLocalDpi xmlns:a14="http://schemas.microsoft.com/office/drawing/2010/main" val="0"/>
@@ -11790,20 +12006,25 @@
     <w:p>
       <w:pPr>
         <w:rPr>
+          <w:rFonts w:cs="Times New Roman"/>
           <w:b/>
+          <w:lang w:val="en-US"/>
         </w:rPr>
       </w:pPr>
       <w:r>
         <w:rPr>
+          <w:rFonts w:cs="Times New Roman"/>
           <w:b/>
-        </w:rPr>
-        <w:t>Figure S5.5. Solver-backed demand-polarity map.</w:t>
+          <w:lang w:val="en-US"/>
+        </w:rPr>
+        <w:t>Figure S5.6. Solver-backed demand-polarity map.</w:t>
       </w:r>
     </w:p>
     <w:p>
       <w:pPr>
         <w:rPr>
           <w:rFonts w:cs="Times New Roman"/>
+          <w:lang w:val="en-US"/>
         </w:rPr>
       </w:pPr>
     </w:p>
@@ -12222,7 +12443,7 @@
     <w:uiPriority w:val="9"/>
     <w:unhideWhenUsed/>
     <w:qFormat/>
-    <w:rsid w:val="00E72EA5"/>
+    <w:rsid w:val="00481435"/>
     <w:pPr>
       <w:keepNext/>
       <w:keepLines/>
@@ -12230,9 +12451,8 @@
       <w:outlineLvl w:val="1"/>
     </w:pPr>
     <w:rPr>
-      <w:rFonts w:asciiTheme="majorHAnsi" w:eastAsiaTheme="majorEastAsia" w:hAnsiTheme="majorHAnsi" w:cstheme="majorBidi"/>
-      <w:color w:val="2E74B5" w:themeColor="accent1" w:themeShade="BF"/>
-      <w:sz w:val="26"/>
+      <w:rFonts w:eastAsiaTheme="majorEastAsia" w:cstheme="majorBidi"/>
+      <w:b/>
       <w:szCs w:val="26"/>
     </w:rPr>
   </w:style>
@@ -12348,11 +12568,10 @@
     <w:basedOn w:val="DefaultParagraphFont"/>
     <w:link w:val="Heading2"/>
     <w:uiPriority w:val="9"/>
-    <w:rsid w:val="00E72EA5"/>
+    <w:rsid w:val="00481435"/>
     <w:rPr>
-      <w:rFonts w:asciiTheme="majorHAnsi" w:eastAsiaTheme="majorEastAsia" w:hAnsiTheme="majorHAnsi" w:cstheme="majorBidi"/>
-      <w:color w:val="2E74B5" w:themeColor="accent1" w:themeShade="BF"/>
-      <w:sz w:val="26"/>
+      <w:rFonts w:ascii="Times New Roman" w:eastAsiaTheme="majorEastAsia" w:hAnsi="Times New Roman" w:cstheme="majorBidi"/>
+      <w:b/>
       <w:szCs w:val="26"/>
     </w:rPr>
   </w:style>

</xml_diff>

<commit_message>
Add supplementary table leads
</commit_message>
<xml_diff>
--- a/supplementary_material/Demand_Polarity_Map_Supplementary_v40_final.docx
+++ b/supplementary_material/Demand_Polarity_Map_Supplementary_v40_final.docx
@@ -88,20 +88,24 @@
       </w:r>
     </w:p>
     <w:p>
-      <w:pPr>
-        <w:keepNext/>
-        <w:jc w:val="both"/>
-        <w:rPr>
-          <w:rFonts w:cs="Times New Roman"/>
+      <w:r>
+        <w:rPr>
+          <w:sz w:val="20"/>
+        </w:rPr>
+        <w:t>Table S1 identifies the external evidence classes used in the li</w:t>
+      </w:r>
+      <w:r>
+        <w:rPr>
+          <w:sz w:val="20"/>
+        </w:rPr>
+        <w:t>terature-consistency audit and clarifies which sources are treated as direct quantitative comparisons versus secondary support.</w:t>
+      </w:r>
+    </w:p>
+    <w:p>
+      <w:r>
+        <w:rPr>
           <w:b/>
-          <w:lang w:val="en-US"/>
-        </w:rPr>
-      </w:pPr>
-      <w:r>
-        <w:rPr>
-          <w:rFonts w:cs="Times New Roman"/>
-          <w:b/>
-          <w:lang w:val="en-US"/>
+          <w:sz w:val="20"/>
         </w:rPr>
         <w:t>Table S1. External literature evidence classes used in the consistency audit.</w:t>
       </w:r>
@@ -617,17 +621,8 @@
                 <w:sz w:val="20"/>
                 <w:lang w:val="en-US"/>
               </w:rPr>
-              <w:t xml:space="preserve">Mylonakis and Gazetas, Seismic soil-structure interaction: </w:t>
-            </w:r>
-            <w:r>
-              <w:rPr>
-                <w:rFonts w:cs="Times New Roman"/>
-                <w:b w:val="0"/>
-                <w:sz w:val="20"/>
-                <w:lang w:val="en-US"/>
-              </w:rPr>
               <w:lastRenderedPageBreak/>
-              <w:t>Beneficial or detrimental?</w:t>
+              <w:t>Mylonakis and Gazetas, Seismic soil-structure interaction: Beneficial or detrimental?</w:t>
             </w:r>
           </w:p>
         </w:tc>
@@ -648,7 +643,6 @@
                 <w:rFonts w:cs="Times New Roman"/>
                 <w:sz w:val="20"/>
               </w:rPr>
-              <w:lastRenderedPageBreak/>
               <w:t>2000</w:t>
             </w:r>
           </w:p>
@@ -985,20 +979,24 @@
       </w:r>
     </w:p>
     <w:p>
-      <w:pPr>
-        <w:keepNext/>
-        <w:jc w:val="both"/>
-        <w:rPr>
-          <w:rFonts w:cs="Times New Roman"/>
+      <w:r>
+        <w:rPr>
+          <w:sz w:val="20"/>
+        </w:rPr>
+        <w:t xml:space="preserve">Table </w:t>
+      </w:r>
+      <w:r>
+        <w:rPr>
+          <w:sz w:val="20"/>
+        </w:rPr>
+        <w:t>S2 reports the extracted period-ratio quantities from Zhang and Far (2024), which are used to compare an independent high-rise SSI study with the demand-polarity interpretation.</w:t>
+      </w:r>
+    </w:p>
+    <w:p>
+      <w:r>
+        <w:rPr>
           <w:b/>
-          <w:lang w:val="en-US"/>
-        </w:rPr>
-      </w:pPr>
-      <w:r>
-        <w:rPr>
-          <w:rFonts w:cs="Times New Roman"/>
-          <w:b/>
-          <w:lang w:val="en-US"/>
+          <w:sz w:val="20"/>
         </w:rPr>
         <w:t>Table S2. Zhang and Far (2024) period-ratio extraction summary.</w:t>
       </w:r>
@@ -1381,20 +1379,24 @@
       </w:r>
     </w:p>
     <w:p>
-      <w:pPr>
-        <w:keepNext/>
-        <w:jc w:val="both"/>
-        <w:rPr>
-          <w:rFonts w:cs="Times New Roman"/>
+      <w:r>
+        <w:rPr>
+          <w:sz w:val="20"/>
+        </w:rPr>
+        <w:t>Table S3 links the screening claim to existing guida</w:t>
+      </w:r>
+      <w:r>
+        <w:rPr>
+          <w:sz w:val="20"/>
+        </w:rPr>
+        <w:t>nce, finite-element SSI simulations and rocking databases, showing where the supplementary evidence supports a distinct contribution.</w:t>
+      </w:r>
+    </w:p>
+    <w:p>
+      <w:r>
+        <w:rPr>
           <w:b/>
-          <w:lang w:val="en-US"/>
-        </w:rPr>
-      </w:pPr>
-      <w:r>
-        <w:rPr>
-          <w:rFonts w:cs="Times New Roman"/>
-          <w:b/>
-          <w:lang w:val="en-US"/>
+          <w:sz w:val="20"/>
         </w:rPr>
         <w:t>Table S3. Claim gap matrix for screening-level contribution.</w:t>
       </w:r>
@@ -1433,6 +1435,7 @@
                 <w:rFonts w:cs="Times New Roman"/>
                 <w:sz w:val="20"/>
               </w:rPr>
+              <w:lastRenderedPageBreak/>
               <w:t>Claim needed for screening</w:t>
             </w:r>
           </w:p>
@@ -1875,7 +1878,6 @@
                 <w:b w:val="0"/>
                 <w:sz w:val="20"/>
               </w:rPr>
-              <w:lastRenderedPageBreak/>
               <w:t>Robust/marginal classification</w:t>
             </w:r>
           </w:p>
@@ -2234,6 +2236,7 @@
       </w:pPr>
       <w:r>
         <w:rPr>
+          <w:b w:val="0"/>
           <w:lang w:val="en-US"/>
         </w:rPr>
         <w:t>S4.1 Methodological framework</w:t>
@@ -2264,17 +2267,27 @@
       </w:pPr>
       <w:r>
         <w:rPr>
+          <w:b w:val="0"/>
           <w:lang w:val="en-US"/>
         </w:rPr>
         <w:t>S4.2 Evidence hierarchy and claim boundaries</w:t>
       </w:r>
     </w:p>
     <w:p>
-      <w:pPr>
-        <w:rPr>
-          <w:b/>
-        </w:rPr>
-      </w:pPr>
+      <w:r>
+        <w:rPr>
+          <w:sz w:val="20"/>
+        </w:rPr>
+        <w:t xml:space="preserve">Table S4.1 summarizes the evidence hierarchy used in the supplementary protocol and states the claim </w:t>
+      </w:r>
+      <w:r>
+        <w:rPr>
+          <w:sz w:val="20"/>
+        </w:rPr>
+        <w:t>boundary attached to each verification, validation or falsification layer.</w:t>
+      </w:r>
+    </w:p>
+    <w:p>
       <w:r>
         <w:rPr>
           <w:b/>
@@ -3417,6 +3430,7 @@
       </w:pPr>
       <w:r>
         <w:rPr>
+          <w:b w:val="0"/>
           <w:lang w:val="en-US"/>
         </w:rPr>
         <w:t>S4.3 Predefined gates and negative evidence</w:t>
@@ -3439,11 +3453,20 @@
       </w:r>
     </w:p>
     <w:p>
-      <w:pPr>
-        <w:rPr>
-          <w:b/>
-        </w:rPr>
-      </w:pPr>
+      <w:r>
+        <w:rPr>
+          <w:sz w:val="20"/>
+        </w:rPr>
+        <w:t>Table S4.2 lists the predefined methodological gates and their</w:t>
+      </w:r>
+      <w:r>
+        <w:rPr>
+          <w:sz w:val="20"/>
+        </w:rPr>
+        <w:t xml:space="preserve"> observed pass/fail status, so that negative evidence narrows the claim rather than being hidden after the analysis.</w:t>
+      </w:r>
+    </w:p>
+    <w:p>
       <w:r>
         <w:rPr>
           <w:b/>
@@ -4473,6 +4496,9 @@
         <w:pStyle w:val="Heading2"/>
       </w:pPr>
       <w:r>
+        <w:rPr>
+          <w:b w:val="0"/>
+        </w:rPr>
         <w:t>S4.4 Field benchmark falsification protocol</w:t>
       </w:r>
     </w:p>
@@ -4493,11 +4519,20 @@
       </w:r>
     </w:p>
     <w:p>
-      <w:pPr>
-        <w:rPr>
-          <w:b/>
-        </w:rPr>
-      </w:pPr>
+      <w:r>
+        <w:rPr>
+          <w:sz w:val="20"/>
+        </w:rPr>
+        <w:t>Table S4.3 details the Garner Valley gate sequence used to decide whether the field benchmark supports validation or instead</w:t>
+      </w:r>
+      <w:r>
+        <w:rPr>
+          <w:sz w:val="20"/>
+        </w:rPr>
+        <w:t xml:space="preserve"> acts as a falsification boundary.</w:t>
+      </w:r>
+    </w:p>
+    <w:p>
       <w:r>
         <w:rPr>
           <w:b/>
@@ -5347,6 +5382,7 @@
       </w:pPr>
       <w:r>
         <w:rPr>
+          <w:b w:val="0"/>
           <w:lang w:val="en-US"/>
         </w:rPr>
         <w:t>S4.5 Ablation, uncertainty and controls</w:t>
@@ -5421,11 +5457,14 @@
       </w:r>
     </w:p>
     <w:p>
-      <w:pPr>
-        <w:rPr>
-          <w:b/>
-        </w:rPr>
-      </w:pPr>
+      <w:r>
+        <w:rPr>
+          <w:sz w:val="20"/>
+        </w:rPr>
+        <w:t>Table S4.4 traces each major claim to its supporting evidence, reproducibility asset and boundary condition, making the permitted wording auditable.</w:t>
+      </w:r>
+    </w:p>
+    <w:p>
       <w:r>
         <w:rPr>
           <w:b/>
@@ -6311,6 +6350,7 @@
       </w:pPr>
       <w:r>
         <w:rPr>
+          <w:b w:val="0"/>
           <w:lang w:val="en-US"/>
         </w:rPr>
         <w:t>S5.1 Predictive field SFSI validation protocol</w:t>
@@ -6357,6 +6397,7 @@
       </w:pPr>
       <w:r>
         <w:rPr>
+          <w:b w:val="0"/>
           <w:lang w:val="en-US"/>
         </w:rPr>
         <w:t>S5.2 Real-record ERIES-POLIS blind sensor check</w:t>
@@ -6419,6 +6460,7 @@
       </w:pPr>
       <w:r>
         <w:rPr>
+          <w:b w:val="0"/>
           <w:lang w:val="en-US"/>
         </w:rPr>
         <w:t>S5.3 Garner Valley validation-falsification gate outcome</w:t>
@@ -6484,6 +6526,7 @@
       </w:pPr>
       <w:r>
         <w:rPr>
+          <w:b w:val="0"/>
           <w:lang w:val="en-US"/>
         </w:rPr>
         <w:t>S5.4 Executed FoRDy/FoRCy experimental proxy validation</w:t>
@@ -6565,7 +6608,6 @@
       <w:r>
         <w:rPr>
           <w:rFonts w:cs="Times New Roman"/>
-          <w:b/>
           <w:lang w:val="en-US"/>
         </w:rPr>
         <w:t>Table S5.1 reports</w:t>
@@ -6573,28 +6615,30 @@
       <w:r>
         <w:rPr>
           <w:rFonts w:cs="Times New Roman"/>
-          <w:b/>
           <w:lang w:val="en-US"/>
         </w:rPr>
         <w:t xml:space="preserve"> the FoRDy/FoRCy experimental proxy-class validation metrics used to evaluate class-level screening performance.</w:t>
       </w:r>
     </w:p>
     <w:p>
-      <w:pPr>
-        <w:keepNext/>
-        <w:jc w:val="center"/>
-        <w:rPr>
-          <w:rFonts w:cs="Times New Roman"/>
+      <w:r>
+        <w:rPr>
+          <w:sz w:val="20"/>
+        </w:rPr>
+        <w:t xml:space="preserve">Table S5.1 reports the FoRDy/FoRCy proxy-class validation metrics used to evaluate class-level screening performance and </w:t>
+      </w:r>
+      <w:r>
+        <w:rPr>
+          <w:sz w:val="20"/>
+        </w:rPr>
+        <w:t>false-safe control.</w:t>
+      </w:r>
+    </w:p>
+    <w:p>
+      <w:r>
+        <w:rPr>
           <w:b/>
           <w:sz w:val="20"/>
-          <w:lang w:val="en-US"/>
-        </w:rPr>
-      </w:pPr>
-      <w:r>
-        <w:rPr>
-          <w:rFonts w:cs="Times New Roman"/>
-          <w:b/>
-          <w:lang w:val="en-US"/>
         </w:rPr>
         <w:t>Table S5.1. FoRDy/FoRCy experimental proxy-class validation metrics.</w:t>
       </w:r>
@@ -7373,6 +7417,7 @@
       </w:pPr>
       <w:r>
         <w:rPr>
+          <w:b w:val="0"/>
           <w:lang w:val="en-US"/>
         </w:rPr>
         <w:t>S5.5 Independent predictive proxy validation</w:t>
@@ -7467,34 +7512,37 @@
       <w:r>
         <w:rPr>
           <w:rFonts w:cs="Times New Roman"/>
+          <w:lang w:val="en-US"/>
+        </w:rPr>
+        <w:t>Table S5.2 compares</w:t>
+      </w:r>
+      <w:r>
+        <w:rPr>
+          <w:rFonts w:cs="Times New Roman"/>
+          <w:lang w:val="en-US"/>
+        </w:rPr>
+        <w:t xml:space="preserve"> the independent predictive proxy-validation layer, the V2 OpenSeesPy solver-backed class-prediction layer, and simpler baseline rules.</w:t>
+      </w:r>
+    </w:p>
+    <w:p>
+      <w:r>
+        <w:rPr>
+          <w:sz w:val="20"/>
+        </w:rPr>
+        <w:t>Table S5.2 compares the independent predictive proxy layer, the solver-backed class-prediction layer and simpler basel</w:t>
+      </w:r>
+      <w:r>
+        <w:rPr>
+          <w:sz w:val="20"/>
+        </w:rPr>
+        <w:t>ine rules to show the added screening value of the proposed map.</w:t>
+      </w:r>
+    </w:p>
+    <w:p>
+      <w:r>
+        <w:rPr>
           <w:b/>
-          <w:lang w:val="en-US"/>
-        </w:rPr>
-        <w:t>Table S5.2 compares</w:t>
-      </w:r>
-      <w:r>
-        <w:rPr>
-          <w:rFonts w:cs="Times New Roman"/>
-          <w:b/>
-          <w:lang w:val="en-US"/>
-        </w:rPr>
-        <w:t xml:space="preserve"> the independent predictive proxy-validation layer, the V2 OpenSeesPy solver-backed class-prediction layer, and simpler baseline rules.</w:t>
-      </w:r>
-    </w:p>
-    <w:p>
-      <w:pPr>
-        <w:rPr>
-          <w:rFonts w:cs="Times New Roman"/>
-          <w:b/>
-          <w:bCs/>
-          <w:lang w:val="en-US"/>
-        </w:rPr>
-      </w:pPr>
-      <w:r>
-        <w:rPr>
-          <w:rFonts w:cs="Times New Roman"/>
-          <w:b/>
-          <w:lang w:val="en-US"/>
+          <w:sz w:val="20"/>
         </w:rPr>
         <w:t>Table S5.2. Independent predictive and solver-backed class-validation layers compared with baseline rules.</w:t>
       </w:r>
@@ -8651,6 +8699,7 @@
       </w:pPr>
       <w:r>
         <w:rPr>
+          <w:b w:val="0"/>
           <w:lang w:val="en-US"/>
         </w:rPr>
         <w:t>S5.6 Decision-value validation of false-safe screening</w:t>
@@ -8729,7 +8778,6 @@
       <w:r>
         <w:rPr>
           <w:rFonts w:cs="Times New Roman"/>
-          <w:b/>
           <w:lang w:val="en-US"/>
         </w:rPr>
         <w:t>Table S5.3 reports</w:t>
@@ -8737,28 +8785,30 @@
       <w:r>
         <w:rPr>
           <w:rFonts w:cs="Times New Roman"/>
-          <w:b/>
           <w:lang w:val="en-US"/>
         </w:rPr>
         <w:t xml:space="preserve"> the decision-value false-safe audit under asymmetric screening loss.</w:t>
       </w:r>
     </w:p>
     <w:p>
-      <w:pPr>
-        <w:keepNext/>
-        <w:jc w:val="center"/>
-        <w:rPr>
-          <w:rFonts w:cs="Times New Roman"/>
+      <w:r>
+        <w:rPr>
+          <w:sz w:val="20"/>
+        </w:rPr>
+        <w:t xml:space="preserve">Table S5.3 reports </w:t>
+      </w:r>
+      <w:r>
+        <w:rPr>
+          <w:sz w:val="20"/>
+        </w:rPr>
+        <w:t>the decision-value audit under asymmetric screening loss, emphasizing whether the map reduces false-safe releases relative to force-only optimism.</w:t>
+      </w:r>
+    </w:p>
+    <w:p>
+      <w:r>
+        <w:rPr>
           <w:b/>
           <w:sz w:val="20"/>
-          <w:lang w:val="en-US"/>
-        </w:rPr>
-      </w:pPr>
-      <w:r>
-        <w:rPr>
-          <w:rFonts w:cs="Times New Roman"/>
-          <w:b/>
-          <w:lang w:val="en-US"/>
         </w:rPr>
         <w:t>Table S5.3. Decision-value false-safe audit under asymmetric screening loss.</w:t>
       </w:r>
@@ -9618,6 +9668,7 @@
       </w:pPr>
       <w:r>
         <w:rPr>
+          <w:b w:val="0"/>
           <w:lang w:val="en-US"/>
         </w:rPr>
         <w:t>S5.7 Failure-mode atlas and empirical guardrails</w:t>
@@ -9735,7 +9786,6 @@
       <w:r>
         <w:rPr>
           <w:rFonts w:cs="Times New Roman"/>
-          <w:b/>
           <w:lang w:val="en-US"/>
         </w:rPr>
         <w:t>Table S5.4 reports</w:t>
@@ -9743,28 +9793,30 @@
       <w:r>
         <w:rPr>
           <w:rFonts w:cs="Times New Roman"/>
-          <w:b/>
           <w:lang w:val="en-US"/>
         </w:rPr>
         <w:t xml:space="preserve"> the failure-mode atlas and low-margin guardrail audit.</w:t>
       </w:r>
     </w:p>
     <w:p>
-      <w:pPr>
-        <w:keepNext/>
-        <w:jc w:val="center"/>
-        <w:rPr>
-          <w:rFonts w:cs="Times New Roman"/>
+      <w:r>
+        <w:rPr>
+          <w:sz w:val="20"/>
+        </w:rPr>
+        <w:t xml:space="preserve">Table S5.4 summarizes the failure-mode atlas and the low-margin guardrail audit used to identify and reduce </w:t>
+      </w:r>
+      <w:r>
+        <w:rPr>
+          <w:sz w:val="20"/>
+        </w:rPr>
+        <w:t>unsafe screening releases.</w:t>
+      </w:r>
+    </w:p>
+    <w:p>
+      <w:r>
+        <w:rPr>
           <w:b/>
           <w:sz w:val="20"/>
-          <w:lang w:val="en-US"/>
-        </w:rPr>
-      </w:pPr>
-      <w:r>
-        <w:rPr>
-          <w:rFonts w:cs="Times New Roman"/>
-          <w:b/>
-          <w:lang w:val="en-US"/>
         </w:rPr>
         <w:t>Table S5.4. Failure-mode atlas and low-margin guardrail audit.</w:t>
       </w:r>
@@ -10749,6 +10801,7 @@
       </w:pPr>
       <w:r>
         <w:rPr>
+          <w:b w:val="0"/>
           <w:lang w:val="en-US"/>
         </w:rPr>
         <w:t>S5.8 External FLIQ liquefaction-oriented false-safe audit</w:t>
@@ -10814,7 +10867,6 @@
       <w:r>
         <w:rPr>
           <w:rFonts w:cs="Times New Roman"/>
-          <w:b/>
           <w:lang w:val="en-US"/>
         </w:rPr>
         <w:t>Table S5.5 reports</w:t>
@@ -10822,28 +10874,30 @@
       <w:r>
         <w:rPr>
           <w:rFonts w:cs="Times New Roman"/>
-          <w:b/>
           <w:lang w:val="en-US"/>
         </w:rPr>
         <w:t xml:space="preserve"> the external FLIQ liquefaction-oriented false-safe audit.</w:t>
       </w:r>
     </w:p>
     <w:p>
-      <w:pPr>
-        <w:keepNext/>
-        <w:jc w:val="center"/>
-        <w:rPr>
-          <w:rFonts w:cs="Times New Roman"/>
+      <w:r>
+        <w:rPr>
+          <w:sz w:val="20"/>
+        </w:rPr>
+        <w:t>Table S5.5 reports the external FLIQ liquefaction-oriented audit, which tests whether acceleration-side benefit can still coincide with settlemen</w:t>
+      </w:r>
+      <w:r>
+        <w:rPr>
+          <w:sz w:val="20"/>
+        </w:rPr>
+        <w:t>t or rotation penalty.</w:t>
+      </w:r>
+    </w:p>
+    <w:p>
+      <w:r>
+        <w:rPr>
           <w:b/>
           <w:sz w:val="20"/>
-          <w:lang w:val="en-US"/>
-        </w:rPr>
-      </w:pPr>
-      <w:r>
-        <w:rPr>
-          <w:rFonts w:cs="Times New Roman"/>
-          <w:b/>
-          <w:lang w:val="en-US"/>
         </w:rPr>
         <w:t>Table S5.5. External FLIQ liquefaction-oriented false-safe audit.</w:t>
       </w:r>
@@ -11360,6 +11414,9 @@
         <w:pStyle w:val="Heading2"/>
       </w:pPr>
       <w:r>
+        <w:rPr>
+          <w:b w:val="0"/>
+        </w:rPr>
         <w:t>S5.9 External literature consistency benchmark</w:t>
       </w:r>
     </w:p>

</xml_diff>

<commit_message>
Fix supplementary figure placement and numbering
</commit_message>
<xml_diff>
--- a/supplementary_material/Demand_Polarity_Map_Supplementary_v40_final.docx
+++ b/supplementary_material/Demand_Polarity_Map_Supplementary_v40_final.docx
@@ -40,20 +40,12 @@
     </w:p>
     <w:p>
       <w:pPr>
+        <w:jc w:val="both"/>
         <w:rPr>
           <w:rFonts w:cs="Times New Roman"/>
           <w:lang w:val="en-US"/>
         </w:rPr>
       </w:pPr>
-    </w:p>
-    <w:p>
-      <w:pPr>
-        <w:jc w:val="both"/>
-        <w:rPr>
-          <w:rFonts w:cs="Times New Roman"/>
-          <w:lang w:val="en-US"/>
-        </w:rPr>
-      </w:pPr>
       <w:r>
         <w:rPr>
           <w:rFonts w:cs="Times New Roman"/>
@@ -61,14 +53,6 @@
         </w:rPr>
         <w:t>This supplementary material records the external literature consistency audit added to support the validation/comparison layer. Supplementary tables are numbered independently from the main manuscript as Table S1, Table S2, and so on. The full machine-readable CSV files are included in the supplementary_material/literature_external_consistency_audit_20260530 folder.</w:t>
       </w:r>
-    </w:p>
-    <w:p>
-      <w:pPr>
-        <w:rPr>
-          <w:rFonts w:cs="Times New Roman"/>
-          <w:lang w:val="en-US"/>
-        </w:rPr>
-      </w:pPr>
     </w:p>
     <w:p>
       <w:pPr>
@@ -82,29 +66,33 @@
       <w:r>
         <w:rPr>
           <w:rFonts w:cs="Times New Roman"/>
-          <w:lang w:val="en-US"/>
-        </w:rPr>
-        <w:t>Table S1 defines the evidence classes used to separate direct quantitative comparisons from secondary consistency checks in the external literature audit.</w:t>
+          <w:b w:val="0"/>
+          <w:lang w:val="en-US"/>
+        </w:rPr>
+        <w:t>Table S1 defines the evidence classes used to separate direct quantitative comparisons from secondary consistency checks i</w:t>
+      </w:r>
+      <w:r>
+        <w:rPr>
+          <w:rFonts w:cs="Times New Roman"/>
+          <w:b w:val="0"/>
+          <w:lang w:val="en-US"/>
+        </w:rPr>
+        <w:t xml:space="preserve">n the external literature audit. </w:t>
       </w:r>
     </w:p>
     <w:p>
       <w:r>
         <w:rPr>
+          <w:b w:val="0"/>
           <w:sz w:val="20"/>
         </w:rPr>
-        <w:t>Table S1 identifies the external evidence classes used in the li</w:t>
-      </w:r>
-      <w:r>
-        <w:rPr>
-          <w:sz w:val="20"/>
-        </w:rPr>
-        <w:t>terature-consistency audit and clarifies which sources are treated as direct quantitative comparisons versus secondary support.</w:t>
+        <w:t>Table S1 identifies the external evidence classes used in the literature-consistency audit and clarifies which sources are treated as direct quantitative comparisons versus secondary support.</w:t>
       </w:r>
     </w:p>
     <w:p>
       <w:r>
         <w:rPr>
-          <w:b/>
+          <w:b w:val="0"/>
           <w:sz w:val="20"/>
         </w:rPr>
         <w:t>Table S1. External literature evidence classes used in the consistency audit.</w:t>
@@ -117,11 +105,11 @@
         <w:tblLook w:val="04A0" w:firstRow="1" w:lastRow="0" w:firstColumn="1" w:lastColumn="0" w:noHBand="0" w:noVBand="1"/>
       </w:tblPr>
       <w:tblGrid>
-        <w:gridCol w:w="1702"/>
-        <w:gridCol w:w="1703"/>
-        <w:gridCol w:w="1703"/>
-        <w:gridCol w:w="1703"/>
-        <w:gridCol w:w="2027"/>
+        <w:gridCol w:w="1714"/>
+        <w:gridCol w:w="1714"/>
+        <w:gridCol w:w="1714"/>
+        <w:gridCol w:w="1714"/>
+        <w:gridCol w:w="1982"/>
       </w:tblGrid>
       <w:tr>
         <w:trPr>
@@ -344,9 +332,8 @@
               <w:rPr>
                 <w:rFonts w:cs="Times New Roman"/>
                 <w:sz w:val="20"/>
-                <w:lang w:val="en-US"/>
-              </w:rPr>
-              <w:t>Consistency mapping, not independent validation of article 116 predictions</w:t>
+              </w:rPr>
+              <w:t>consistency mapping, not independent validation of article 116 predictions</w:t>
             </w:r>
           </w:p>
         </w:tc>
@@ -459,9 +446,8 @@
               <w:rPr>
                 <w:rFonts w:cs="Times New Roman"/>
                 <w:sz w:val="20"/>
-                <w:lang w:val="en-US"/>
-              </w:rPr>
-              <w:t>Not a validation of the reduced closed-form formula; it is a cross-study range and mechanism check</w:t>
+              </w:rPr>
+              <w:t>not a validation of the reduced closed-form formula; it is a cross-study range and mechanism check</w:t>
             </w:r>
           </w:p>
         </w:tc>
@@ -577,24 +563,8 @@
               <w:rPr>
                 <w:rFonts w:cs="Times New Roman"/>
                 <w:sz w:val="20"/>
-                <w:lang w:val="en-US"/>
-              </w:rPr>
-              <w:t>Does not directly provide article-116 class predictions or R</w:t>
-            </w:r>
-            <w:r>
-              <w:rPr>
-                <w:rFonts w:cs="Times New Roman"/>
-                <w:sz w:val="20"/>
-              </w:rPr>
-              <w:t>ᵥ</w:t>
-            </w:r>
-            <w:r>
-              <w:rPr>
-                <w:rFonts w:cs="Times New Roman"/>
-                <w:sz w:val="20"/>
-                <w:lang w:val="en-US"/>
-              </w:rPr>
-              <w:t>/error pairs</w:t>
+              </w:rPr>
+              <w:t>does not directly provide article-116 class predictions or Rᵥ/error pairs</w:t>
             </w:r>
           </w:p>
         </w:tc>
@@ -621,7 +591,6 @@
                 <w:sz w:val="20"/>
                 <w:lang w:val="en-US"/>
               </w:rPr>
-              <w:lastRenderedPageBreak/>
               <w:t>Mylonakis and Gazetas, Seismic soil-structure interaction: Beneficial or detrimental?</w:t>
             </w:r>
           </w:p>
@@ -708,9 +677,8 @@
               <w:rPr>
                 <w:rFonts w:cs="Times New Roman"/>
                 <w:sz w:val="20"/>
-                <w:lang w:val="en-US"/>
-              </w:rPr>
-              <w:t>Conceptual/theoretical external support, not a case-level benchmark</w:t>
+              </w:rPr>
+              <w:t>conceptual/theoretical external support, not a case-level benchmark</w:t>
             </w:r>
           </w:p>
         </w:tc>
@@ -826,9 +794,8 @@
               <w:rPr>
                 <w:rFonts w:cs="Times New Roman"/>
                 <w:sz w:val="20"/>
-                <w:lang w:val="en-US"/>
-              </w:rPr>
-              <w:t>Field impedance support only; not nonlinear 3D response-history validation</w:t>
+              </w:rPr>
+              <w:t>field impedance support only; not nonlinear 3D response-history validation</w:t>
             </w:r>
           </w:p>
         </w:tc>
@@ -897,7 +864,7 @@
                 <w:rFonts w:cs="Times New Roman"/>
                 <w:sz w:val="20"/>
               </w:rPr>
-              <w:t>medium</w:t>
+              <w:t>médium</w:t>
             </w:r>
           </w:p>
         </w:tc>
@@ -941,19 +908,12 @@
                 <w:rFonts w:cs="Times New Roman"/>
                 <w:sz w:val="20"/>
               </w:rPr>
-              <w:t>Secondary support only</w:t>
+              <w:t>secondary support only</w:t>
             </w:r>
           </w:p>
         </w:tc>
       </w:tr>
     </w:tbl>
-    <w:p>
-      <w:pPr>
-        <w:rPr>
-          <w:rFonts w:cs="Times New Roman"/>
-        </w:rPr>
-      </w:pPr>
-    </w:p>
     <w:p>
       <w:pPr>
         <w:rPr>
@@ -973,6 +933,7 @@
       <w:r>
         <w:rPr>
           <w:rFonts w:cs="Times New Roman"/>
+          <w:b w:val="0"/>
           <w:lang w:val="en-US"/>
         </w:rPr>
         <w:t>Table S2 reports the period-ratio extraction used to map the Zhang and Far (2024) high-rise SSI study into the demand-polarity interpretation.</w:t>
@@ -981,21 +942,23 @@
     <w:p>
       <w:r>
         <w:rPr>
+          <w:b w:val="0"/>
           <w:sz w:val="20"/>
         </w:rPr>
-        <w:t xml:space="preserve">Table </w:t>
-      </w:r>
-      <w:r>
-        <w:rPr>
+        <w:t>Table S2 reports the extracted period-ratio quantities from Zhang and Far (2024), which are used to compare an independent high-rise SSI study with the demand-polarity interp</w:t>
+      </w:r>
+      <w:r>
+        <w:rPr>
+          <w:b w:val="0"/>
           <w:sz w:val="20"/>
         </w:rPr>
-        <w:t>S2 reports the extracted period-ratio quantities from Zhang and Far (2024), which are used to compare an independent high-rise SSI study with the demand-polarity interpretation.</w:t>
+        <w:t>retation.</w:t>
       </w:r>
     </w:p>
     <w:p>
       <w:r>
         <w:rPr>
-          <w:b/>
+          <w:b w:val="0"/>
           <w:sz w:val="20"/>
         </w:rPr>
         <w:t>Table S2. Zhang and Far (2024) period-ratio extraction summary.</w:t>
@@ -1332,19 +1295,12 @@
     </w:p>
     <w:p>
       <w:pPr>
-        <w:rPr>
-          <w:rFonts w:cs="Times New Roman"/>
+        <w:jc w:val="both"/>
+        <w:rPr>
+          <w:rFonts w:cs="Times New Roman"/>
+          <w:lang w:val="en-US"/>
         </w:rPr>
       </w:pPr>
-    </w:p>
-    <w:p>
-      <w:pPr>
-        <w:jc w:val="both"/>
-        <w:rPr>
-          <w:rFonts w:cs="Times New Roman"/>
-          <w:lang w:val="en-US"/>
-        </w:rPr>
-      </w:pPr>
       <w:r>
         <w:rPr>
           <w:rFonts w:cs="Times New Roman"/>
@@ -1352,14 +1308,6 @@
         </w:rPr>
         <w:t>The external literature layer is used as consistency evidence only. It does not establish independent nonlinear three-dimensional response-history validation of the screening criterion.</w:t>
       </w:r>
-    </w:p>
-    <w:p>
-      <w:pPr>
-        <w:rPr>
-          <w:rFonts w:cs="Times New Roman"/>
-          <w:lang w:val="en-US"/>
-        </w:rPr>
-      </w:pPr>
     </w:p>
     <w:p>
       <w:pPr>
@@ -1373,6 +1321,7 @@
       <w:r>
         <w:rPr>
           <w:rFonts w:cs="Times New Roman"/>
+          <w:b w:val="0"/>
           <w:lang w:val="en-US"/>
         </w:rPr>
         <w:t>Table S3 summarizes the claim gap that motivates the screening-level contribution and distinguishes it from guidance documents, finite-element SSI simulations and rocking databases.</w:t>
@@ -1381,21 +1330,23 @@
     <w:p>
       <w:r>
         <w:rPr>
+          <w:b w:val="0"/>
           <w:sz w:val="20"/>
         </w:rPr>
-        <w:t>Table S3 links the screening claim to existing guida</w:t>
-      </w:r>
-      <w:r>
-        <w:rPr>
+        <w:t>Table S3 links the screening claim to existing guidance, finite-element SSI simulations and rocking databases, showing where the supplementary evidence supports a distinct contribut</w:t>
+      </w:r>
+      <w:r>
+        <w:rPr>
+          <w:b w:val="0"/>
           <w:sz w:val="20"/>
         </w:rPr>
-        <w:t>nce, finite-element SSI simulations and rocking databases, showing where the supplementary evidence supports a distinct contribution.</w:t>
+        <w:t>ion.</w:t>
       </w:r>
     </w:p>
     <w:p>
       <w:r>
         <w:rPr>
-          <w:b/>
+          <w:b w:val="0"/>
           <w:sz w:val="20"/>
         </w:rPr>
         <w:t>Table S3. Claim gap matrix for screening-level contribution.</w:t>
@@ -1435,7 +1386,6 @@
                 <w:rFonts w:cs="Times New Roman"/>
                 <w:sz w:val="20"/>
               </w:rPr>
-              <w:lastRenderedPageBreak/>
               <w:t>Claim needed for screening</w:t>
             </w:r>
           </w:p>
@@ -1569,7 +1519,7 @@
                 <w:rFonts w:cs="Times New Roman"/>
                 <w:sz w:val="20"/>
               </w:rPr>
-              <w:t>No</w:t>
+              <w:t>no</w:t>
             </w:r>
           </w:p>
         </w:tc>
@@ -1590,7 +1540,7 @@
                 <w:rFonts w:cs="Times New Roman"/>
                 <w:sz w:val="20"/>
               </w:rPr>
-              <w:t>No</w:t>
+              <w:t>no</w:t>
             </w:r>
           </w:p>
         </w:tc>
@@ -1611,7 +1561,7 @@
                 <w:rFonts w:cs="Times New Roman"/>
                 <w:sz w:val="20"/>
               </w:rPr>
-              <w:t>No</w:t>
+              <w:t>no</w:t>
             </w:r>
           </w:p>
         </w:tc>
@@ -1632,7 +1582,7 @@
                 <w:rFonts w:cs="Times New Roman"/>
                 <w:sz w:val="20"/>
               </w:rPr>
-              <w:t>Yes</w:t>
+              <w:t>yes</w:t>
             </w:r>
           </w:p>
         </w:tc>
@@ -1678,7 +1628,7 @@
                 <w:rFonts w:cs="Times New Roman"/>
                 <w:sz w:val="20"/>
               </w:rPr>
-              <w:t>No</w:t>
+              <w:t>no</w:t>
             </w:r>
           </w:p>
         </w:tc>
@@ -1699,7 +1649,7 @@
                 <w:rFonts w:cs="Times New Roman"/>
                 <w:sz w:val="20"/>
               </w:rPr>
-              <w:t>Implicit</w:t>
+              <w:t>implicit</w:t>
             </w:r>
           </w:p>
         </w:tc>
@@ -1720,7 +1670,7 @@
                 <w:rFonts w:cs="Times New Roman"/>
                 <w:sz w:val="20"/>
               </w:rPr>
-              <w:t>No</w:t>
+              <w:t>no</w:t>
             </w:r>
           </w:p>
         </w:tc>
@@ -1741,7 +1691,7 @@
                 <w:rFonts w:cs="Times New Roman"/>
                 <w:sz w:val="20"/>
               </w:rPr>
-              <w:t>Yes</w:t>
+              <w:t>yes</w:t>
             </w:r>
           </w:p>
         </w:tc>
@@ -1790,7 +1740,7 @@
                 <w:rFonts w:cs="Times New Roman"/>
                 <w:sz w:val="20"/>
               </w:rPr>
-              <w:t>No</w:t>
+              <w:t>no</w:t>
             </w:r>
           </w:p>
         </w:tc>
@@ -1811,7 +1761,7 @@
                 <w:rFonts w:cs="Times New Roman"/>
                 <w:sz w:val="20"/>
               </w:rPr>
-              <w:t>Rare</w:t>
+              <w:t>rare</w:t>
             </w:r>
           </w:p>
         </w:tc>
@@ -1832,7 +1782,7 @@
                 <w:rFonts w:cs="Times New Roman"/>
                 <w:sz w:val="20"/>
               </w:rPr>
-              <w:t>No</w:t>
+              <w:t>no</w:t>
             </w:r>
           </w:p>
         </w:tc>
@@ -1853,7 +1803,7 @@
                 <w:rFonts w:cs="Times New Roman"/>
                 <w:sz w:val="20"/>
               </w:rPr>
-              <w:t>Yes</w:t>
+              <w:t>yes</w:t>
             </w:r>
           </w:p>
         </w:tc>
@@ -1899,7 +1849,7 @@
                 <w:rFonts w:cs="Times New Roman"/>
                 <w:sz w:val="20"/>
               </w:rPr>
-              <w:t>No</w:t>
+              <w:t>no</w:t>
             </w:r>
           </w:p>
         </w:tc>
@@ -1920,7 +1870,7 @@
                 <w:rFonts w:cs="Times New Roman"/>
                 <w:sz w:val="20"/>
               </w:rPr>
-              <w:t>Case-specific</w:t>
+              <w:t>case-specific</w:t>
             </w:r>
           </w:p>
         </w:tc>
@@ -1941,7 +1891,7 @@
                 <w:rFonts w:cs="Times New Roman"/>
                 <w:sz w:val="20"/>
               </w:rPr>
-              <w:t>No</w:t>
+              <w:t>no</w:t>
             </w:r>
           </w:p>
         </w:tc>
@@ -1962,7 +1912,7 @@
                 <w:rFonts w:cs="Times New Roman"/>
                 <w:sz w:val="20"/>
               </w:rPr>
-              <w:t>Yes</w:t>
+              <w:t>yes</w:t>
             </w:r>
           </w:p>
         </w:tc>
@@ -2011,7 +1961,7 @@
                 <w:rFonts w:cs="Times New Roman"/>
                 <w:sz w:val="20"/>
               </w:rPr>
-              <w:t>No</w:t>
+              <w:t>no</w:t>
             </w:r>
           </w:p>
         </w:tc>
@@ -2032,7 +1982,7 @@
                 <w:rFonts w:cs="Times New Roman"/>
                 <w:sz w:val="20"/>
               </w:rPr>
-              <w:t>No</w:t>
+              <w:t>no</w:t>
             </w:r>
           </w:p>
         </w:tc>
@@ -2053,7 +2003,7 @@
                 <w:rFonts w:cs="Times New Roman"/>
                 <w:sz w:val="20"/>
               </w:rPr>
-              <w:t>Data only</w:t>
+              <w:t>data only</w:t>
             </w:r>
           </w:p>
         </w:tc>
@@ -2074,7 +2024,7 @@
                 <w:rFonts w:cs="Times New Roman"/>
                 <w:sz w:val="20"/>
               </w:rPr>
-              <w:t>Yes</w:t>
+              <w:t>yes</w:t>
             </w:r>
           </w:p>
         </w:tc>
@@ -2120,7 +2070,7 @@
                 <w:rFonts w:cs="Times New Roman"/>
                 <w:sz w:val="20"/>
               </w:rPr>
-              <w:t>No</w:t>
+              <w:t>no</w:t>
             </w:r>
           </w:p>
         </w:tc>
@@ -2141,7 +2091,7 @@
                 <w:rFonts w:cs="Times New Roman"/>
                 <w:sz w:val="20"/>
               </w:rPr>
-              <w:t>Rare</w:t>
+              <w:t>rare</w:t>
             </w:r>
           </w:p>
         </w:tc>
@@ -2162,7 +2112,7 @@
                 <w:rFonts w:cs="Times New Roman"/>
                 <w:sz w:val="20"/>
               </w:rPr>
-              <w:t>Data only</w:t>
+              <w:t>data only</w:t>
             </w:r>
           </w:p>
         </w:tc>
@@ -2183,7 +2133,7 @@
                 <w:rFonts w:cs="Times New Roman"/>
                 <w:sz w:val="20"/>
               </w:rPr>
-              <w:t>Yes</w:t>
+              <w:t>yes</w:t>
             </w:r>
           </w:p>
         </w:tc>
@@ -2206,7 +2156,6 @@
         <w:rPr>
           <w:rFonts w:cs="Times New Roman"/>
         </w:rPr>
-        <w:br w:type="page"/>
       </w:r>
     </w:p>
     <w:p>
@@ -2229,68 +2178,42 @@
     </w:p>
     <w:p>
       <w:pPr>
-        <w:pStyle w:val="Heading2"/>
-        <w:rPr>
+        <w:jc w:val="both"/>
+        <w:rPr>
+          <w:rFonts w:cs="Times New Roman"/>
           <w:lang w:val="en-US"/>
         </w:rPr>
       </w:pPr>
       <w:r>
         <w:rPr>
-          <w:b w:val="0"/>
-          <w:lang w:val="en-US"/>
-        </w:rPr>
-        <w:t>S4.1 Methodological framework</w:t>
+          <w:rFonts w:cs="Times New Roman"/>
+          <w:lang w:val="en-US"/>
+        </w:rPr>
+        <w:t>This study evaluates the SSI Demand-Polarity Map through a hierarchical, falsable protocol rather than through an undifferentiated collection of checks. Each layer has a distinct purpose, data type, independence level, pass/fail gate and claim boundary. Verification, spectral consistency, synthetic stress testing, external mapping, solver consistency and field benchmark falsification are therefore treated as separate evidence classes.</w:t>
       </w:r>
     </w:p>
     <w:p>
-      <w:pPr>
-        <w:jc w:val="both"/>
-        <w:rPr>
-          <w:rFonts w:cs="Times New Roman"/>
-          <w:lang w:val="en-US"/>
-        </w:rPr>
-      </w:pPr>
-      <w:r>
-        <w:rPr>
-          <w:rFonts w:cs="Times New Roman"/>
-          <w:lang w:val="en-US"/>
-        </w:rPr>
-        <w:t>This study evaluates the SSI Demand-Polarity Map through a hierarchical, falsable protocol rather than through an undifferentiated collection of checks. Each layer has a distinct purpose, data type, independence level, pass/fail gate and claim boundary. Verification, spectral consistency, synthetic stress testing, external mapping, solver consistency and field benchmark falsification are therefore treated as separate evidence classes.</w:t>
+      <w:r>
+        <w:rPr>
+          <w:b/>
+          <w:sz w:val="20"/>
+        </w:rPr>
+        <w:t>S4.1 Evidence hierarchy and claim boundaries</w:t>
       </w:r>
     </w:p>
     <w:p>
-      <w:pPr>
-        <w:pStyle w:val="Heading2"/>
-        <w:rPr>
-          <w:lang w:val="en-US"/>
-        </w:rPr>
-      </w:pPr>
       <w:r>
         <w:rPr>
           <w:b w:val="0"/>
-          <w:lang w:val="en-US"/>
-        </w:rPr>
-        <w:t>S4.2 Evidence hierarchy and claim boundaries</w:t>
+          <w:sz w:val="20"/>
+        </w:rPr>
+        <w:t>Table S4.1 summarizes the evidence hierarchy used in the supplementary protocol and states the claim boundary attached to each verification, validation or falsification layer.</w:t>
       </w:r>
     </w:p>
     <w:p>
       <w:r>
         <w:rPr>
-          <w:sz w:val="20"/>
-        </w:rPr>
-        <w:t xml:space="preserve">Table S4.1 summarizes the evidence hierarchy used in the supplementary protocol and states the claim </w:t>
-      </w:r>
-      <w:r>
-        <w:rPr>
-          <w:sz w:val="20"/>
-        </w:rPr>
-        <w:t>boundary attached to each verification, validation or falsification layer.</w:t>
-      </w:r>
-    </w:p>
-    <w:p>
-      <w:r>
-        <w:rPr>
-          <w:b/>
+          <w:b w:val="0"/>
           <w:sz w:val="20"/>
         </w:rPr>
         <w:t>Table S4.1. Methodological evidence hierarchy and claim boundaries.</w:t>
@@ -2318,7 +2241,7 @@
         <w:tc>
           <w:tcPr>
             <w:cnfStyle w:val="001000000000" w:firstRow="0" w:lastRow="0" w:firstColumn="1" w:lastColumn="0" w:oddVBand="0" w:evenVBand="0" w:oddHBand="0" w:evenHBand="0" w:firstRowFirstColumn="0" w:firstRowLastColumn="0" w:lastRowFirstColumn="0" w:lastRowLastColumn="0"/>
-            <w:tcW w:w="557" w:type="pct"/>
+            <w:tcW w:w="558" w:type="pct"/>
           </w:tcPr>
           <w:p>
             <w:pPr>
@@ -2359,7 +2282,7 @@
         </w:tc>
         <w:tc>
           <w:tcPr>
-            <w:tcW w:w="1094" w:type="pct"/>
+            <w:tcW w:w="885" w:type="pct"/>
           </w:tcPr>
           <w:p>
             <w:pPr>
@@ -2380,7 +2303,7 @@
         </w:tc>
         <w:tc>
           <w:tcPr>
-            <w:tcW w:w="659" w:type="pct"/>
+            <w:tcW w:w="866" w:type="pct"/>
           </w:tcPr>
           <w:p>
             <w:pPr>
@@ -2470,7 +2393,7 @@
         <w:tc>
           <w:tcPr>
             <w:cnfStyle w:val="001000000000" w:firstRow="0" w:lastRow="0" w:firstColumn="1" w:lastColumn="0" w:oddVBand="0" w:evenVBand="0" w:oddHBand="0" w:evenHBand="0" w:firstRowFirstColumn="0" w:firstRowLastColumn="0" w:lastRowFirstColumn="0" w:lastRowLastColumn="0"/>
-            <w:tcW w:w="557" w:type="pct"/>
+            <w:tcW w:w="558" w:type="pct"/>
           </w:tcPr>
           <w:p>
             <w:pPr>
@@ -2507,15 +2430,14 @@
               <w:rPr>
                 <w:rFonts w:cs="Times New Roman"/>
                 <w:sz w:val="20"/>
-                <w:lang w:val="en-US"/>
-              </w:rPr>
-              <w:t>Verify identities, admissibility and theorem logic</w:t>
-            </w:r>
-          </w:p>
-        </w:tc>
-        <w:tc>
-          <w:tcPr>
-            <w:tcW w:w="1094" w:type="pct"/>
+              </w:rPr>
+              <w:t>verify identities, admissibility and theorem logic</w:t>
+            </w:r>
+          </w:p>
+        </w:tc>
+        <w:tc>
+          <w:tcPr>
+            <w:tcW w:w="885" w:type="pct"/>
           </w:tcPr>
           <w:p>
             <w:pPr>
@@ -2536,22 +2458,22 @@
         </w:tc>
         <w:tc>
           <w:tcPr>
-            <w:tcW w:w="659" w:type="pct"/>
-          </w:tcPr>
-          <w:p>
-            <w:pPr>
-              <w:cnfStyle w:val="000000100000" w:firstRow="0" w:lastRow="0" w:firstColumn="0" w:lastColumn="0" w:oddVBand="0" w:evenVBand="0" w:oddHBand="1" w:evenHBand="0" w:firstRowFirstColumn="0" w:firstRowLastColumn="0" w:lastRowFirstColumn="0" w:lastRowLastColumn="0"/>
-              <w:rPr>
-                <w:rFonts w:cs="Times New Roman"/>
-                <w:sz w:val="20"/>
-              </w:rPr>
-            </w:pPr>
-            <w:r>
-              <w:rPr>
-                <w:rFonts w:cs="Times New Roman"/>
-                <w:sz w:val="20"/>
-              </w:rPr>
-              <w:t>No</w:t>
+            <w:tcW w:w="866" w:type="pct"/>
+          </w:tcPr>
+          <w:p>
+            <w:pPr>
+              <w:cnfStyle w:val="000000100000" w:firstRow="0" w:lastRow="0" w:firstColumn="0" w:lastColumn="0" w:oddVBand="0" w:evenVBand="0" w:oddHBand="1" w:evenHBand="0" w:firstRowFirstColumn="0" w:firstRowLastColumn="0" w:lastRowFirstColumn="0" w:lastRowLastColumn="0"/>
+              <w:rPr>
+                <w:rFonts w:cs="Times New Roman"/>
+                <w:sz w:val="20"/>
+              </w:rPr>
+            </w:pPr>
+            <w:r>
+              <w:rPr>
+                <w:rFonts w:cs="Times New Roman"/>
+                <w:sz w:val="20"/>
+              </w:rPr>
+              <w:t>no</w:t>
             </w:r>
           </w:p>
         </w:tc>
@@ -2574,7 +2496,23 @@
                 <w:sz w:val="20"/>
                 <w:lang w:val="en-US"/>
               </w:rPr>
-              <w:t>max identity error &lt; 1e-12 and zero impossible-class count</w:t>
+              <w:t xml:space="preserve">max identity error </w:t>
+            </w:r>
+            <w:r>
+              <w:rPr>
+                <w:rFonts w:cs="Times New Roman"/>
+                <w:sz w:val="20"/>
+                <w:lang w:val="en-US"/>
+              </w:rPr>
+              <w:t>la</w:t>
+            </w:r>
+            <w:r>
+              <w:rPr>
+                <w:rFonts w:cs="Times New Roman"/>
+                <w:sz w:val="20"/>
+                <w:lang w:val="en-US"/>
+              </w:rPr>
+              <w:t>e-12 and zero impossible-class count</w:t>
             </w:r>
           </w:p>
         </w:tc>
@@ -2627,7 +2565,7 @@
         <w:tc>
           <w:tcPr>
             <w:cnfStyle w:val="001000000000" w:firstRow="0" w:lastRow="0" w:firstColumn="1" w:lastColumn="0" w:oddVBand="0" w:evenVBand="0" w:oddHBand="0" w:evenHBand="0" w:firstRowFirstColumn="0" w:firstRowLastColumn="0" w:lastRowFirstColumn="0" w:lastRowLastColumn="0"/>
-            <w:tcW w:w="557" w:type="pct"/>
+            <w:tcW w:w="558" w:type="pct"/>
           </w:tcPr>
           <w:p>
             <w:pPr>
@@ -2664,15 +2602,14 @@
               <w:rPr>
                 <w:rFonts w:cs="Times New Roman"/>
                 <w:sz w:val="20"/>
-                <w:lang w:val="en-US"/>
-              </w:rPr>
-              <w:t>Compare local and secant spectral-slope formulations</w:t>
-            </w:r>
-          </w:p>
-        </w:tc>
-        <w:tc>
-          <w:tcPr>
-            <w:tcW w:w="1094" w:type="pct"/>
+              </w:rPr>
+              <w:t>compare local and secant spectral-slope formulations</w:t>
+            </w:r>
+          </w:p>
+        </w:tc>
+        <w:tc>
+          <w:tcPr>
+            <w:tcW w:w="885" w:type="pct"/>
           </w:tcPr>
           <w:p>
             <w:pPr>
@@ -2693,22 +2630,22 @@
         </w:tc>
         <w:tc>
           <w:tcPr>
-            <w:tcW w:w="659" w:type="pct"/>
-          </w:tcPr>
-          <w:p>
-            <w:pPr>
-              <w:cnfStyle w:val="000000000000" w:firstRow="0" w:lastRow="0" w:firstColumn="0" w:lastColumn="0" w:oddVBand="0" w:evenVBand="0" w:oddHBand="0" w:evenHBand="0" w:firstRowFirstColumn="0" w:firstRowLastColumn="0" w:lastRowFirstColumn="0" w:lastRowLastColumn="0"/>
-              <w:rPr>
-                <w:rFonts w:cs="Times New Roman"/>
-                <w:sz w:val="20"/>
-              </w:rPr>
-            </w:pPr>
-            <w:r>
-              <w:rPr>
-                <w:rFonts w:cs="Times New Roman"/>
-                <w:sz w:val="20"/>
-              </w:rPr>
-              <w:t>Partial</w:t>
+            <w:tcW w:w="866" w:type="pct"/>
+          </w:tcPr>
+          <w:p>
+            <w:pPr>
+              <w:cnfStyle w:val="000000000000" w:firstRow="0" w:lastRow="0" w:firstColumn="0" w:lastColumn="0" w:oddVBand="0" w:evenVBand="0" w:oddHBand="0" w:evenHBand="0" w:firstRowFirstColumn="0" w:firstRowLastColumn="0" w:lastRowFirstColumn="0" w:lastRowLastColumn="0"/>
+              <w:rPr>
+                <w:rFonts w:cs="Times New Roman"/>
+                <w:sz w:val="20"/>
+              </w:rPr>
+            </w:pPr>
+            <w:r>
+              <w:rPr>
+                <w:rFonts w:cs="Times New Roman"/>
+                <w:sz w:val="20"/>
+              </w:rPr>
+              <w:t>partial</w:t>
             </w:r>
           </w:p>
         </w:tc>
@@ -2787,7 +2724,7 @@
         <w:tc>
           <w:tcPr>
             <w:cnfStyle w:val="001000000000" w:firstRow="0" w:lastRow="0" w:firstColumn="1" w:lastColumn="0" w:oddVBand="0" w:evenVBand="0" w:oddHBand="0" w:evenHBand="0" w:firstRowFirstColumn="0" w:firstRowLastColumn="0" w:lastRowFirstColumn="0" w:lastRowLastColumn="0"/>
-            <w:tcW w:w="557" w:type="pct"/>
+            <w:tcW w:w="558" w:type="pct"/>
           </w:tcPr>
           <w:p>
             <w:pPr>
@@ -2824,15 +2761,14 @@
               <w:rPr>
                 <w:rFonts w:cs="Times New Roman"/>
                 <w:sz w:val="20"/>
-                <w:lang w:val="en-US"/>
-              </w:rPr>
-              <w:t>Stress the criterion across controlled spectral shapes</w:t>
-            </w:r>
-          </w:p>
-        </w:tc>
-        <w:tc>
-          <w:tcPr>
-            <w:tcW w:w="1094" w:type="pct"/>
+              </w:rPr>
+              <w:t>stress the criterion across controlled spectral shapes</w:t>
+            </w:r>
+          </w:p>
+        </w:tc>
+        <w:tc>
+          <w:tcPr>
+            <w:tcW w:w="885" w:type="pct"/>
           </w:tcPr>
           <w:p>
             <w:pPr>
@@ -2853,22 +2789,22 @@
         </w:tc>
         <w:tc>
           <w:tcPr>
-            <w:tcW w:w="659" w:type="pct"/>
-          </w:tcPr>
-          <w:p>
-            <w:pPr>
-              <w:cnfStyle w:val="000000100000" w:firstRow="0" w:lastRow="0" w:firstColumn="0" w:lastColumn="0" w:oddVBand="0" w:evenVBand="0" w:oddHBand="1" w:evenHBand="0" w:firstRowFirstColumn="0" w:firstRowLastColumn="0" w:lastRowFirstColumn="0" w:lastRowLastColumn="0"/>
-              <w:rPr>
-                <w:rFonts w:cs="Times New Roman"/>
-                <w:sz w:val="20"/>
-              </w:rPr>
-            </w:pPr>
-            <w:r>
-              <w:rPr>
-                <w:rFonts w:cs="Times New Roman"/>
-                <w:sz w:val="20"/>
-              </w:rPr>
-              <w:t>No external record</w:t>
+            <w:tcW w:w="866" w:type="pct"/>
+          </w:tcPr>
+          <w:p>
+            <w:pPr>
+              <w:cnfStyle w:val="000000100000" w:firstRow="0" w:lastRow="0" w:firstColumn="0" w:lastColumn="0" w:oddVBand="0" w:evenVBand="0" w:oddHBand="1" w:evenHBand="0" w:firstRowFirstColumn="0" w:firstRowLastColumn="0" w:lastRowFirstColumn="0" w:lastRowLastColumn="0"/>
+              <w:rPr>
+                <w:rFonts w:cs="Times New Roman"/>
+                <w:sz w:val="20"/>
+              </w:rPr>
+            </w:pPr>
+            <w:r>
+              <w:rPr>
+                <w:rFonts w:cs="Times New Roman"/>
+                <w:sz w:val="20"/>
+              </w:rPr>
+              <w:t>no external record</w:t>
             </w:r>
           </w:p>
         </w:tc>
@@ -2942,7 +2878,7 @@
         <w:tc>
           <w:tcPr>
             <w:cnfStyle w:val="001000000000" w:firstRow="0" w:lastRow="0" w:firstColumn="1" w:lastColumn="0" w:oddVBand="0" w:evenVBand="0" w:oddHBand="0" w:evenHBand="0" w:firstRowFirstColumn="0" w:firstRowLastColumn="0" w:lastRowFirstColumn="0" w:lastRowLastColumn="0"/>
-            <w:tcW w:w="557" w:type="pct"/>
+            <w:tcW w:w="558" w:type="pct"/>
           </w:tcPr>
           <w:p>
             <w:pPr>
@@ -2979,15 +2915,14 @@
               <w:rPr>
                 <w:rFonts w:cs="Times New Roman"/>
                 <w:sz w:val="20"/>
-                <w:lang w:val="en-US"/>
-              </w:rPr>
-              <w:t>Map published SSI cases into the demand-polarity classes</w:t>
-            </w:r>
-          </w:p>
-        </w:tc>
-        <w:tc>
-          <w:tcPr>
-            <w:tcW w:w="1094" w:type="pct"/>
+              </w:rPr>
+              <w:t>map published SSI cases into the demand-polarity classes</w:t>
+            </w:r>
+          </w:p>
+        </w:tc>
+        <w:tc>
+          <w:tcPr>
+            <w:tcW w:w="885" w:type="pct"/>
           </w:tcPr>
           <w:p>
             <w:pPr>
@@ -3010,22 +2945,22 @@
         </w:tc>
         <w:tc>
           <w:tcPr>
-            <w:tcW w:w="659" w:type="pct"/>
-          </w:tcPr>
-          <w:p>
-            <w:pPr>
-              <w:cnfStyle w:val="000000000000" w:firstRow="0" w:lastRow="0" w:firstColumn="0" w:lastColumn="0" w:oddVBand="0" w:evenVBand="0" w:oddHBand="0" w:evenHBand="0" w:firstRowFirstColumn="0" w:firstRowLastColumn="0" w:lastRowFirstColumn="0" w:lastRowLastColumn="0"/>
-              <w:rPr>
-                <w:rFonts w:cs="Times New Roman"/>
-                <w:sz w:val="20"/>
-              </w:rPr>
-            </w:pPr>
-            <w:r>
-              <w:rPr>
-                <w:rFonts w:cs="Times New Roman"/>
-                <w:sz w:val="20"/>
-              </w:rPr>
-              <w:t>Partial</w:t>
+            <w:tcW w:w="866" w:type="pct"/>
+          </w:tcPr>
+          <w:p>
+            <w:pPr>
+              <w:cnfStyle w:val="000000000000" w:firstRow="0" w:lastRow="0" w:firstColumn="0" w:lastColumn="0" w:oddVBand="0" w:evenVBand="0" w:oddHBand="0" w:evenHBand="0" w:firstRowFirstColumn="0" w:firstRowLastColumn="0" w:lastRowFirstColumn="0" w:lastRowLastColumn="0"/>
+              <w:rPr>
+                <w:rFonts w:cs="Times New Roman"/>
+                <w:sz w:val="20"/>
+              </w:rPr>
+            </w:pPr>
+            <w:r>
+              <w:rPr>
+                <w:rFonts w:cs="Times New Roman"/>
+                <w:sz w:val="20"/>
+              </w:rPr>
+              <w:t>partial</w:t>
             </w:r>
           </w:p>
         </w:tc>
@@ -3104,7 +3039,7 @@
         <w:tc>
           <w:tcPr>
             <w:cnfStyle w:val="001000000000" w:firstRow="0" w:lastRow="0" w:firstColumn="1" w:lastColumn="0" w:oddVBand="0" w:evenVBand="0" w:oddHBand="0" w:evenHBand="0" w:firstRowFirstColumn="0" w:firstRowLastColumn="0" w:lastRowFirstColumn="0" w:lastRowLastColumn="0"/>
-            <w:tcW w:w="557" w:type="pct"/>
+            <w:tcW w:w="558" w:type="pct"/>
           </w:tcPr>
           <w:p>
             <w:pPr>
@@ -3141,30 +3076,28 @@
               <w:rPr>
                 <w:rFonts w:cs="Times New Roman"/>
                 <w:sz w:val="20"/>
-                <w:lang w:val="en-US"/>
-              </w:rPr>
-              <w:t>Check continuum-to-reduced-order parameter transfer</w:t>
-            </w:r>
-          </w:p>
-        </w:tc>
-        <w:tc>
-          <w:tcPr>
-            <w:tcW w:w="1094" w:type="pct"/>
-          </w:tcPr>
-          <w:p>
-            <w:pPr>
-              <w:cnfStyle w:val="000000100000" w:firstRow="0" w:lastRow="0" w:firstColumn="0" w:lastColumn="0" w:oddVBand="0" w:evenVBand="0" w:oddHBand="1" w:evenHBand="0" w:firstRowFirstColumn="0" w:firstRowLastColumn="0" w:lastRowFirstColumn="0" w:lastRowLastColumn="0"/>
-              <w:rPr>
-                <w:rFonts w:cs="Times New Roman"/>
-                <w:sz w:val="20"/>
-                <w:lang w:val="en-US"/>
-              </w:rPr>
-            </w:pPr>
-            <w:r>
-              <w:rPr>
-                <w:rFonts w:cs="Times New Roman"/>
-                <w:sz w:val="20"/>
-                <w:lang w:val="en-US"/>
+              </w:rPr>
+              <w:t>check continuum-to-reduced-order parameter transfer</w:t>
+            </w:r>
+          </w:p>
+        </w:tc>
+        <w:tc>
+          <w:tcPr>
+            <w:tcW w:w="885" w:type="pct"/>
+          </w:tcPr>
+          <w:p>
+            <w:pPr>
+              <w:cnfStyle w:val="000000100000" w:firstRow="0" w:lastRow="0" w:firstColumn="0" w:lastColumn="0" w:oddVBand="0" w:evenVBand="0" w:oddHBand="1" w:evenHBand="0" w:firstRowFirstColumn="0" w:firstRowLastColumn="0" w:lastRowFirstColumn="0" w:lastRowLastColumn="0"/>
+              <w:rPr>
+                <w:rFonts w:cs="Times New Roman"/>
+                <w:sz w:val="20"/>
+                <w:lang w:val="en-US"/>
+              </w:rPr>
+            </w:pPr>
+            <w:r>
+              <w:rPr>
+                <w:rFonts w:cs="Times New Roman"/>
+                <w:sz w:val="20"/>
               </w:rPr>
               <w:t>CalculiX/OpenSeesPy with Code_Aster blind lock</w:t>
             </w:r>
@@ -3172,22 +3105,22 @@
         </w:tc>
         <w:tc>
           <w:tcPr>
-            <w:tcW w:w="659" w:type="pct"/>
-          </w:tcPr>
-          <w:p>
-            <w:pPr>
-              <w:cnfStyle w:val="000000100000" w:firstRow="0" w:lastRow="0" w:firstColumn="0" w:lastColumn="0" w:oddVBand="0" w:evenVBand="0" w:oddHBand="1" w:evenHBand="0" w:firstRowFirstColumn="0" w:firstRowLastColumn="0" w:lastRowFirstColumn="0" w:lastRowLastColumn="0"/>
-              <w:rPr>
-                <w:rFonts w:cs="Times New Roman"/>
-                <w:sz w:val="20"/>
-              </w:rPr>
-            </w:pPr>
-            <w:r>
-              <w:rPr>
-                <w:rFonts w:cs="Times New Roman"/>
-                <w:sz w:val="20"/>
-              </w:rPr>
-              <w:t>Partial</w:t>
+            <w:tcW w:w="866" w:type="pct"/>
+          </w:tcPr>
+          <w:p>
+            <w:pPr>
+              <w:cnfStyle w:val="000000100000" w:firstRow="0" w:lastRow="0" w:firstColumn="0" w:lastColumn="0" w:oddVBand="0" w:evenVBand="0" w:oddHBand="1" w:evenHBand="0" w:firstRowFirstColumn="0" w:firstRowLastColumn="0" w:lastRowFirstColumn="0" w:lastRowLastColumn="0"/>
+              <w:rPr>
+                <w:rFonts w:cs="Times New Roman"/>
+                <w:sz w:val="20"/>
+              </w:rPr>
+            </w:pPr>
+            <w:r>
+              <w:rPr>
+                <w:rFonts w:cs="Times New Roman"/>
+                <w:sz w:val="20"/>
+              </w:rPr>
+              <w:t>partial</w:t>
             </w:r>
           </w:p>
         </w:tc>
@@ -3263,7 +3196,7 @@
         <w:tc>
           <w:tcPr>
             <w:cnfStyle w:val="001000000000" w:firstRow="0" w:lastRow="0" w:firstColumn="1" w:lastColumn="0" w:oddVBand="0" w:evenVBand="0" w:oddHBand="0" w:evenHBand="0" w:firstRowFirstColumn="0" w:firstRowLastColumn="0" w:lastRowFirstColumn="0" w:lastRowLastColumn="0"/>
-            <w:tcW w:w="557" w:type="pct"/>
+            <w:tcW w:w="558" w:type="pct"/>
           </w:tcPr>
           <w:p>
             <w:pPr>
@@ -3300,53 +3233,51 @@
               <w:rPr>
                 <w:rFonts w:cs="Times New Roman"/>
                 <w:sz w:val="20"/>
-                <w:lang w:val="en-US"/>
-              </w:rPr>
-              <w:t>Attempt blind field prediction and reject overclaims when gates fail</w:t>
-            </w:r>
-          </w:p>
-        </w:tc>
-        <w:tc>
-          <w:tcPr>
-            <w:tcW w:w="1094" w:type="pct"/>
-          </w:tcPr>
-          <w:p>
-            <w:pPr>
-              <w:cnfStyle w:val="000000000000" w:firstRow="0" w:lastRow="0" w:firstColumn="0" w:lastColumn="0" w:oddVBand="0" w:evenVBand="0" w:oddHBand="0" w:evenHBand="0" w:firstRowFirstColumn="0" w:firstRowLastColumn="0" w:lastRowFirstColumn="0" w:lastRowLastColumn="0"/>
-              <w:rPr>
-                <w:rFonts w:cs="Times New Roman"/>
-                <w:sz w:val="20"/>
-              </w:rPr>
-            </w:pPr>
-            <w:r>
-              <w:rPr>
-                <w:rFonts w:cs="Times New Roman"/>
-                <w:sz w:val="20"/>
-              </w:rPr>
-              <w:t>RESPOND/POLIS/Garner</w:t>
-            </w:r>
-          </w:p>
-        </w:tc>
-        <w:tc>
-          <w:tcPr>
-            <w:tcW w:w="659" w:type="pct"/>
-          </w:tcPr>
-          <w:p>
-            <w:pPr>
-              <w:cnfStyle w:val="000000000000" w:firstRow="0" w:lastRow="0" w:firstColumn="0" w:lastColumn="0" w:oddVBand="0" w:evenVBand="0" w:oddHBand="0" w:evenHBand="0" w:firstRowFirstColumn="0" w:firstRowLastColumn="0" w:lastRowFirstColumn="0" w:lastRowLastColumn="0"/>
-              <w:rPr>
-                <w:rFonts w:cs="Times New Roman"/>
-                <w:sz w:val="20"/>
-                <w:lang w:val="en-US"/>
-              </w:rPr>
-            </w:pPr>
-            <w:r>
-              <w:rPr>
-                <w:rFonts w:cs="Times New Roman"/>
-                <w:sz w:val="20"/>
-                <w:lang w:val="en-US"/>
-              </w:rPr>
-              <w:t>Yes, within data-access limits</w:t>
+              </w:rPr>
+              <w:t>attempt blind field prediction and reject overclaims when gates fail</w:t>
+            </w:r>
+          </w:p>
+        </w:tc>
+        <w:tc>
+          <w:tcPr>
+            <w:tcW w:w="885" w:type="pct"/>
+          </w:tcPr>
+          <w:p>
+            <w:pPr>
+              <w:cnfStyle w:val="000000000000" w:firstRow="0" w:lastRow="0" w:firstColumn="0" w:lastColumn="0" w:oddVBand="0" w:evenVBand="0" w:oddHBand="0" w:evenHBand="0" w:firstRowFirstColumn="0" w:firstRowLastColumn="0" w:lastRowFirstColumn="0" w:lastRowLastColumn="0"/>
+              <w:rPr>
+                <w:rFonts w:cs="Times New Roman"/>
+                <w:sz w:val="20"/>
+              </w:rPr>
+            </w:pPr>
+            <w:r>
+              <w:rPr>
+                <w:rFonts w:cs="Times New Roman"/>
+                <w:sz w:val="20"/>
+              </w:rPr>
+              <w:t>rESPOND/POLIS/Garner</w:t>
+            </w:r>
+          </w:p>
+        </w:tc>
+        <w:tc>
+          <w:tcPr>
+            <w:tcW w:w="866" w:type="pct"/>
+          </w:tcPr>
+          <w:p>
+            <w:pPr>
+              <w:cnfStyle w:val="000000000000" w:firstRow="0" w:lastRow="0" w:firstColumn="0" w:lastColumn="0" w:oddVBand="0" w:evenVBand="0" w:oddHBand="0" w:evenHBand="0" w:firstRowFirstColumn="0" w:firstRowLastColumn="0" w:lastRowFirstColumn="0" w:lastRowLastColumn="0"/>
+              <w:rPr>
+                <w:rFonts w:cs="Times New Roman"/>
+                <w:sz w:val="20"/>
+                <w:lang w:val="en-US"/>
+              </w:rPr>
+            </w:pPr>
+            <w:r>
+              <w:rPr>
+                <w:rFonts w:cs="Times New Roman"/>
+                <w:sz w:val="20"/>
+              </w:rPr>
+              <w:t>yes, within data-access limits</w:t>
             </w:r>
           </w:p>
         </w:tc>
@@ -3425,15 +3356,18 @@
       <w:pPr>
         <w:pStyle w:val="Heading2"/>
         <w:rPr>
+          <w:b w:val="0"/>
           <w:lang w:val="en-US"/>
         </w:rPr>
       </w:pPr>
-      <w:r>
-        <w:rPr>
-          <w:b w:val="0"/>
-          <w:lang w:val="en-US"/>
-        </w:rPr>
-        <w:t>S4.3 Predefined gates and negative evidence</w:t>
+    </w:p>
+    <w:p>
+      <w:r>
+        <w:rPr>
+          <w:b/>
+          <w:sz w:val="20"/>
+        </w:rPr>
+        <w:t>S4.2 Predefined gates and negative evidence</w:t>
       </w:r>
     </w:p>
     <w:p>
@@ -3455,21 +3389,16 @@
     <w:p>
       <w:r>
         <w:rPr>
+          <w:b w:val="0"/>
           <w:sz w:val="20"/>
         </w:rPr>
-        <w:t>Table S4.2 lists the predefined methodological gates and their</w:t>
-      </w:r>
-      <w:r>
-        <w:rPr>
-          <w:sz w:val="20"/>
-        </w:rPr>
-        <w:t xml:space="preserve"> observed pass/fail status, so that negative evidence narrows the claim rather than being hidden after the analysis.</w:t>
+        <w:t>Table S4.2 lists the predefined methodological gates and their observed pass/fail status, so that negative evidence narrows the claim rather than being hidden after the analysis.</w:t>
       </w:r>
     </w:p>
     <w:p>
       <w:r>
         <w:rPr>
-          <w:b/>
+          <w:b w:val="0"/>
           <w:sz w:val="20"/>
         </w:rPr>
         <w:t>Table S4.2. Predefined methodological gates and observed status.</w:t>
@@ -3642,7 +3571,7 @@
                 <w:rFonts w:cs="Times New Roman"/>
                 <w:sz w:val="20"/>
               </w:rPr>
-              <w:t>Algebra identity error</w:t>
+              <w:t>algebra identity error</w:t>
             </w:r>
           </w:p>
         </w:tc>
@@ -3751,7 +3680,7 @@
                 <w:rFonts w:cs="Times New Roman"/>
                 <w:sz w:val="20"/>
               </w:rPr>
-              <w:t>Secant spectral class agreement</w:t>
+              <w:t>secant spectral class agreement</w:t>
             </w:r>
           </w:p>
         </w:tc>
@@ -3863,9 +3792,8 @@
               <w:rPr>
                 <w:rFonts w:cs="Times New Roman"/>
                 <w:sz w:val="20"/>
-                <w:lang w:val="en-US"/>
-              </w:rPr>
-              <w:t>Synthetic stress-test class agreement</w:t>
+              </w:rPr>
+              <w:t>synthetic stress-test class agreement</w:t>
             </w:r>
           </w:p>
         </w:tc>
@@ -3974,7 +3902,7 @@
                 <w:rFonts w:cs="Times New Roman"/>
                 <w:sz w:val="20"/>
               </w:rPr>
-              <w:t>External mapping consistency</w:t>
+              <w:t>external mapping consistency</w:t>
             </w:r>
           </w:p>
         </w:tc>
@@ -4420,7 +4348,7 @@
                 <w:rFonts w:cs="Times New Roman"/>
                 <w:sz w:val="20"/>
               </w:rPr>
-              <w:t>Nonlinear 3D validation eligibility</w:t>
+              <w:t>nonlinear 3D validation eligibility</w:t>
             </w:r>
           </w:p>
         </w:tc>
@@ -4464,7 +4392,7 @@
                 <w:rFonts w:cs="Times New Roman"/>
                 <w:sz w:val="20"/>
               </w:rPr>
-              <w:t>False</w:t>
+              <w:t>false</w:t>
             </w:r>
           </w:p>
         </w:tc>
@@ -4494,12 +4422,18 @@
     <w:p>
       <w:pPr>
         <w:pStyle w:val="Heading2"/>
+        <w:rPr>
+          <w:b w:val="0"/>
+        </w:rPr>
       </w:pPr>
-      <w:r>
-        <w:rPr>
-          <w:b w:val="0"/>
-        </w:rPr>
-        <w:t>S4.4 Field benchmark falsification protocol</w:t>
+    </w:p>
+    <w:p>
+      <w:r>
+        <w:rPr>
+          <w:b/>
+          <w:sz w:val="20"/>
+        </w:rPr>
+        <w:t>S4.3 Field benchmark falsification protocol</w:t>
       </w:r>
     </w:p>
     <w:p>
@@ -4521,21 +4455,16 @@
     <w:p>
       <w:r>
         <w:rPr>
+          <w:b w:val="0"/>
           <w:sz w:val="20"/>
         </w:rPr>
-        <w:t>Table S4.3 details the Garner Valley gate sequence used to decide whether the field benchmark supports validation or instead</w:t>
-      </w:r>
-      <w:r>
-        <w:rPr>
-          <w:sz w:val="20"/>
-        </w:rPr>
-        <w:t xml:space="preserve"> acts as a falsification boundary.</w:t>
+        <w:t>Table S4.3 details the Garner Valley gate sequence used to decide whether the field benchmark supports validation or instead acts as a falsification boundary.</w:t>
       </w:r>
     </w:p>
     <w:p>
       <w:r>
         <w:rPr>
-          <w:b/>
+          <w:b w:val="0"/>
           <w:sz w:val="20"/>
         </w:rPr>
         <w:t>Table S4.3. Garner Valley validation-falsification gate table.</w:t>
@@ -4801,7 +4730,7 @@
                 <w:rFonts w:cs="Times New Roman"/>
                 <w:sz w:val="20"/>
               </w:rPr>
-              <w:t>False</w:t>
+              <w:t>false</w:t>
             </w:r>
           </w:p>
         </w:tc>
@@ -5254,7 +5183,7 @@
                 <w:rFonts w:cs="Times New Roman"/>
                 <w:sz w:val="20"/>
               </w:rPr>
-              <w:t>False</w:t>
+              <w:t>false</w:t>
             </w:r>
           </w:p>
         </w:tc>
@@ -5377,15 +5306,18 @@
       <w:pPr>
         <w:pStyle w:val="Heading2"/>
         <w:rPr>
+          <w:b w:val="0"/>
           <w:lang w:val="en-US"/>
         </w:rPr>
       </w:pPr>
-      <w:r>
-        <w:rPr>
-          <w:b w:val="0"/>
-          <w:lang w:val="en-US"/>
-        </w:rPr>
-        <w:t>S4.5 Ablation, uncertainty and controls</w:t>
+    </w:p>
+    <w:p>
+      <w:r>
+        <w:rPr>
+          <w:b/>
+          <w:sz w:val="20"/>
+        </w:rPr>
+        <w:t>S4.4 Ablation, uncertainty and controls</w:t>
       </w:r>
     </w:p>
     <w:p>
@@ -5459,6 +5391,7 @@
     <w:p>
       <w:r>
         <w:rPr>
+          <w:b w:val="0"/>
           <w:sz w:val="20"/>
         </w:rPr>
         <w:t>Table S4.4 traces each major claim to its supporting evidence, reproducibility asset and boundary condition, making the permitted wording auditable.</w:t>
@@ -5467,7 +5400,7 @@
     <w:p>
       <w:r>
         <w:rPr>
-          <w:b/>
+          <w:b w:val="0"/>
           <w:sz w:val="20"/>
         </w:rPr>
         <w:t>Table S4.4. Claim-evidence traceability matrix.</w:t>
@@ -5642,7 +5575,7 @@
                 <w:rFonts w:cs="Times New Roman"/>
                 <w:sz w:val="20"/>
               </w:rPr>
-              <w:t>L1 theorem/identity checks</w:t>
+              <w:t>l1 theorem/identity checks</w:t>
             </w:r>
           </w:p>
         </w:tc>
@@ -5663,7 +5596,7 @@
                 <w:rFonts w:cs="Times New Roman"/>
                 <w:sz w:val="20"/>
               </w:rPr>
-              <w:t>Strong</w:t>
+              <w:t>strong</w:t>
             </w:r>
           </w:p>
         </w:tc>
@@ -5705,9 +5638,8 @@
               <w:rPr>
                 <w:rFonts w:cs="Times New Roman"/>
                 <w:sz w:val="20"/>
-                <w:lang w:val="en-US"/>
-              </w:rPr>
-              <w:t>Only within stated admissible SDOF-equivalent domain</w:t>
+              </w:rPr>
+              <w:t>only within stated admissible SDOF-equivalent domain</w:t>
             </w:r>
           </w:p>
         </w:tc>
@@ -5755,9 +5687,8 @@
               <w:rPr>
                 <w:rFonts w:cs="Times New Roman"/>
                 <w:sz w:val="20"/>
-                <w:lang w:val="en-US"/>
-              </w:rPr>
-              <w:t>L2 local-vs-secant accuracy and error comparison</w:t>
+              </w:rPr>
+              <w:t>l2 local-vs-secant accuracy and error comparison</w:t>
             </w:r>
           </w:p>
         </w:tc>
@@ -5778,7 +5709,7 @@
                 <w:rFonts w:cs="Times New Roman"/>
                 <w:sz w:val="20"/>
               </w:rPr>
-              <w:t>Strong</w:t>
+              <w:t>strong</w:t>
             </w:r>
           </w:p>
         </w:tc>
@@ -5820,9 +5751,8 @@
               <w:rPr>
                 <w:rFonts w:cs="Times New Roman"/>
                 <w:sz w:val="20"/>
-                <w:lang w:val="en-US"/>
-              </w:rPr>
-              <w:t>Depends on available spectral ordinate quality</w:t>
+              </w:rPr>
+              <w:t>depends on available spectral ordinate quality</w:t>
             </w:r>
           </w:p>
         </w:tc>
@@ -5873,9 +5803,8 @@
               <w:rPr>
                 <w:rFonts w:cs="Times New Roman"/>
                 <w:sz w:val="20"/>
-                <w:lang w:val="en-US"/>
-              </w:rPr>
-              <w:t>L1-L5 plus bounded field falsification protocol</w:t>
+              </w:rPr>
+              <w:t>l1-L5 plus bounded field falsification protocol</w:t>
             </w:r>
           </w:p>
         </w:tc>
@@ -5896,7 +5825,7 @@
                 <w:rFonts w:cs="Times New Roman"/>
                 <w:sz w:val="20"/>
               </w:rPr>
-              <w:t>Moderate/strong</w:t>
+              <w:t>moderate/strong</w:t>
             </w:r>
           </w:p>
         </w:tc>
@@ -5938,9 +5867,8 @@
               <w:rPr>
                 <w:rFonts w:cs="Times New Roman"/>
                 <w:sz w:val="20"/>
-                <w:lang w:val="en-US"/>
-              </w:rPr>
-              <w:t>Not a calibrated design rule</w:t>
+              </w:rPr>
+              <w:t>not a calibrated design rule</w:t>
             </w:r>
           </w:p>
         </w:tc>
@@ -6011,7 +5939,7 @@
                 <w:rFonts w:cs="Times New Roman"/>
                 <w:sz w:val="20"/>
               </w:rPr>
-              <w:t>None</w:t>
+              <w:t>none</w:t>
             </w:r>
           </w:p>
         </w:tc>
@@ -6053,9 +5981,8 @@
               <w:rPr>
                 <w:rFonts w:cs="Times New Roman"/>
                 <w:sz w:val="20"/>
-                <w:lang w:val="en-US"/>
-              </w:rPr>
-              <w:t>Requires full-resolution auxiliary channels and passed blind gates</w:t>
+              </w:rPr>
+              <w:t>requires full-resolution auxiliary channels and passed blind gates</w:t>
             </w:r>
           </w:p>
         </w:tc>
@@ -6106,9 +6033,8 @@
               <w:rPr>
                 <w:rFonts w:cs="Times New Roman"/>
                 <w:sz w:val="20"/>
-                <w:lang w:val="en-US"/>
-              </w:rPr>
-              <w:t>No positive nonlinear 3D gate pass</w:t>
+              </w:rPr>
+              <w:t>no positive nonlinear 3D gate pass</w:t>
             </w:r>
           </w:p>
         </w:tc>
@@ -6129,7 +6055,7 @@
                 <w:rFonts w:cs="Times New Roman"/>
                 <w:sz w:val="20"/>
               </w:rPr>
-              <w:t>None</w:t>
+              <w:t>none</w:t>
             </w:r>
           </w:p>
         </w:tc>
@@ -6171,7 +6097,7 @@
                 <w:rFonts w:cs="Times New Roman"/>
                 <w:sz w:val="20"/>
               </w:rPr>
-              <w:t>Future work only</w:t>
+              <w:t>future work only</w:t>
             </w:r>
           </w:p>
         </w:tc>
@@ -6242,7 +6168,7 @@
                 <w:rFonts w:cs="Times New Roman"/>
                 <w:sz w:val="20"/>
               </w:rPr>
-              <w:t>Strong</w:t>
+              <w:t>strong</w:t>
             </w:r>
           </w:p>
         </w:tc>
@@ -6284,9 +6210,8 @@
               <w:rPr>
                 <w:rFonts w:cs="Times New Roman"/>
                 <w:sz w:val="20"/>
-                <w:lang w:val="en-US"/>
-              </w:rPr>
-              <w:t>Falsifies current implementation/subset, not all possible Garner models</w:t>
+              </w:rPr>
+              <w:t>falsifies current implementation/subset, not all possible Garner models</w:t>
             </w:r>
           </w:p>
         </w:tc>
@@ -6320,7 +6245,6 @@
           <w:rFonts w:cs="Times New Roman"/>
           <w:lang w:val="en-US"/>
         </w:rPr>
-        <w:br w:type="page"/>
       </w:r>
     </w:p>
     <w:p>
@@ -6342,6 +6266,26 @@
       </w:r>
     </w:p>
     <w:p>
+      <w:r>
+        <w:rPr>
+          <w:sz w:val="20"/>
+        </w:rPr>
+        <w:t xml:space="preserve">The following supplementary validation sections separate protocol </w:t>
+      </w:r>
+      <w:r>
+        <w:rPr>
+          <w:sz w:val="20"/>
+        </w:rPr>
+        <w:t>scaffolding, negative field evidence, experimental proxy validation, predictive screening, decision-value auditing and external false-safe checks. This structure keeps positive support and falsification evidence distinct before the detailed S5.1 protocol i</w:t>
+      </w:r>
+      <w:r>
+        <w:rPr>
+          <w:sz w:val="20"/>
+        </w:rPr>
+        <w:t>s introduced.</w:t>
+      </w:r>
+    </w:p>
+    <w:p>
       <w:pPr>
         <w:pStyle w:val="Heading2"/>
         <w:rPr>
@@ -6350,7 +6294,7 @@
       </w:pPr>
       <w:r>
         <w:rPr>
-          <w:b w:val="0"/>
+          <w:b/>
           <w:lang w:val="en-US"/>
         </w:rPr>
         <w:t>S5.1 Predictive field SFSI validation protocol</w:t>
@@ -6361,6 +6305,7 @@
         <w:jc w:val="both"/>
         <w:rPr>
           <w:rFonts w:cs="Times New Roman"/>
+          <w:b/>
           <w:lang w:val="en-US"/>
         </w:rPr>
       </w:pPr>
@@ -6397,7 +6342,7 @@
       </w:pPr>
       <w:r>
         <w:rPr>
-          <w:b w:val="0"/>
+          <w:b/>
           <w:lang w:val="en-US"/>
         </w:rPr>
         <w:t>S5.2 Real-record ERIES-POLIS blind sensor check</w:t>
@@ -6460,7 +6405,7 @@
       </w:pPr>
       <w:r>
         <w:rPr>
-          <w:b w:val="0"/>
+          <w:b/>
           <w:lang w:val="en-US"/>
         </w:rPr>
         <w:t>S5.3 Garner Valley validation-falsification gate outcome</w:t>
@@ -6526,7 +6471,7 @@
       </w:pPr>
       <w:r>
         <w:rPr>
-          <w:b w:val="0"/>
+          <w:b/>
           <w:lang w:val="en-US"/>
         </w:rPr>
         <w:t>S5.4 Executed FoRDy/FoRCy experimental proxy validation</w:t>
@@ -6597,47 +6542,25 @@
       </w:r>
     </w:p>
     <w:p>
-      <w:pPr>
-        <w:jc w:val="both"/>
-        <w:rPr>
-          <w:rFonts w:cs="Times New Roman"/>
-          <w:b/>
-          <w:lang w:val="en-US"/>
-        </w:rPr>
-      </w:pPr>
-      <w:r>
-        <w:rPr>
-          <w:rFonts w:cs="Times New Roman"/>
-          <w:lang w:val="en-US"/>
-        </w:rPr>
-        <w:t>Table S5.1 reports</w:t>
-      </w:r>
-      <w:r>
-        <w:rPr>
-          <w:rFonts w:cs="Times New Roman"/>
-          <w:lang w:val="en-US"/>
-        </w:rPr>
-        <w:t xml:space="preserve"> the FoRDy/FoRCy experimental proxy-class validation metrics used to evaluate class-level screening performance.</w:t>
+      <w:r>
+        <w:rPr>
+          <w:b w:val="0"/>
+          <w:sz w:val="20"/>
+        </w:rPr>
+        <w:t>Table S5.1 reports the FoRDy/FoRCy proxy</w:t>
+      </w:r>
+      <w:r>
+        <w:rPr>
+          <w:b w:val="0"/>
+          <w:sz w:val="20"/>
+        </w:rPr>
+        <w:t>-class validation metrics used to evaluate class-level screening performance and false-safe control.</w:t>
       </w:r>
     </w:p>
     <w:p>
       <w:r>
         <w:rPr>
-          <w:sz w:val="20"/>
-        </w:rPr>
-        <w:t xml:space="preserve">Table S5.1 reports the FoRDy/FoRCy proxy-class validation metrics used to evaluate class-level screening performance and </w:t>
-      </w:r>
-      <w:r>
-        <w:rPr>
-          <w:sz w:val="20"/>
-        </w:rPr>
-        <w:t>false-safe control.</w:t>
-      </w:r>
-    </w:p>
-    <w:p>
-      <w:r>
-        <w:rPr>
-          <w:b/>
+          <w:b w:val="0"/>
           <w:sz w:val="20"/>
         </w:rPr>
         <w:t>Table S5.1. FoRDy/FoRCy experimental proxy-class validation metrics.</w:t>
@@ -7358,23 +7281,81 @@
       </w:tr>
     </w:tbl>
     <w:p>
+      <w:r>
+        <w:rPr>
+          <w:b w:val="0"/>
+        </w:rPr>
+        <w:t>Figure S5.1 overlays the experimental FoRDy/FoRCy points on the Demand-Polarity Map. The plotted points validate polarity classification at proxy-class level; they do not constitute independent force prediction, time-history response validation or field-scale proof.</w:t>
+      </w:r>
+    </w:p>
+    <w:p>
       <w:pPr>
-        <w:rPr>
-          <w:lang w:val="en-US"/>
-        </w:rPr>
+        <w:jc w:val="center"/>
       </w:pPr>
       <w:r>
-        <w:rPr>
-          <w:lang w:val="en-US"/>
-        </w:rPr>
-        <w:t>Figure S5.1 overlays</w:t>
-      </w:r>
-      <w:r>
-        <w:rPr>
-          <w:lang w:val="en-US"/>
-        </w:rPr>
-        <w:t xml:space="preserve"> the experimental FoRDy/FoRCy points on the Demand-Polarity Map. The plotted points validate polarity classification at proxy-class level; they do not constitute independent force prediction, time-history prediction or nonlinear 3D site-specific field validation. Garner Valley remains assigned to the falsification layer because its field gates did not support positive predictive validation.</w:t>
-      </w:r>
+        <w:drawing>
+          <wp:inline xmlns:a="http://schemas.openxmlformats.org/drawingml/2006/main" xmlns:pic="http://schemas.openxmlformats.org/drawingml/2006/picture">
+            <wp:extent cx="5715000" cy="3835066"/>
+            <wp:docPr id="1" name="Picture 1"/>
+            <wp:cNvGraphicFramePr>
+              <a:graphicFrameLocks noChangeAspect="1"/>
+            </wp:cNvGraphicFramePr>
+            <a:graphic>
+              <a:graphicData uri="http://schemas.openxmlformats.org/drawingml/2006/picture">
+                <pic:pic>
+                  <pic:nvPicPr>
+                    <pic:cNvPr id="0" name="image.png"/>
+                    <pic:cNvPicPr/>
+                  </pic:nvPicPr>
+                  <pic:blipFill>
+                    <a:blip r:embed="rId4"/>
+                    <a:stretch>
+                      <a:fillRect/>
+                    </a:stretch>
+                  </pic:blipFill>
+                  <pic:spPr>
+                    <a:xfrm>
+                      <a:off x="0" y="0"/>
+                      <a:ext cx="5715000" cy="3835066"/>
+                    </a:xfrm>
+                    <a:prstGeom prst="rect"/>
+                  </pic:spPr>
+                </pic:pic>
+              </a:graphicData>
+            </a:graphic>
+          </wp:inline>
+        </w:drawing>
+      </w:r>
+    </w:p>
+    <w:p>
+      <w:pPr>
+        <w:rPr>
+          <w:rFonts w:cs="Times New Roman"/>
+          <w:lang w:val="en-US"/>
+        </w:rPr>
+      </w:pPr>
+      <w:r>
+        <w:rPr>
+          <w:rFonts w:cs="Times New Roman"/>
+          <w:noProof/>
+          <w:lang w:eastAsia="es-PA"/>
+        </w:rPr>
+      </w:r>
+    </w:p>
+    <w:p>
+      <w:r>
+        <w:rPr>
+          <w:b/>
+        </w:rPr>
+        <w:t>Figure S5.1. Experimental FoRDy/FoRCy proxy points on the SSI Demand-Polarity Map.</w:t>
+      </w:r>
+    </w:p>
+    <w:p>
+      <w:pPr>
+        <w:rPr>
+          <w:lang w:val="en-US"/>
+        </w:rPr>
+      </w:pPr>
     </w:p>
     <w:p>
       <w:pPr>
@@ -7389,7 +7370,22 @@
           <w:rFonts w:cs="Times New Roman"/>
           <w:lang w:val="en-US"/>
         </w:rPr>
-        <w:t>[Figure moved from the main manuscript; see image file in the reproducibility package.]</w:t>
+        <w:t>The resulting claim boundary is therefore upgraded but still bounded: the paper now has executed public-database experimental proxy validation, explicit false-safe auditing, force-beneficial screening metrics and threshold-sensitivity checks. Garner and the high-fidelity field-modeling attempts are retained as falsification evidence that prevents overclaiming, while FoRDy/FoRCy support the intended class-screening use of the criterion.</w:t>
+      </w:r>
+    </w:p>
+    <w:p>
+      <w:pPr>
+        <w:pStyle w:val="Heading2"/>
+        <w:rPr>
+          <w:lang w:val="en-US"/>
+        </w:rPr>
+      </w:pPr>
+      <w:r>
+        <w:rPr>
+          <w:b/>
+          <w:lang w:val="en-US"/>
+        </w:rPr>
+        <w:t>S5.5 Independent predictive proxy validation</w:t>
       </w:r>
     </w:p>
     <w:p>
@@ -7405,22 +7401,20 @@
           <w:rFonts w:cs="Times New Roman"/>
           <w:lang w:val="en-US"/>
         </w:rPr>
-        <w:t>The resulting claim boundary is therefore upgraded but still bounded: the paper now has executed public-database experimental proxy validation, explicit false-safe auditing, force-beneficial screening metrics and threshold-sensitivity checks. Garner and the high-fidelity field-modeling attempts are retained as falsification evidence that prevents overclaiming, while FoRDy/FoRCy support the intended class-screening use of the criterion.</w:t>
-      </w:r>
-    </w:p>
-    <w:p>
-      <w:pPr>
-        <w:pStyle w:val="Heading2"/>
-        <w:rPr>
-          <w:lang w:val="en-US"/>
-        </w:rPr>
-      </w:pPr>
-      <w:r>
-        <w:rPr>
-          <w:b w:val="0"/>
-          <w:lang w:val="en-US"/>
-        </w:rPr>
-        <w:t>S5.5 Independent predictive proxy validation</w:t>
+        <w:t xml:space="preserve">A separate leakage-controlled predictive layer was added after the proxy validation. In this layer, FoRDy response quantities are withheld until scoring: observed force ratio, peak drift, peak rotation, settlement and the observed class are not used as predictors. The allowed predictors are pre-response descriptors and input-motion quantities, including a capacity/contact proxy for </w:t>
+      </w:r>
+      <w:r>
+        <w:rPr>
+          <w:rFonts w:cs="Times New Roman"/>
+        </w:rPr>
+        <w:t>λ</w:t>
+      </w:r>
+      <w:r>
+        <w:rPr>
+          <w:rFonts w:cs="Times New Roman"/>
+          <w:lang w:val="en-US"/>
+        </w:rPr>
+        <w:t>, a secant spectral-slope estimate from the input-motion shape, PGA, PGV and Arias intensity. The split is leave-study-out by FoRDy project group, not a random row split.</w:t>
       </w:r>
     </w:p>
     <w:p>
@@ -7436,20 +7430,7 @@
           <w:rFonts w:cs="Times New Roman"/>
           <w:lang w:val="en-US"/>
         </w:rPr>
-        <w:t xml:space="preserve">A separate leakage-controlled predictive layer was added after the proxy validation. In this layer, FoRDy response quantities are withheld until scoring: observed force ratio, peak drift, peak rotation, settlement and the observed class are not used as predictors. The allowed predictors are pre-response descriptors and input-motion quantities, including a capacity/contact proxy for </w:t>
-      </w:r>
-      <w:r>
-        <w:rPr>
-          <w:rFonts w:cs="Times New Roman"/>
-        </w:rPr>
-        <w:t>λ</w:t>
-      </w:r>
-      <w:r>
-        <w:rPr>
-          <w:rFonts w:cs="Times New Roman"/>
-          <w:lang w:val="en-US"/>
-        </w:rPr>
-        <w:t>, a secant spectral-slope estimate from the input-motion shape, PGA, PGV and Arias intensity. The split is leave-study-out by FoRDy project group, not a random row split.</w:t>
+        <w:t>Consistent with the independent-validation audit, the study/project group is treated as the operational unit of independence rather than the individual database row. All response-derived variables, observed classes, threshold choices and scoring quantities are kept outside the held-out study group until scoring; preprocessing and class-rule application are therefore interpreted within the leave-study-out protocol. This control prevents row-wise leakage and keeps the result bounded to pre-response predictive class screening.</w:t>
       </w:r>
     </w:p>
     <w:p>
@@ -7465,7 +7446,7 @@
           <w:rFonts w:cs="Times New Roman"/>
           <w:lang w:val="en-US"/>
         </w:rPr>
-        <w:t>Consistent with the independent-validation audit, the study/project group is treated as the operational unit of independence rather than the individual database row. All response-derived variables, observed classes, threshold choices and scoring quantities are kept outside the held-out study group until scoring; preprocessing and class-rule application are therefore interpreted within the leave-study-out protocol. This control prevents row-wise leakage and keeps the result bounded to pre-response predictive class screening.</w:t>
+        <w:t>The proposed predictive centroid classifier is intentionally interpretable and auditable, because the target decision is screening safety rather than full response-history reproduction. It is compared against majority-class, always-mixed, spectral-slope-only and flexibility-only baselines. Across 194 FoRDy scored cases, the proposed predictive layer reaches 54.1% accuracy and 53.9% balanced accuracy, compared with 33.5% accuracy for the majority-class baseline. More importantly for screening, it maintains a 5.7% false-safe rate, 89.6% mixed-regime recall and 76.6% safe precision. These results pass the screening-safety gates but do not pass the stronger accuracy gate for standalone predictive validation.</w:t>
       </w:r>
     </w:p>
     <w:p>
@@ -7481,67 +7462,29 @@
           <w:rFonts w:cs="Times New Roman"/>
           <w:lang w:val="en-US"/>
         </w:rPr>
-        <w:t>The proposed predictive centroid classifier is intentionally interpretable and auditable, because the target decision is screening safety rather than full response-history reproduction. It is compared against majority-class, always-mixed, spectral-slope-only and flexibility-only baselines. Across 194 FoRDy scored cases, the proposed predictive layer reaches 54.1% accuracy and 53.9% balanced accuracy, compared with 33.5% accuracy for the majority-class baseline. More importantly for screening, it maintains a 5.7% false-safe rate, 89.6% mixed-regime recall and 76.6% safe precision. These results pass the screening-safety gates but do not pass the stronger accuracy gate for standalone predictive validation.</w:t>
+        <w:t>A grouped uncertainty audit was then added to avoid treating dependent FoRDy rows as independent evidence. Using 10,000 cluster-bootstrap resamples of complete study groups, the proposed predictive screen has an accuracy 95% interval of 0.411-0.661, a false-safe-rate interval of 0.006-0.140 and a mixed-recall interval of 0.767-0.988. These intervals show useful false-safe control and mixed-case retention under grouped resampling, but they also show that study-to-study variability is too large to claim a calibrated standalone predictor.</w:t>
       </w:r>
     </w:p>
     <w:p>
-      <w:pPr>
-        <w:jc w:val="both"/>
-        <w:rPr>
-          <w:rFonts w:cs="Times New Roman"/>
-          <w:lang w:val="en-US"/>
-        </w:rPr>
-      </w:pPr>
-      <w:r>
-        <w:rPr>
-          <w:rFonts w:cs="Times New Roman"/>
-          <w:lang w:val="en-US"/>
-        </w:rPr>
-        <w:t>A grouped uncertainty audit was then added to avoid treating dependent FoRDy rows as independent evidence. Using 10,000 cluster-bootstrap resamples of complete study groups, the proposed predictive screen has an accuracy 95% interval of 0.411-0.661, a false-safe-rate interval of 0.006-0.140 and a mixed-recall interval of 0.767-0.988. These intervals show useful false-safe control and mixed-case retention under grouped resampling, but they also show that study-to-study variability is too large to claim a calibrated standalone predictor.</w:t>
+      <w:r>
+        <w:rPr>
+          <w:b w:val="0"/>
+          <w:sz w:val="20"/>
+        </w:rPr>
+        <w:t>Table S5.2 compares the independent predictive proxy layer, the solver-backed class-prediction layer and simpler baseline rul</w:t>
+      </w:r>
+      <w:r>
+        <w:rPr>
+          <w:b w:val="0"/>
+          <w:sz w:val="20"/>
+        </w:rPr>
+        <w:t>es to show the added screening value of the proposed map.</w:t>
       </w:r>
     </w:p>
     <w:p>
-      <w:pPr>
-        <w:jc w:val="both"/>
-        <w:rPr>
-          <w:rFonts w:cs="Times New Roman"/>
-          <w:b/>
-          <w:lang w:val="en-US"/>
-        </w:rPr>
-      </w:pPr>
-      <w:r>
-        <w:rPr>
-          <w:rFonts w:cs="Times New Roman"/>
-          <w:lang w:val="en-US"/>
-        </w:rPr>
-        <w:t>Table S5.2 compares</w:t>
-      </w:r>
-      <w:r>
-        <w:rPr>
-          <w:rFonts w:cs="Times New Roman"/>
-          <w:lang w:val="en-US"/>
-        </w:rPr>
-        <w:t xml:space="preserve"> the independent predictive proxy-validation layer, the V2 OpenSeesPy solver-backed class-prediction layer, and simpler baseline rules.</w:t>
-      </w:r>
-    </w:p>
-    <w:p>
-      <w:r>
-        <w:rPr>
-          <w:sz w:val="20"/>
-        </w:rPr>
-        <w:t>Table S5.2 compares the independent predictive proxy layer, the solver-backed class-prediction layer and simpler basel</w:t>
-      </w:r>
-      <w:r>
-        <w:rPr>
-          <w:sz w:val="20"/>
-        </w:rPr>
-        <w:t>ine rules to show the added screening value of the proposed map.</w:t>
-      </w:r>
-    </w:p>
-    <w:p>
-      <w:r>
-        <w:rPr>
-          <w:b/>
+      <w:r>
+        <w:rPr>
+          <w:b w:val="0"/>
           <w:sz w:val="20"/>
         </w:rPr>
         <w:t>Table S5.2. Independent predictive and solver-backed class-validation layers compared with baseline rules.</w:t>
@@ -8631,47 +8574,73 @@
       </w:tr>
     </w:tbl>
     <w:p>
-      <w:pPr>
-        <w:jc w:val="both"/>
-        <w:rPr>
-          <w:rFonts w:cs="Times New Roman"/>
-          <w:lang w:val="en-US"/>
-        </w:rPr>
-      </w:pPr>
-      <w:r>
-        <w:rPr>
-          <w:rFonts w:cs="Times New Roman"/>
-          <w:lang w:val="en-US"/>
-        </w:rPr>
-        <w:t xml:space="preserve">The OpenSeesPy 3D solver-backed row is a V2 class-prediction experiment: the solver generates period-shift, force-ratio, displacement-ratio and rotation guardrail variables before observed force, drift, rotation and settlement classes are scored. It passes the conservative screening gates with a 5.15% false-safe rate, 87.0% mixed recall and 76.2% safe precision, while remaining explicitly below full nonlinear 3D response-history </w:t>
-      </w:r>
-      <w:r>
-        <w:rPr>
-          <w:rFonts w:cs="Times New Roman"/>
-          <w:lang w:val="en-US"/>
-        </w:rPr>
-        <w:t>validation. Figure S5.2 visualizes</w:t>
-      </w:r>
-      <w:r>
-        <w:rPr>
-          <w:rFonts w:cs="Times New Roman"/>
-          <w:lang w:val="en-US"/>
-        </w:rPr>
-        <w:t xml:space="preserve"> the independent predictive validation confusion matrix before the decision-value audit is introduced.</w:t>
+      <w:r>
+        <w:rPr>
+          <w:b w:val="0"/>
+        </w:rPr>
+        <w:t>Figure S5.2 reports the confusion matrix for the independent predictive validation layer, showing how the pre-response classifier distributes safe, mixed and detrimental cases.</w:t>
       </w:r>
     </w:p>
     <w:p>
       <w:pPr>
-        <w:rPr>
-          <w:sz w:val="20"/>
-          <w:lang w:val="en-US"/>
-        </w:rPr>
+        <w:jc w:val="center"/>
       </w:pPr>
       <w:r>
-        <w:rPr>
-          <w:lang w:val="en-US"/>
-        </w:rPr>
-        <w:t>Figure S5.2 is provided in Section S6 as the independent predictive validation confusion matrix.</w:t>
+        <w:drawing>
+          <wp:inline xmlns:a="http://schemas.openxmlformats.org/drawingml/2006/main" xmlns:pic="http://schemas.openxmlformats.org/drawingml/2006/picture">
+            <wp:extent cx="5715000" cy="4835769"/>
+            <wp:docPr id="2" name="Picture 2"/>
+            <wp:cNvGraphicFramePr>
+              <a:graphicFrameLocks noChangeAspect="1"/>
+            </wp:cNvGraphicFramePr>
+            <a:graphic>
+              <a:graphicData uri="http://schemas.openxmlformats.org/drawingml/2006/picture">
+                <pic:pic>
+                  <pic:nvPicPr>
+                    <pic:cNvPr id="0" name="image.png"/>
+                    <pic:cNvPicPr/>
+                  </pic:nvPicPr>
+                  <pic:blipFill>
+                    <a:blip r:embed="rId6"/>
+                    <a:stretch>
+                      <a:fillRect/>
+                    </a:stretch>
+                  </pic:blipFill>
+                  <pic:spPr>
+                    <a:xfrm>
+                      <a:off x="0" y="0"/>
+                      <a:ext cx="5715000" cy="4835769"/>
+                    </a:xfrm>
+                    <a:prstGeom prst="rect"/>
+                  </pic:spPr>
+                </pic:pic>
+              </a:graphicData>
+            </a:graphic>
+          </wp:inline>
+        </w:drawing>
+      </w:r>
+    </w:p>
+    <w:p>
+      <w:pPr>
+        <w:rPr>
+          <w:rFonts w:cs="Times New Roman"/>
+          <w:lang w:val="en-US"/>
+        </w:rPr>
+      </w:pPr>
+      <w:r>
+        <w:rPr>
+          <w:rFonts w:cs="Times New Roman"/>
+          <w:noProof/>
+          <w:lang w:eastAsia="es-PA"/>
+        </w:rPr>
+      </w:r>
+    </w:p>
+    <w:p>
+      <w:r>
+        <w:rPr>
+          <w:b/>
+        </w:rPr>
+        <w:t>Figure S5.2. Independent predictive validation confusion matrix.</w:t>
       </w:r>
     </w:p>
     <w:p>
@@ -8682,6 +8651,97 @@
           <w:lang w:val="en-US"/>
         </w:rPr>
       </w:pPr>
+    </w:p>
+    <w:p>
+      <w:pPr>
+        <w:jc w:val="both"/>
+        <w:rPr>
+          <w:rFonts w:cs="Times New Roman"/>
+          <w:lang w:val="en-US"/>
+        </w:rPr>
+      </w:pPr>
+      <w:r>
+        <w:t>The OpenSeesPy 3D solver-backed row is a V2 class-prediction experiment: the solver generates period-shift, force-ratio, displacement-ratio and rotation guardrail variables before observed force, drift, rotation and settlement classes are scored. It passes the conservative screening gates with a 5.15% false-safe rate, 87.0% mixed recall and 76.2% safe precision, while remaining explicitly below full nonlinear 3D response-history validation.</w:t>
+      </w:r>
+    </w:p>
+    <w:p>
+      <w:r>
+        <w:rPr>
+          <w:b w:val="0"/>
+        </w:rPr>
+        <w:t>Figure S5.3 shows the solver-backed demand-polarity map used as a class-prediction check rather than as a full nonlinear response-history validation.</w:t>
+      </w:r>
+    </w:p>
+    <w:p>
+      <w:pPr>
+        <w:jc w:val="center"/>
+      </w:pPr>
+      <w:r>
+        <w:drawing>
+          <wp:inline xmlns:a="http://schemas.openxmlformats.org/drawingml/2006/main" xmlns:pic="http://schemas.openxmlformats.org/drawingml/2006/picture">
+            <wp:extent cx="5715000" cy="4424516"/>
+            <wp:docPr id="3" name="Picture 3"/>
+            <wp:cNvGraphicFramePr>
+              <a:graphicFrameLocks noChangeAspect="1"/>
+            </wp:cNvGraphicFramePr>
+            <a:graphic>
+              <a:graphicData uri="http://schemas.openxmlformats.org/drawingml/2006/picture">
+                <pic:pic>
+                  <pic:nvPicPr>
+                    <pic:cNvPr id="0" name="image.png"/>
+                    <pic:cNvPicPr/>
+                  </pic:nvPicPr>
+                  <pic:blipFill>
+                    <a:blip r:embed="rId5"/>
+                    <a:stretch>
+                      <a:fillRect/>
+                    </a:stretch>
+                  </pic:blipFill>
+                  <pic:spPr>
+                    <a:xfrm>
+                      <a:off x="0" y="0"/>
+                      <a:ext cx="5715000" cy="4424516"/>
+                    </a:xfrm>
+                    <a:prstGeom prst="rect"/>
+                  </pic:spPr>
+                </pic:pic>
+              </a:graphicData>
+            </a:graphic>
+          </wp:inline>
+        </w:drawing>
+      </w:r>
+    </w:p>
+    <w:p>
+      <w:pPr>
+        <w:rPr>
+          <w:rFonts w:cs="Times New Roman"/>
+          <w:lang w:val="en-US"/>
+        </w:rPr>
+      </w:pPr>
+      <w:r>
+        <w:rPr>
+          <w:rFonts w:cs="Times New Roman"/>
+          <w:noProof/>
+          <w:lang w:eastAsia="es-PA"/>
+        </w:rPr>
+      </w:r>
+    </w:p>
+    <w:p>
+      <w:r>
+        <w:rPr>
+          <w:b/>
+        </w:rPr>
+        <w:t>Figure S5.3. Solver-backed demand-polarity map.</w:t>
+      </w:r>
+    </w:p>
+    <w:p>
+      <w:pPr>
+        <w:jc w:val="both"/>
+        <w:rPr>
+          <w:rFonts w:cs="Times New Roman"/>
+          <w:lang w:val="en-US"/>
+        </w:rPr>
+      </w:pPr>
       <w:r>
         <w:rPr>
           <w:rFonts w:cs="Times New Roman"/>
@@ -8699,7 +8759,7 @@
       </w:pPr>
       <w:r>
         <w:rPr>
-          <w:b w:val="0"/>
+          <w:b/>
           <w:lang w:val="en-US"/>
         </w:rPr>
         <w:t>S5.6 Decision-value validation of false-safe screening</w:t>
@@ -8767,47 +8827,18 @@
       </w:r>
     </w:p>
     <w:p>
-      <w:pPr>
-        <w:jc w:val="both"/>
-        <w:rPr>
-          <w:rFonts w:cs="Times New Roman"/>
-          <w:b/>
-          <w:lang w:val="en-US"/>
-        </w:rPr>
-      </w:pPr>
-      <w:r>
-        <w:rPr>
-          <w:rFonts w:cs="Times New Roman"/>
-          <w:lang w:val="en-US"/>
-        </w:rPr>
-        <w:t>Table S5.3 reports</w:t>
-      </w:r>
-      <w:r>
-        <w:rPr>
-          <w:rFonts w:cs="Times New Roman"/>
-          <w:lang w:val="en-US"/>
-        </w:rPr>
-        <w:t xml:space="preserve"> the decision-value false-safe audit under asymmetric screening loss.</w:t>
+      <w:r>
+        <w:rPr>
+          <w:b w:val="0"/>
+          <w:sz w:val="20"/>
+        </w:rPr>
+        <w:t>Table S5.3 reports the decision-value audit under asymmetric screening loss, emphasizing whether the map reduces false-safe releases relative to force-only optimism.</w:t>
       </w:r>
     </w:p>
     <w:p>
       <w:r>
         <w:rPr>
-          <w:sz w:val="20"/>
-        </w:rPr>
-        <w:t xml:space="preserve">Table S5.3 reports </w:t>
-      </w:r>
-      <w:r>
-        <w:rPr>
-          <w:sz w:val="20"/>
-        </w:rPr>
-        <w:t>the decision-value audit under asymmetric screening loss, emphasizing whether the map reduces false-safe releases relative to force-only optimism.</w:t>
-      </w:r>
-    </w:p>
-    <w:p>
-      <w:r>
-        <w:rPr>
-          <w:b/>
+          <w:b w:val="0"/>
           <w:sz w:val="20"/>
         </w:rPr>
         <w:t>Table S5.3. Decision-value false-safe audit under asymmetric screening loss.</w:t>
@@ -9088,9 +9119,8 @@
               <w:rPr>
                 <w:rFonts w:cs="Times New Roman"/>
                 <w:sz w:val="20"/>
-                <w:lang w:val="en-US"/>
-              </w:rPr>
-              <w:t>Low false-safe screening rule</w:t>
+              </w:rPr>
+              <w:t>low false-safe screening rule</w:t>
             </w:r>
           </w:p>
         </w:tc>
@@ -9220,9 +9250,8 @@
               <w:rPr>
                 <w:rFonts w:cs="Times New Roman"/>
                 <w:sz w:val="20"/>
-                <w:lang w:val="en-US"/>
-              </w:rPr>
-              <w:t>Unsafe force-only release rule</w:t>
+              </w:rPr>
+              <w:t>unsafe force-only release rule</w:t>
             </w:r>
           </w:p>
         </w:tc>
@@ -9355,9 +9384,8 @@
               <w:rPr>
                 <w:rFonts w:cs="Times New Roman"/>
                 <w:sz w:val="20"/>
-                <w:lang w:val="en-US"/>
-              </w:rPr>
-              <w:t>Zero false-safe but no releases</w:t>
+              </w:rPr>
+              <w:t>zero false-safe but no releases</w:t>
             </w:r>
           </w:p>
         </w:tc>
@@ -9487,7 +9515,7 @@
                 <w:rFonts w:cs="Times New Roman"/>
                 <w:sz w:val="20"/>
               </w:rPr>
-              <w:t>Predictive screening only</w:t>
+              <w:t>predictive screening only</w:t>
             </w:r>
           </w:p>
         </w:tc>
@@ -9620,44 +9648,88 @@
                 <w:rFonts w:cs="Times New Roman"/>
                 <w:sz w:val="20"/>
               </w:rPr>
-              <w:t>High false-safe rate</w:t>
+              <w:t>high false-safe rate</w:t>
             </w:r>
           </w:p>
         </w:tc>
       </w:tr>
     </w:tbl>
     <w:p>
-      <w:pPr>
-        <w:rPr>
-          <w:lang w:val="en-US"/>
-        </w:rPr>
-      </w:pPr>
-      <w:r>
-        <w:rPr>
-          <w:lang w:val="en-US"/>
-        </w:rPr>
-        <w:t>Figure S5.3 summarizes</w:t>
-      </w:r>
-      <w:r>
-        <w:rPr>
-          <w:lang w:val="en-US"/>
-        </w:rPr>
-        <w:t xml:space="preserve"> the decision-value loss-ratio sweep and selective-abstention audit.</w:t>
+      <w:r>
+        <w:rPr>
+          <w:b w:val="0"/>
+        </w:rPr>
+        <w:t>Figure S5.4 summarizes the decision-value loss-ratio sweep and selective-abstention audit.</w:t>
       </w:r>
     </w:p>
     <w:p>
       <w:pPr>
-        <w:rPr>
-          <w:sz w:val="20"/>
-          <w:lang w:val="en-US"/>
-        </w:rPr>
+        <w:jc w:val="center"/>
       </w:pPr>
       <w:r>
-        <w:rPr>
-          <w:lang w:val="en-US"/>
-        </w:rPr>
-        <w:t>Figure S5.3 is provided in Section S6 as the decision-value loss-ratio sweep and selective-abstention audit.</w:t>
-      </w:r>
+        <w:drawing>
+          <wp:inline xmlns:a="http://schemas.openxmlformats.org/drawingml/2006/main" xmlns:pic="http://schemas.openxmlformats.org/drawingml/2006/picture">
+            <wp:extent cx="5715000" cy="3647281"/>
+            <wp:docPr id="4" name="Picture 4"/>
+            <wp:cNvGraphicFramePr>
+              <a:graphicFrameLocks noChangeAspect="1"/>
+            </wp:cNvGraphicFramePr>
+            <a:graphic>
+              <a:graphicData uri="http://schemas.openxmlformats.org/drawingml/2006/picture">
+                <pic:pic>
+                  <pic:nvPicPr>
+                    <pic:cNvPr id="0" name="image.png"/>
+                    <pic:cNvPicPr/>
+                  </pic:nvPicPr>
+                  <pic:blipFill>
+                    <a:blip r:embed="rId7"/>
+                    <a:stretch>
+                      <a:fillRect/>
+                    </a:stretch>
+                  </pic:blipFill>
+                  <pic:spPr>
+                    <a:xfrm>
+                      <a:off x="0" y="0"/>
+                      <a:ext cx="5715000" cy="3647281"/>
+                    </a:xfrm>
+                    <a:prstGeom prst="rect"/>
+                  </pic:spPr>
+                </pic:pic>
+              </a:graphicData>
+            </a:graphic>
+          </wp:inline>
+        </w:drawing>
+      </w:r>
+    </w:p>
+    <w:p>
+      <w:pPr>
+        <w:rPr>
+          <w:rFonts w:cs="Times New Roman"/>
+          <w:lang w:val="en-US"/>
+        </w:rPr>
+      </w:pPr>
+      <w:r>
+        <w:rPr>
+          <w:rFonts w:cs="Times New Roman"/>
+          <w:noProof/>
+          <w:lang w:eastAsia="es-PA"/>
+        </w:rPr>
+      </w:r>
+    </w:p>
+    <w:p>
+      <w:r>
+        <w:rPr>
+          <w:b/>
+        </w:rPr>
+        <w:t>Figure S5.4. Decision-value loss-ratio sweep.</w:t>
+      </w:r>
+    </w:p>
+    <w:p>
+      <w:pPr>
+        <w:rPr>
+          <w:lang w:val="en-US"/>
+        </w:rPr>
+      </w:pPr>
     </w:p>
     <w:p>
       <w:pPr>
@@ -9668,7 +9740,7 @@
       </w:pPr>
       <w:r>
         <w:rPr>
-          <w:b w:val="0"/>
+          <w:b/>
           <w:lang w:val="en-US"/>
         </w:rPr>
         <w:t>S5.7 Failure-mode atlas and empirical guardrails</w:t>
@@ -9775,47 +9847,18 @@
       </w:r>
     </w:p>
     <w:p>
-      <w:pPr>
-        <w:jc w:val="both"/>
-        <w:rPr>
-          <w:rFonts w:cs="Times New Roman"/>
-          <w:b/>
-          <w:lang w:val="en-US"/>
-        </w:rPr>
-      </w:pPr>
-      <w:r>
-        <w:rPr>
-          <w:rFonts w:cs="Times New Roman"/>
-          <w:lang w:val="en-US"/>
-        </w:rPr>
-        <w:t>Table S5.4 reports</w:t>
-      </w:r>
-      <w:r>
-        <w:rPr>
-          <w:rFonts w:cs="Times New Roman"/>
-          <w:lang w:val="en-US"/>
-        </w:rPr>
-        <w:t xml:space="preserve"> the failure-mode atlas and low-margin guardrail audit.</w:t>
+      <w:r>
+        <w:rPr>
+          <w:b w:val="0"/>
+          <w:sz w:val="20"/>
+        </w:rPr>
+        <w:t>Table S5.4 summarizes the failure-mode atlas and the low-margin guardrail audit used to identify and reduce unsafe screening releases.</w:t>
       </w:r>
     </w:p>
     <w:p>
       <w:r>
         <w:rPr>
-          <w:sz w:val="20"/>
-        </w:rPr>
-        <w:t xml:space="preserve">Table S5.4 summarizes the failure-mode atlas and the low-margin guardrail audit used to identify and reduce </w:t>
-      </w:r>
-      <w:r>
-        <w:rPr>
-          <w:sz w:val="20"/>
-        </w:rPr>
-        <w:t>unsafe screening releases.</w:t>
-      </w:r>
-    </w:p>
-    <w:p>
-      <w:r>
-        <w:rPr>
-          <w:b/>
+          <w:b w:val="0"/>
           <w:sz w:val="20"/>
         </w:rPr>
         <w:t>Table S5.4. Failure-mode atlas and low-margin guardrail audit.</w:t>
@@ -10766,800 +10809,34 @@
       </w:tr>
     </w:tbl>
     <w:p>
-      <w:pPr>
-        <w:rPr>
-          <w:lang w:val="en-US"/>
-        </w:rPr>
-      </w:pPr>
-      <w:r>
-        <w:rPr>
-          <w:lang w:val="en-US"/>
-        </w:rPr>
-        <w:t>Figure S5.4 shows the failure-mode atlas on the Demand-Polarity Map, and Figure S5.5 reports the associated guardrail tradeoff.</w:t>
+      <w:r>
+        <w:rPr>
+          <w:b w:val="0"/>
+        </w:rPr>
+        <w:t>Figure S5.5 shows the failure-mode atlas on the Demand-Polarity Map, identifying where robust, marginal, false-conservative and false-safe screening outcomes occur.</w:t>
       </w:r>
     </w:p>
     <w:p>
       <w:pPr>
-        <w:rPr>
-          <w:sz w:val="20"/>
-          <w:lang w:val="en-US"/>
-        </w:rPr>
+        <w:jc w:val="center"/>
       </w:pPr>
       <w:r>
-        <w:rPr>
-          <w:lang w:val="en-US"/>
-        </w:rPr>
-        <w:t>Figure S5.4 is provided in Section S6 as the failure-mode atlas on the Demand-Polarity Map and guardrail tradeoff.</w:t>
-      </w:r>
-    </w:p>
-    <w:p>
-      <w:pPr>
-        <w:pStyle w:val="Heading2"/>
-        <w:rPr>
-          <w:lang w:val="en-US"/>
-        </w:rPr>
-      </w:pPr>
-      <w:r>
-        <w:rPr>
-          <w:b w:val="0"/>
-          <w:lang w:val="en-US"/>
-        </w:rPr>
-        <w:t>S5.8 External FLIQ liquefaction-oriented false-safe audit</w:t>
-      </w:r>
-    </w:p>
-    <w:p>
-      <w:pPr>
-        <w:jc w:val="both"/>
-        <w:rPr>
-          <w:rFonts w:cs="Times New Roman"/>
-          <w:lang w:val="en-US"/>
-        </w:rPr>
-      </w:pPr>
-      <w:r>
-        <w:rPr>
-          <w:rFonts w:cs="Times New Roman"/>
-          <w:lang w:val="en-US"/>
-        </w:rPr>
-        <w:t>As a secondary external check, the public FLIQ foundation and ground performance in liquefaction experiments database was added as a false-safe audit. FLIQ contains centrifuge case histories for shallow foundations and liquefaction-oriented soil-foundation interaction, with consistently tabulated base motion, surface motion, settlement and rotation quantities (Allmond et al., 2015). This layer is deliberately framed as a displacement/settlement risk audit rather than as nonlinear 3D response-history validation.</w:t>
-      </w:r>
-    </w:p>
-    <w:p>
-      <w:pPr>
-        <w:jc w:val="both"/>
-        <w:rPr>
-          <w:rFonts w:cs="Times New Roman"/>
-          <w:lang w:val="en-US"/>
-        </w:rPr>
-      </w:pPr>
-      <w:r>
-        <w:rPr>
-          <w:rFonts w:cs="Times New Roman"/>
-          <w:lang w:val="en-US"/>
-        </w:rPr>
-        <w:t>The audit asks a narrow screening question: when acceleration-side response appears beneficial, does the case nevertheless show settlement or rotation penalties? From 405 FLIQ rows, 241 structural rows had sufficient base acceleration, surface acceleration, settlement and rotation quantities for the audit. Only three rows showed apparent acceleration-side benefit using the surface/base PGA proxy, and all three were false-safe under the settlement/rotation penalty definition. A pre-response guardrail using only input intensity and structural descriptors reduced the all-case false-safe rate to 8.7%, with 73.8% recall of settlement/rotation penalty cases and 77.9% safe precision.</w:t>
-      </w:r>
-    </w:p>
-    <w:p>
-      <w:pPr>
-        <w:jc w:val="both"/>
-        <w:rPr>
-          <w:rFonts w:cs="Times New Roman"/>
-          <w:lang w:val="en-US"/>
-        </w:rPr>
-      </w:pPr>
-      <w:r>
-        <w:rPr>
-          <w:rFonts w:cs="Times New Roman"/>
-          <w:lang w:val="en-US"/>
-        </w:rPr>
-        <w:t>This FLIQ layer supports the intended screening interpretation: acceleration or force-side benefit alone is not a sufficient safety release when settlement and rotation penalties are possible. It is used only as an external liquefaction-oriented false-safe audit; it does not replace the FoRDy/FoRCy proxy validation and does not establish nonlinear 3D site-specific predictive validation.</w:t>
-      </w:r>
-    </w:p>
-    <w:p>
-      <w:pPr>
-        <w:jc w:val="both"/>
-        <w:rPr>
-          <w:rFonts w:cs="Times New Roman"/>
-          <w:b/>
-          <w:lang w:val="en-US"/>
-        </w:rPr>
-      </w:pPr>
-      <w:r>
-        <w:rPr>
-          <w:rFonts w:cs="Times New Roman"/>
-          <w:lang w:val="en-US"/>
-        </w:rPr>
-        <w:t>Table S5.5 reports</w:t>
-      </w:r>
-      <w:r>
-        <w:rPr>
-          <w:rFonts w:cs="Times New Roman"/>
-          <w:lang w:val="en-US"/>
-        </w:rPr>
-        <w:t xml:space="preserve"> the external FLIQ liquefaction-oriented false-safe audit.</w:t>
-      </w:r>
-    </w:p>
-    <w:p>
-      <w:r>
-        <w:rPr>
-          <w:sz w:val="20"/>
-        </w:rPr>
-        <w:t>Table S5.5 reports the external FLIQ liquefaction-oriented audit, which tests whether acceleration-side benefit can still coincide with settlemen</w:t>
-      </w:r>
-      <w:r>
-        <w:rPr>
-          <w:sz w:val="20"/>
-        </w:rPr>
-        <w:t>t or rotation penalty.</w:t>
-      </w:r>
-    </w:p>
-    <w:p>
-      <w:r>
-        <w:rPr>
-          <w:b/>
-          <w:sz w:val="20"/>
-        </w:rPr>
-        <w:t>Table S5.5. External FLIQ liquefaction-oriented false-safe audit.</w:t>
-      </w:r>
-    </w:p>
-    <w:tbl>
-      <w:tblPr>
-        <w:tblStyle w:val="PlainTable2"/>
-        <w:tblW w:w="5000" w:type="pct"/>
-        <w:tblLook w:val="04A0" w:firstRow="1" w:lastRow="0" w:firstColumn="1" w:lastColumn="0" w:noHBand="0" w:noVBand="1"/>
-      </w:tblPr>
-      <w:tblGrid>
-        <w:gridCol w:w="4456"/>
-        <w:gridCol w:w="4382"/>
-      </w:tblGrid>
-      <w:tr>
-        <w:trPr>
-          <w:cnfStyle w:val="100000000000" w:firstRow="1" w:lastRow="0" w:firstColumn="0" w:lastColumn="0" w:oddVBand="0" w:evenVBand="0" w:oddHBand="0" w:evenHBand="0" w:firstRowFirstColumn="0" w:firstRowLastColumn="0" w:lastRowFirstColumn="0" w:lastRowLastColumn="0"/>
-        </w:trPr>
-        <w:tc>
-          <w:tcPr>
-            <w:cnfStyle w:val="001000000000" w:firstRow="0" w:lastRow="0" w:firstColumn="1" w:lastColumn="0" w:oddVBand="0" w:evenVBand="0" w:oddHBand="0" w:evenHBand="0" w:firstRowFirstColumn="0" w:firstRowLastColumn="0" w:lastRowFirstColumn="0" w:lastRowLastColumn="0"/>
-            <w:tcW w:w="2521" w:type="pct"/>
-          </w:tcPr>
-          <w:p>
-            <w:pPr>
-              <w:rPr>
-                <w:rFonts w:cs="Times New Roman"/>
-                <w:sz w:val="20"/>
-              </w:rPr>
-            </w:pPr>
-            <w:r>
-              <w:rPr>
-                <w:rFonts w:cs="Times New Roman"/>
-                <w:sz w:val="20"/>
-              </w:rPr>
-              <w:t>FLIQ audit quantity</w:t>
-            </w:r>
-          </w:p>
-        </w:tc>
-        <w:tc>
-          <w:tcPr>
-            <w:tcW w:w="2479" w:type="pct"/>
-          </w:tcPr>
-          <w:p>
-            <w:pPr>
-              <w:cnfStyle w:val="100000000000" w:firstRow="1" w:lastRow="0" w:firstColumn="0" w:lastColumn="0" w:oddVBand="0" w:evenVBand="0" w:oddHBand="0" w:evenHBand="0" w:firstRowFirstColumn="0" w:firstRowLastColumn="0" w:lastRowFirstColumn="0" w:lastRowLastColumn="0"/>
-              <w:rPr>
-                <w:rFonts w:cs="Times New Roman"/>
-                <w:sz w:val="20"/>
-              </w:rPr>
-            </w:pPr>
-            <w:r>
-              <w:rPr>
-                <w:rFonts w:cs="Times New Roman"/>
-                <w:sz w:val="20"/>
-              </w:rPr>
-              <w:t>Result</w:t>
-            </w:r>
-          </w:p>
-        </w:tc>
-      </w:tr>
-      <w:tr>
-        <w:trPr>
-          <w:cnfStyle w:val="000000100000" w:firstRow="0" w:lastRow="0" w:firstColumn="0" w:lastColumn="0" w:oddVBand="0" w:evenVBand="0" w:oddHBand="1" w:evenHBand="0" w:firstRowFirstColumn="0" w:firstRowLastColumn="0" w:lastRowFirstColumn="0" w:lastRowLastColumn="0"/>
-        </w:trPr>
-        <w:tc>
-          <w:tcPr>
-            <w:cnfStyle w:val="001000000000" w:firstRow="0" w:lastRow="0" w:firstColumn="1" w:lastColumn="0" w:oddVBand="0" w:evenVBand="0" w:oddHBand="0" w:evenHBand="0" w:firstRowFirstColumn="0" w:firstRowLastColumn="0" w:lastRowFirstColumn="0" w:lastRowLastColumn="0"/>
-            <w:tcW w:w="2521" w:type="pct"/>
-          </w:tcPr>
-          <w:p>
-            <w:pPr>
-              <w:rPr>
-                <w:rFonts w:cs="Times New Roman"/>
-                <w:b w:val="0"/>
-                <w:sz w:val="20"/>
-              </w:rPr>
-            </w:pPr>
-            <w:r>
-              <w:rPr>
-                <w:rFonts w:cs="Times New Roman"/>
-                <w:b w:val="0"/>
-                <w:sz w:val="20"/>
-              </w:rPr>
-              <w:t>Raw FLIQ rows</w:t>
-            </w:r>
-          </w:p>
-        </w:tc>
-        <w:tc>
-          <w:tcPr>
-            <w:tcW w:w="2479" w:type="pct"/>
-          </w:tcPr>
-          <w:p>
-            <w:pPr>
-              <w:cnfStyle w:val="000000100000" w:firstRow="0" w:lastRow="0" w:firstColumn="0" w:lastColumn="0" w:oddVBand="0" w:evenVBand="0" w:oddHBand="1" w:evenHBand="0" w:firstRowFirstColumn="0" w:firstRowLastColumn="0" w:lastRowFirstColumn="0" w:lastRowLastColumn="0"/>
-              <w:rPr>
-                <w:rFonts w:cs="Times New Roman"/>
-                <w:sz w:val="20"/>
-              </w:rPr>
-            </w:pPr>
-            <w:r>
-              <w:rPr>
-                <w:rFonts w:cs="Times New Roman"/>
-                <w:sz w:val="20"/>
-              </w:rPr>
-              <w:t>405</w:t>
-            </w:r>
-          </w:p>
-        </w:tc>
-      </w:tr>
-      <w:tr>
-        <w:tc>
-          <w:tcPr>
-            <w:cnfStyle w:val="001000000000" w:firstRow="0" w:lastRow="0" w:firstColumn="1" w:lastColumn="0" w:oddVBand="0" w:evenVBand="0" w:oddHBand="0" w:evenHBand="0" w:firstRowFirstColumn="0" w:firstRowLastColumn="0" w:lastRowFirstColumn="0" w:lastRowLastColumn="0"/>
-            <w:tcW w:w="2521" w:type="pct"/>
-          </w:tcPr>
-          <w:p>
-            <w:pPr>
-              <w:rPr>
-                <w:rFonts w:cs="Times New Roman"/>
-                <w:b w:val="0"/>
-                <w:sz w:val="20"/>
-                <w:lang w:val="en-US"/>
-              </w:rPr>
-            </w:pPr>
-            <w:r>
-              <w:rPr>
-                <w:rFonts w:cs="Times New Roman"/>
-                <w:b w:val="0"/>
-                <w:sz w:val="20"/>
-                <w:lang w:val="en-US"/>
-              </w:rPr>
-              <w:t>Structural rows usable for audit</w:t>
-            </w:r>
-          </w:p>
-        </w:tc>
-        <w:tc>
-          <w:tcPr>
-            <w:tcW w:w="2479" w:type="pct"/>
-          </w:tcPr>
-          <w:p>
-            <w:pPr>
-              <w:cnfStyle w:val="000000000000" w:firstRow="0" w:lastRow="0" w:firstColumn="0" w:lastColumn="0" w:oddVBand="0" w:evenVBand="0" w:oddHBand="0" w:evenHBand="0" w:firstRowFirstColumn="0" w:firstRowLastColumn="0" w:lastRowFirstColumn="0" w:lastRowLastColumn="0"/>
-              <w:rPr>
-                <w:rFonts w:cs="Times New Roman"/>
-                <w:sz w:val="20"/>
-              </w:rPr>
-            </w:pPr>
-            <w:r>
-              <w:rPr>
-                <w:rFonts w:cs="Times New Roman"/>
-                <w:sz w:val="20"/>
-              </w:rPr>
-              <w:t>241</w:t>
-            </w:r>
-          </w:p>
-        </w:tc>
-      </w:tr>
-      <w:tr>
-        <w:trPr>
-          <w:cnfStyle w:val="000000100000" w:firstRow="0" w:lastRow="0" w:firstColumn="0" w:lastColumn="0" w:oddVBand="0" w:evenVBand="0" w:oddHBand="1" w:evenHBand="0" w:firstRowFirstColumn="0" w:firstRowLastColumn="0" w:lastRowFirstColumn="0" w:lastRowLastColumn="0"/>
-        </w:trPr>
-        <w:tc>
-          <w:tcPr>
-            <w:cnfStyle w:val="001000000000" w:firstRow="0" w:lastRow="0" w:firstColumn="1" w:lastColumn="0" w:oddVBand="0" w:evenVBand="0" w:oddHBand="0" w:evenHBand="0" w:firstRowFirstColumn="0" w:firstRowLastColumn="0" w:lastRowFirstColumn="0" w:lastRowLastColumn="0"/>
-            <w:tcW w:w="2521" w:type="pct"/>
-          </w:tcPr>
-          <w:p>
-            <w:pPr>
-              <w:rPr>
-                <w:rFonts w:cs="Times New Roman"/>
-                <w:b w:val="0"/>
-                <w:sz w:val="20"/>
-              </w:rPr>
-            </w:pPr>
-            <w:r>
-              <w:rPr>
-                <w:rFonts w:cs="Times New Roman"/>
-                <w:b w:val="0"/>
-                <w:sz w:val="20"/>
-              </w:rPr>
-              <w:t>Settlement/rotation penalty cases</w:t>
-            </w:r>
-          </w:p>
-        </w:tc>
-        <w:tc>
-          <w:tcPr>
-            <w:tcW w:w="2479" w:type="pct"/>
-          </w:tcPr>
-          <w:p>
-            <w:pPr>
-              <w:cnfStyle w:val="000000100000" w:firstRow="0" w:lastRow="0" w:firstColumn="0" w:lastColumn="0" w:oddVBand="0" w:evenVBand="0" w:oddHBand="1" w:evenHBand="0" w:firstRowFirstColumn="0" w:firstRowLastColumn="0" w:lastRowFirstColumn="0" w:lastRowLastColumn="0"/>
-              <w:rPr>
-                <w:rFonts w:cs="Times New Roman"/>
-                <w:sz w:val="20"/>
-              </w:rPr>
-            </w:pPr>
-            <w:r>
-              <w:rPr>
-                <w:rFonts w:cs="Times New Roman"/>
-                <w:sz w:val="20"/>
-              </w:rPr>
-              <w:t>80</w:t>
-            </w:r>
-          </w:p>
-        </w:tc>
-      </w:tr>
-      <w:tr>
-        <w:tc>
-          <w:tcPr>
-            <w:cnfStyle w:val="001000000000" w:firstRow="0" w:lastRow="0" w:firstColumn="1" w:lastColumn="0" w:oddVBand="0" w:evenVBand="0" w:oddHBand="0" w:evenHBand="0" w:firstRowFirstColumn="0" w:firstRowLastColumn="0" w:lastRowFirstColumn="0" w:lastRowLastColumn="0"/>
-            <w:tcW w:w="2521" w:type="pct"/>
-          </w:tcPr>
-          <w:p>
-            <w:pPr>
-              <w:rPr>
-                <w:rFonts w:cs="Times New Roman"/>
-                <w:b w:val="0"/>
-                <w:sz w:val="20"/>
-              </w:rPr>
-            </w:pPr>
-            <w:r>
-              <w:rPr>
-                <w:rFonts w:cs="Times New Roman"/>
-                <w:b w:val="0"/>
-                <w:sz w:val="20"/>
-              </w:rPr>
-              <w:t>Apparent acceleration-benefit cases</w:t>
-            </w:r>
-          </w:p>
-        </w:tc>
-        <w:tc>
-          <w:tcPr>
-            <w:tcW w:w="2479" w:type="pct"/>
-          </w:tcPr>
-          <w:p>
-            <w:pPr>
-              <w:cnfStyle w:val="000000000000" w:firstRow="0" w:lastRow="0" w:firstColumn="0" w:lastColumn="0" w:oddVBand="0" w:evenVBand="0" w:oddHBand="0" w:evenHBand="0" w:firstRowFirstColumn="0" w:firstRowLastColumn="0" w:lastRowFirstColumn="0" w:lastRowLastColumn="0"/>
-              <w:rPr>
-                <w:rFonts w:cs="Times New Roman"/>
-                <w:sz w:val="20"/>
-              </w:rPr>
-            </w:pPr>
-            <w:r>
-              <w:rPr>
-                <w:rFonts w:cs="Times New Roman"/>
-                <w:sz w:val="20"/>
-              </w:rPr>
-              <w:t>3</w:t>
-            </w:r>
-          </w:p>
-        </w:tc>
-      </w:tr>
-      <w:tr>
-        <w:trPr>
-          <w:cnfStyle w:val="000000100000" w:firstRow="0" w:lastRow="0" w:firstColumn="0" w:lastColumn="0" w:oddVBand="0" w:evenVBand="0" w:oddHBand="1" w:evenHBand="0" w:firstRowFirstColumn="0" w:firstRowLastColumn="0" w:lastRowFirstColumn="0" w:lastRowLastColumn="0"/>
-        </w:trPr>
-        <w:tc>
-          <w:tcPr>
-            <w:cnfStyle w:val="001000000000" w:firstRow="0" w:lastRow="0" w:firstColumn="1" w:lastColumn="0" w:oddVBand="0" w:evenVBand="0" w:oddHBand="0" w:evenHBand="0" w:firstRowFirstColumn="0" w:firstRowLastColumn="0" w:lastRowFirstColumn="0" w:lastRowLastColumn="0"/>
-            <w:tcW w:w="2521" w:type="pct"/>
-          </w:tcPr>
-          <w:p>
-            <w:pPr>
-              <w:rPr>
-                <w:rFonts w:cs="Times New Roman"/>
-                <w:b w:val="0"/>
-                <w:sz w:val="20"/>
-                <w:lang w:val="en-US"/>
-              </w:rPr>
-            </w:pPr>
-            <w:r>
-              <w:rPr>
-                <w:rFonts w:cs="Times New Roman"/>
-                <w:b w:val="0"/>
-                <w:sz w:val="20"/>
-                <w:lang w:val="en-US"/>
-              </w:rPr>
-              <w:t>Acceleration-only false-safe cases</w:t>
-            </w:r>
-          </w:p>
-        </w:tc>
-        <w:tc>
-          <w:tcPr>
-            <w:tcW w:w="2479" w:type="pct"/>
-          </w:tcPr>
-          <w:p>
-            <w:pPr>
-              <w:cnfStyle w:val="000000100000" w:firstRow="0" w:lastRow="0" w:firstColumn="0" w:lastColumn="0" w:oddVBand="0" w:evenVBand="0" w:oddHBand="1" w:evenHBand="0" w:firstRowFirstColumn="0" w:firstRowLastColumn="0" w:lastRowFirstColumn="0" w:lastRowLastColumn="0"/>
-              <w:rPr>
-                <w:rFonts w:cs="Times New Roman"/>
-                <w:sz w:val="20"/>
-              </w:rPr>
-            </w:pPr>
-            <w:r>
-              <w:rPr>
-                <w:rFonts w:cs="Times New Roman"/>
-                <w:sz w:val="20"/>
-              </w:rPr>
-              <w:t>3</w:t>
-            </w:r>
-          </w:p>
-        </w:tc>
-      </w:tr>
-      <w:tr>
-        <w:tc>
-          <w:tcPr>
-            <w:cnfStyle w:val="001000000000" w:firstRow="0" w:lastRow="0" w:firstColumn="1" w:lastColumn="0" w:oddVBand="0" w:evenVBand="0" w:oddHBand="0" w:evenHBand="0" w:firstRowFirstColumn="0" w:firstRowLastColumn="0" w:lastRowFirstColumn="0" w:lastRowLastColumn="0"/>
-            <w:tcW w:w="2521" w:type="pct"/>
-          </w:tcPr>
-          <w:p>
-            <w:pPr>
-              <w:rPr>
-                <w:rFonts w:cs="Times New Roman"/>
-                <w:b w:val="0"/>
-                <w:sz w:val="20"/>
-                <w:lang w:val="en-US"/>
-              </w:rPr>
-            </w:pPr>
-            <w:r>
-              <w:rPr>
-                <w:rFonts w:cs="Times New Roman"/>
-                <w:b w:val="0"/>
-                <w:sz w:val="20"/>
-                <w:lang w:val="en-US"/>
-              </w:rPr>
-              <w:t>False-safe rate among apparent acceleration-benefit cases</w:t>
-            </w:r>
-          </w:p>
-        </w:tc>
-        <w:tc>
-          <w:tcPr>
-            <w:tcW w:w="2479" w:type="pct"/>
-          </w:tcPr>
-          <w:p>
-            <w:pPr>
-              <w:cnfStyle w:val="000000000000" w:firstRow="0" w:lastRow="0" w:firstColumn="0" w:lastColumn="0" w:oddVBand="0" w:evenVBand="0" w:oddHBand="0" w:evenHBand="0" w:firstRowFirstColumn="0" w:firstRowLastColumn="0" w:lastRowFirstColumn="0" w:lastRowLastColumn="0"/>
-              <w:rPr>
-                <w:rFonts w:cs="Times New Roman"/>
-                <w:sz w:val="20"/>
-              </w:rPr>
-            </w:pPr>
-            <w:r>
-              <w:rPr>
-                <w:rFonts w:cs="Times New Roman"/>
-                <w:sz w:val="20"/>
-              </w:rPr>
-              <w:t>100%</w:t>
-            </w:r>
-          </w:p>
-        </w:tc>
-      </w:tr>
-      <w:tr>
-        <w:trPr>
-          <w:cnfStyle w:val="000000100000" w:firstRow="0" w:lastRow="0" w:firstColumn="0" w:lastColumn="0" w:oddVBand="0" w:evenVBand="0" w:oddHBand="1" w:evenHBand="0" w:firstRowFirstColumn="0" w:firstRowLastColumn="0" w:lastRowFirstColumn="0" w:lastRowLastColumn="0"/>
-        </w:trPr>
-        <w:tc>
-          <w:tcPr>
-            <w:cnfStyle w:val="001000000000" w:firstRow="0" w:lastRow="0" w:firstColumn="1" w:lastColumn="0" w:oddVBand="0" w:evenVBand="0" w:oddHBand="0" w:evenHBand="0" w:firstRowFirstColumn="0" w:firstRowLastColumn="0" w:lastRowFirstColumn="0" w:lastRowLastColumn="0"/>
-            <w:tcW w:w="2521" w:type="pct"/>
-          </w:tcPr>
-          <w:p>
-            <w:pPr>
-              <w:rPr>
-                <w:rFonts w:cs="Times New Roman"/>
-                <w:b w:val="0"/>
-                <w:sz w:val="20"/>
-                <w:lang w:val="en-US"/>
-              </w:rPr>
-            </w:pPr>
-            <w:r>
-              <w:rPr>
-                <w:rFonts w:cs="Times New Roman"/>
-                <w:b w:val="0"/>
-                <w:sz w:val="20"/>
-                <w:lang w:val="en-US"/>
-              </w:rPr>
-              <w:t>Pre-response guardrail all-case false-safe rate</w:t>
-            </w:r>
-          </w:p>
-        </w:tc>
-        <w:tc>
-          <w:tcPr>
-            <w:tcW w:w="2479" w:type="pct"/>
-          </w:tcPr>
-          <w:p>
-            <w:pPr>
-              <w:cnfStyle w:val="000000100000" w:firstRow="0" w:lastRow="0" w:firstColumn="0" w:lastColumn="0" w:oddVBand="0" w:evenVBand="0" w:oddHBand="1" w:evenHBand="0" w:firstRowFirstColumn="0" w:firstRowLastColumn="0" w:lastRowFirstColumn="0" w:lastRowLastColumn="0"/>
-              <w:rPr>
-                <w:rFonts w:cs="Times New Roman"/>
-                <w:sz w:val="20"/>
-              </w:rPr>
-            </w:pPr>
-            <w:r>
-              <w:rPr>
-                <w:rFonts w:cs="Times New Roman"/>
-                <w:sz w:val="20"/>
-              </w:rPr>
-              <w:t>8.7%</w:t>
-            </w:r>
-          </w:p>
-        </w:tc>
-      </w:tr>
-      <w:tr>
-        <w:tc>
-          <w:tcPr>
-            <w:cnfStyle w:val="001000000000" w:firstRow="0" w:lastRow="0" w:firstColumn="1" w:lastColumn="0" w:oddVBand="0" w:evenVBand="0" w:oddHBand="0" w:evenHBand="0" w:firstRowFirstColumn="0" w:firstRowLastColumn="0" w:lastRowFirstColumn="0" w:lastRowLastColumn="0"/>
-            <w:tcW w:w="2521" w:type="pct"/>
-          </w:tcPr>
-          <w:p>
-            <w:pPr>
-              <w:rPr>
-                <w:rFonts w:cs="Times New Roman"/>
-                <w:b w:val="0"/>
-                <w:sz w:val="20"/>
-                <w:lang w:val="en-US"/>
-              </w:rPr>
-            </w:pPr>
-            <w:r>
-              <w:rPr>
-                <w:rFonts w:cs="Times New Roman"/>
-                <w:b w:val="0"/>
-                <w:sz w:val="20"/>
-                <w:lang w:val="en-US"/>
-              </w:rPr>
-              <w:t>Pre-response guardrail settlement/rotation penalty recall</w:t>
-            </w:r>
-          </w:p>
-        </w:tc>
-        <w:tc>
-          <w:tcPr>
-            <w:tcW w:w="2479" w:type="pct"/>
-          </w:tcPr>
-          <w:p>
-            <w:pPr>
-              <w:cnfStyle w:val="000000000000" w:firstRow="0" w:lastRow="0" w:firstColumn="0" w:lastColumn="0" w:oddVBand="0" w:evenVBand="0" w:oddHBand="0" w:evenHBand="0" w:firstRowFirstColumn="0" w:firstRowLastColumn="0" w:lastRowFirstColumn="0" w:lastRowLastColumn="0"/>
-              <w:rPr>
-                <w:rFonts w:cs="Times New Roman"/>
-                <w:sz w:val="20"/>
-              </w:rPr>
-            </w:pPr>
-            <w:r>
-              <w:rPr>
-                <w:rFonts w:cs="Times New Roman"/>
-                <w:sz w:val="20"/>
-              </w:rPr>
-              <w:t>73.8%</w:t>
-            </w:r>
-          </w:p>
-        </w:tc>
-      </w:tr>
-      <w:tr>
-        <w:trPr>
-          <w:cnfStyle w:val="000000100000" w:firstRow="0" w:lastRow="0" w:firstColumn="0" w:lastColumn="0" w:oddVBand="0" w:evenVBand="0" w:oddHBand="1" w:evenHBand="0" w:firstRowFirstColumn="0" w:firstRowLastColumn="0" w:lastRowFirstColumn="0" w:lastRowLastColumn="0"/>
-        </w:trPr>
-        <w:tc>
-          <w:tcPr>
-            <w:cnfStyle w:val="001000000000" w:firstRow="0" w:lastRow="0" w:firstColumn="1" w:lastColumn="0" w:oddVBand="0" w:evenVBand="0" w:oddHBand="0" w:evenHBand="0" w:firstRowFirstColumn="0" w:firstRowLastColumn="0" w:lastRowFirstColumn="0" w:lastRowLastColumn="0"/>
-            <w:tcW w:w="2521" w:type="pct"/>
-          </w:tcPr>
-          <w:p>
-            <w:pPr>
-              <w:rPr>
-                <w:rFonts w:cs="Times New Roman"/>
-                <w:b w:val="0"/>
-                <w:sz w:val="20"/>
-                <w:lang w:val="en-US"/>
-              </w:rPr>
-            </w:pPr>
-            <w:r>
-              <w:rPr>
-                <w:rFonts w:cs="Times New Roman"/>
-                <w:b w:val="0"/>
-                <w:sz w:val="20"/>
-                <w:lang w:val="en-US"/>
-              </w:rPr>
-              <w:t>Pre-response guardrail safe precision</w:t>
-            </w:r>
-          </w:p>
-        </w:tc>
-        <w:tc>
-          <w:tcPr>
-            <w:tcW w:w="2479" w:type="pct"/>
-          </w:tcPr>
-          <w:p>
-            <w:pPr>
-              <w:cnfStyle w:val="000000100000" w:firstRow="0" w:lastRow="0" w:firstColumn="0" w:lastColumn="0" w:oddVBand="0" w:evenVBand="0" w:oddHBand="1" w:evenHBand="0" w:firstRowFirstColumn="0" w:firstRowLastColumn="0" w:lastRowFirstColumn="0" w:lastRowLastColumn="0"/>
-              <w:rPr>
-                <w:rFonts w:cs="Times New Roman"/>
-                <w:sz w:val="20"/>
-              </w:rPr>
-            </w:pPr>
-            <w:r>
-              <w:rPr>
-                <w:rFonts w:cs="Times New Roman"/>
-                <w:sz w:val="20"/>
-              </w:rPr>
-              <w:t>77.9%</w:t>
-            </w:r>
-          </w:p>
-        </w:tc>
-      </w:tr>
-    </w:tbl>
-    <w:p>
-      <w:pPr>
-        <w:jc w:val="both"/>
-        <w:rPr>
-          <w:rFonts w:cs="Times New Roman"/>
-        </w:rPr>
-      </w:pPr>
-    </w:p>
-    <w:p>
-      <w:pPr>
-        <w:pStyle w:val="Heading2"/>
-      </w:pPr>
-      <w:r>
-        <w:rPr>
-          <w:b w:val="0"/>
-        </w:rPr>
-        <w:t>S5.9 External literature consistency benchmark</w:t>
-      </w:r>
-    </w:p>
-    <w:p>
-      <w:pPr>
-        <w:jc w:val="both"/>
-        <w:rPr>
-          <w:rFonts w:cs="Times New Roman"/>
-          <w:lang w:val="en-US"/>
-        </w:rPr>
-      </w:pPr>
-      <w:r>
-        <w:rPr>
-          <w:rFonts w:cs="Times New Roman"/>
-          <w:lang w:val="en-US"/>
-        </w:rPr>
-        <w:t>As an additional literature-based consistency benchmark, recent and classical SSI studies were screened for independently reported combinations of force-side and displacement-side response. Zhang and Far (2024) provide the strongest quantitative mapping candidate because their finite-element soil-foundation-structure study was verified against shaking-table tests and reports normalized base-shear and inter-storey drift ratios for a large high-rise parametric matrix. Their reported mechanism, in which foundation rotation can reduce base shear while increasing inter-storey drift, is consistent with the mixed demand-polarity region of the present map. Yang et al. (2024) provide an independent range check under far-field long-period motions: reported SSI base-shear coefficients are generally below unity, while displacement and drift coefficients exceed unity, with the caveat that bimodal spectra can still produce shear amplification. Tao et al. (2024) further supports the spectral-shift interpretation by showing that SSI can be detrimental when period/frequency shift moves the system into an unfavorable demand region. Mylonakis and Gazetas (2000) provide the classical theoretical and recorded-motion basis for treating SSI as conditionally beneficial or detrimental, rather than automatically favorable. Tileylioglu et al. (2011) adds field evidence that foundation stiffness and damping are frequency dependent and measurable at the Garner Valley SFSI structure, supporting the physical plausibility of the reduced-model inputs.</w:t>
-      </w:r>
-    </w:p>
-    <w:p>
-      <w:pPr>
-        <w:rPr>
-          <w:rFonts w:cs="Times New Roman"/>
-          <w:lang w:val="en-US"/>
-        </w:rPr>
-      </w:pPr>
-    </w:p>
-    <w:p>
-      <w:pPr>
-        <w:jc w:val="both"/>
-        <w:rPr>
-          <w:rFonts w:cs="Times New Roman"/>
-          <w:lang w:val="en-US"/>
-        </w:rPr>
-      </w:pPr>
-      <w:r>
-        <w:rPr>
-          <w:rFonts w:cs="Times New Roman"/>
-          <w:lang w:val="en-US"/>
-        </w:rPr>
-        <w:t>This literature layer is deliberately treated as external consistency evidence, not as independent nonlinear three-dimensional validation. The comparison strengthens the screening interpretation because independent studies report the same force/displacement polarity separation and the same dependence on spectral or frequency shift, but it does not establish calibrated response-history prediction. The claim boundary therefore remains unchanged: the proposed criterion is a reproducible class-screening and false-safe audit tool that flags demand-polarity risk before detailed nonlinear SSI analysis.</w:t>
-      </w:r>
-    </w:p>
-    <w:p>
-      <w:pPr>
-        <w:rPr>
-          <w:rFonts w:cs="Times New Roman"/>
-          <w:lang w:val="en-US"/>
-        </w:rPr>
-      </w:pPr>
-    </w:p>
-    <w:p>
-      <w:pPr>
-        <w:rPr>
-          <w:rFonts w:cs="Times New Roman"/>
-          <w:lang w:val="en-US"/>
-        </w:rPr>
-      </w:pPr>
-      <w:r>
-        <w:rPr>
-          <w:rFonts w:cs="Times New Roman"/>
-          <w:lang w:val="en-US"/>
-        </w:rPr>
-        <w:br w:type="page"/>
-      </w:r>
-    </w:p>
-    <w:p>
-      <w:pPr>
-        <w:jc w:val="both"/>
-        <w:rPr>
-          <w:rFonts w:cs="Times New Roman"/>
-          <w:b/>
-          <w:lang w:val="en-US"/>
-        </w:rPr>
-      </w:pPr>
-      <w:r>
-        <w:rPr>
-          <w:rFonts w:cs="Times New Roman"/>
-          <w:b/>
-          <w:lang w:val="en-US"/>
-        </w:rPr>
-        <w:t>S6. Moved validation figures</w:t>
-      </w:r>
-    </w:p>
-    <w:p>
-      <w:pPr>
-        <w:rPr>
-          <w:rFonts w:cs="Times New Roman"/>
-          <w:lang w:val="en-US"/>
-        </w:rPr>
-      </w:pPr>
-    </w:p>
-    <w:p>
-      <w:pPr>
-        <w:rPr>
-          <w:rFonts w:cs="Times New Roman"/>
-          <w:lang w:val="en-US"/>
-        </w:rPr>
-      </w:pPr>
-      <w:r>
-        <w:rPr>
-          <w:rFonts w:cs="Times New Roman"/>
-          <w:lang w:val="en-US"/>
-        </w:rPr>
-        <w:t>Figure S5.1 shows the FoRDy/FoRCy experimental proxy points on the SSI Demand-Polarity Map, providing the visual basis for the proxy-class validation layer.</w:t>
-      </w:r>
-    </w:p>
-    <w:p>
-      <w:pPr>
-        <w:rPr>
-          <w:rFonts w:cs="Times New Roman"/>
-          <w:lang w:val="en-US"/>
-        </w:rPr>
-      </w:pPr>
-      <w:r>
-        <w:rPr>
-          <w:rFonts w:cs="Times New Roman"/>
-          <w:noProof/>
-          <w:lang w:eastAsia="es-PA"/>
-        </w:rPr>
         <w:drawing>
-          <wp:inline distT="0" distB="0" distL="0" distR="0">
-            <wp:extent cx="5612130" cy="3766185"/>
-            <wp:effectExtent l="0" t="0" r="7620" b="5715"/>
-            <wp:docPr id="2" name="Picture 2"/>
+          <wp:inline xmlns:a="http://schemas.openxmlformats.org/drawingml/2006/main" xmlns:pic="http://schemas.openxmlformats.org/drawingml/2006/picture">
+            <wp:extent cx="5715000" cy="3918857"/>
+            <wp:docPr id="5" name="Picture 5"/>
             <wp:cNvGraphicFramePr>
-              <a:graphicFrameLocks xmlns:a="http://schemas.openxmlformats.org/drawingml/2006/main" noChangeAspect="1"/>
+              <a:graphicFrameLocks noChangeAspect="1"/>
             </wp:cNvGraphicFramePr>
-            <a:graphic xmlns:a="http://schemas.openxmlformats.org/drawingml/2006/main">
+            <a:graphic>
               <a:graphicData uri="http://schemas.openxmlformats.org/drawingml/2006/picture">
-                <pic:pic xmlns:pic="http://schemas.openxmlformats.org/drawingml/2006/picture">
+                <pic:pic>
                   <pic:nvPicPr>
-                    <pic:cNvPr id="2" name=""/>
+                    <pic:cNvPr id="0" name="image.png"/>
                     <pic:cNvPicPr/>
                   </pic:nvPicPr>
                   <pic:blipFill>
-                    <a:blip r:embed="rId4" cstate="print">
-                      <a:extLst>
-                        <a:ext uri="{28A0092B-C50C-407E-A947-70E740481C1C}">
-                          <a14:useLocalDpi xmlns:a14="http://schemas.microsoft.com/office/drawing/2010/main" val="0"/>
-                        </a:ext>
-                      </a:extLst>
-                    </a:blip>
+                    <a:blip r:embed="rId9"/>
                     <a:stretch>
                       <a:fillRect/>
                     </a:stretch>
@@ -11567,11 +10844,9 @@
                   <pic:spPr>
                     <a:xfrm>
                       <a:off x="0" y="0"/>
-                      <a:ext cx="5612130" cy="3766185"/>
+                      <a:ext cx="5715000" cy="3918857"/>
                     </a:xfrm>
-                    <a:prstGeom prst="rect">
-                      <a:avLst/>
-                    </a:prstGeom>
+                    <a:prstGeom prst="rect"/>
                   </pic:spPr>
                 </pic:pic>
               </a:graphicData>
@@ -11584,78 +10859,54 @@
       <w:pPr>
         <w:rPr>
           <w:rFonts w:cs="Times New Roman"/>
+          <w:lang w:val="en-US"/>
+        </w:rPr>
+      </w:pPr>
+      <w:r>
+        <w:rPr>
+          <w:rFonts w:cs="Times New Roman"/>
+          <w:noProof/>
+          <w:lang w:eastAsia="es-PA"/>
+        </w:rPr>
+      </w:r>
+    </w:p>
+    <w:p>
+      <w:r>
+        <w:rPr>
           <w:b/>
-          <w:lang w:val="en-US"/>
-        </w:rPr>
-      </w:pPr>
-      <w:r>
-        <w:rPr>
-          <w:rFonts w:cs="Times New Roman"/>
-          <w:b/>
-          <w:lang w:val="en-US"/>
-        </w:rPr>
-        <w:t>Figure S5.1. Experimental FoRDy/FoRCy proxy points on the SSI Demand-Polarity Map.</w:t>
+        </w:rPr>
+        <w:t>Figure S5.5. Failure-mode atlas on the Demand-Polarity Map.</w:t>
+      </w:r>
+    </w:p>
+    <w:p>
+      <w:r>
+        <w:rPr>
+          <w:b w:val="0"/>
+        </w:rPr>
+        <w:t>Figure S5.6 reports the guardrail tradeoff used to escalate low-margin releases and reduce false-safe screening decisions.</w:t>
       </w:r>
     </w:p>
     <w:p>
       <w:pPr>
-        <w:rPr>
-          <w:rFonts w:cs="Times New Roman"/>
-          <w:lang w:val="en-US"/>
-        </w:rPr>
+        <w:jc w:val="center"/>
       </w:pPr>
-    </w:p>
-    <w:p>
-      <w:pPr>
-        <w:rPr>
-          <w:rFonts w:cs="Times New Roman"/>
-          <w:lang w:val="en-US"/>
-        </w:rPr>
-      </w:pPr>
-      <w:r>
-        <w:rPr>
-          <w:rFonts w:cs="Times New Roman"/>
-          <w:lang w:val="en-US"/>
-        </w:rPr>
-        <w:t>Figure S5.2 reports the confusion matrix for the independent predictive validation layer, showing how the pre-response classifier distributes safe, mixed and detrimental cases.</w:t>
-      </w:r>
-    </w:p>
-    <w:p>
-      <w:pPr>
-        <w:rPr>
-          <w:rFonts w:cs="Times New Roman"/>
-          <w:lang w:val="en-US"/>
-        </w:rPr>
-      </w:pPr>
-      <w:r>
-        <w:rPr>
-          <w:rFonts w:cs="Times New Roman"/>
-          <w:noProof/>
-          <w:lang w:eastAsia="es-PA"/>
-        </w:rPr>
+      <w:r>
         <w:drawing>
-          <wp:inline distT="0" distB="0" distL="0" distR="0">
-            <wp:extent cx="4754889" cy="4023368"/>
-            <wp:effectExtent l="0" t="0" r="7620" b="0"/>
-            <wp:docPr id="3" name="Picture 3"/>
+          <wp:inline xmlns:a="http://schemas.openxmlformats.org/drawingml/2006/main" xmlns:pic="http://schemas.openxmlformats.org/drawingml/2006/picture">
+            <wp:extent cx="5715000" cy="3707027"/>
+            <wp:docPr id="6" name="Picture 6"/>
             <wp:cNvGraphicFramePr>
-              <a:graphicFrameLocks xmlns:a="http://schemas.openxmlformats.org/drawingml/2006/main" noChangeAspect="1"/>
+              <a:graphicFrameLocks noChangeAspect="1"/>
             </wp:cNvGraphicFramePr>
-            <a:graphic xmlns:a="http://schemas.openxmlformats.org/drawingml/2006/main">
+            <a:graphic>
               <a:graphicData uri="http://schemas.openxmlformats.org/drawingml/2006/picture">
-                <pic:pic xmlns:pic="http://schemas.openxmlformats.org/drawingml/2006/picture">
+                <pic:pic>
                   <pic:nvPicPr>
-                    <pic:cNvPr id="3" name=""/>
+                    <pic:cNvPr id="0" name="image.png"/>
                     <pic:cNvPicPr/>
                   </pic:nvPicPr>
                   <pic:blipFill>
-                    <a:blip r:embed="rId5">
-                      <a:extLst>
-                        <a:ext uri="{28A0092B-C50C-407E-A947-70E740481C1C}">
-                          <a14:useLocalDpi xmlns:a14="http://schemas.microsoft.com/office/drawing/2010/main" val="0"/>
-                        </a:ext>
-                      </a:extLst>
-                    </a:blip>
+                    <a:blip r:embed="rId8"/>
                     <a:stretch>
                       <a:fillRect/>
                     </a:stretch>
@@ -11663,11 +10914,9 @@
                   <pic:spPr>
                     <a:xfrm>
                       <a:off x="0" y="0"/>
-                      <a:ext cx="4754889" cy="4023368"/>
+                      <a:ext cx="5715000" cy="3707027"/>
                     </a:xfrm>
-                    <a:prstGeom prst="rect">
-                      <a:avLst/>
-                    </a:prstGeom>
+                    <a:prstGeom prst="rect"/>
                   </pic:spPr>
                 </pic:pic>
               </a:graphicData>
@@ -11680,44 +10929,50 @@
       <w:pPr>
         <w:rPr>
           <w:rFonts w:cs="Times New Roman"/>
+          <w:lang w:val="en-US"/>
+        </w:rPr>
+      </w:pPr>
+      <w:r>
+        <w:rPr>
+          <w:rFonts w:cs="Times New Roman"/>
+          <w:noProof/>
+          <w:lang w:eastAsia="es-PA"/>
+        </w:rPr>
+      </w:r>
+    </w:p>
+    <w:p>
+      <w:r>
+        <w:rPr>
           <w:b/>
-          <w:lang w:val="en-US"/>
-        </w:rPr>
-      </w:pPr>
-      <w:r>
-        <w:rPr>
-          <w:rFonts w:cs="Times New Roman"/>
-          <w:b/>
-          <w:lang w:val="en-US"/>
-        </w:rPr>
-        <w:t>Figure S5.2. Independent predictive validation confusion matrix.</w:t>
+        </w:rPr>
+        <w:t>Figure S5.6. Guardrail tradeoff for map releases.</w:t>
       </w:r>
     </w:p>
     <w:p>
       <w:pPr>
         <w:rPr>
-          <w:rFonts w:cs="Times New Roman"/>
           <w:lang w:val="en-US"/>
         </w:rPr>
       </w:pPr>
     </w:p>
     <w:p>
       <w:pPr>
-        <w:rPr>
-          <w:rFonts w:cs="Times New Roman"/>
+        <w:pStyle w:val="Heading2"/>
+        <w:rPr>
           <w:lang w:val="en-US"/>
         </w:rPr>
       </w:pPr>
       <w:r>
         <w:rPr>
-          <w:rFonts w:cs="Times New Roman"/>
-          <w:lang w:val="en-US"/>
-        </w:rPr>
-        <w:t>Figure S5.3 presents the decision-value loss-ratio sweep used to evaluate false-safe risk under asymmetric screening loss.</w:t>
+          <w:b/>
+          <w:lang w:val="en-US"/>
+        </w:rPr>
+        <w:t>S5.8 External FLIQ liquefaction-oriented false-safe audit</w:t>
       </w:r>
     </w:p>
     <w:p>
       <w:pPr>
+        <w:jc w:val="both"/>
         <w:rPr>
           <w:rFonts w:cs="Times New Roman"/>
           <w:lang w:val="en-US"/>
@@ -11726,94 +10981,582 @@
       <w:r>
         <w:rPr>
           <w:rFonts w:cs="Times New Roman"/>
-          <w:noProof/>
-          <w:lang w:eastAsia="es-PA"/>
-        </w:rPr>
-        <w:drawing>
-          <wp:inline distT="0" distB="0" distL="0" distR="0">
-            <wp:extent cx="5612130" cy="3581400"/>
-            <wp:effectExtent l="0" t="0" r="7620" b="0"/>
-            <wp:docPr id="5" name="Picture 5"/>
-            <wp:cNvGraphicFramePr>
-              <a:graphicFrameLocks xmlns:a="http://schemas.openxmlformats.org/drawingml/2006/main" noChangeAspect="1"/>
-            </wp:cNvGraphicFramePr>
-            <a:graphic xmlns:a="http://schemas.openxmlformats.org/drawingml/2006/main">
-              <a:graphicData uri="http://schemas.openxmlformats.org/drawingml/2006/picture">
-                <pic:pic xmlns:pic="http://schemas.openxmlformats.org/drawingml/2006/picture">
-                  <pic:nvPicPr>
-                    <pic:cNvPr id="5" name=""/>
-                    <pic:cNvPicPr/>
-                  </pic:nvPicPr>
-                  <pic:blipFill>
-                    <a:blip r:embed="rId6" cstate="print">
-                      <a:extLst>
-                        <a:ext uri="{28A0092B-C50C-407E-A947-70E740481C1C}">
-                          <a14:useLocalDpi xmlns:a14="http://schemas.microsoft.com/office/drawing/2010/main" val="0"/>
-                        </a:ext>
-                      </a:extLst>
-                    </a:blip>
-                    <a:stretch>
-                      <a:fillRect/>
-                    </a:stretch>
-                  </pic:blipFill>
-                  <pic:spPr>
-                    <a:xfrm>
-                      <a:off x="0" y="0"/>
-                      <a:ext cx="5612130" cy="3581400"/>
-                    </a:xfrm>
-                    <a:prstGeom prst="rect">
-                      <a:avLst/>
-                    </a:prstGeom>
-                  </pic:spPr>
-                </pic:pic>
-              </a:graphicData>
-            </a:graphic>
-          </wp:inline>
-        </w:drawing>
+          <w:lang w:val="en-US"/>
+        </w:rPr>
+        <w:t>As a secondary external check, the public FLIQ foundation and ground performance in liquefaction experiments database was added as a false-safe audit. FLIQ contains centrifuge case histories for shallow foundations and liquefaction-oriented soil-foundation interaction, with consistently tabulated base motion, surface motion, settlement and rotation quantities (Allmond et al., 2015). This layer is deliberately framed as a displacement/settlement risk audit rather than as nonlinear 3D response-history validation.</w:t>
       </w:r>
     </w:p>
     <w:p>
       <w:pPr>
-        <w:rPr>
-          <w:rFonts w:cs="Times New Roman"/>
-          <w:b/>
+        <w:jc w:val="both"/>
+        <w:rPr>
+          <w:rFonts w:cs="Times New Roman"/>
           <w:lang w:val="en-US"/>
         </w:rPr>
       </w:pPr>
       <w:r>
         <w:rPr>
           <w:rFonts w:cs="Times New Roman"/>
-          <w:b/>
-          <w:lang w:val="en-US"/>
-        </w:rPr>
-        <w:t>Figure S5.3. Decision-value loss-ratio sweep.</w:t>
+          <w:lang w:val="en-US"/>
+        </w:rPr>
+        <w:t>The audit asks a narrow screening question: when acceleration-side response appears beneficial, does the case nevertheless show settlement or rotation penalties? From 405 FLIQ rows, 241 structural rows had sufficient base acceleration, surface acceleration, settlement and rotation quantities for the audit. Only three rows showed apparent acceleration-side benefit using the surface/base PGA proxy, and all three were false-safe under the settlement/rotation penalty definition. A pre-response guardrail using only input intensity and structural descriptors reduced the all-case false-safe rate to 8.7%, with 73.8% recall of settlement/rotation penalty cases and 77.9% safe precision.</w:t>
       </w:r>
     </w:p>
     <w:p>
       <w:pPr>
-        <w:rPr>
-          <w:rFonts w:cs="Times New Roman"/>
-          <w:lang w:val="en-US"/>
+        <w:jc w:val="both"/>
+        <w:rPr>
+          <w:rFonts w:cs="Times New Roman"/>
+          <w:lang w:val="en-US"/>
+        </w:rPr>
+      </w:pPr>
+      <w:r>
+        <w:rPr>
+          <w:rFonts w:cs="Times New Roman"/>
+          <w:lang w:val="en-US"/>
+        </w:rPr>
+        <w:t>This FLIQ layer supports the intended screening interpretation: acceleration or force-side benefit alone is not a sufficient safety release when settlement and rotation penalties are possible. It is used only as an external liquefaction-oriented false-safe audit; it does not replace the FoRDy/FoRCy proxy validation and does not establish nonlinear 3D site-specific predictive validation.</w:t>
+      </w:r>
+    </w:p>
+    <w:p>
+      <w:r>
+        <w:rPr>
+          <w:b w:val="0"/>
+          <w:sz w:val="20"/>
+        </w:rPr>
+        <w:t>Table S5.5 reports the external FLIQ liquefaction-oriented audit, which tests whether acceleration-side benefit can still coincide with settlement or rotation penalty.</w:t>
+      </w:r>
+    </w:p>
+    <w:p>
+      <w:r>
+        <w:rPr>
+          <w:b w:val="0"/>
+          <w:sz w:val="20"/>
+        </w:rPr>
+        <w:t>Table S5.5. External FLIQ liquefaction-oriented false-safe audit.</w:t>
+      </w:r>
+    </w:p>
+    <w:tbl>
+      <w:tblPr>
+        <w:tblStyle w:val="PlainTable2"/>
+        <w:tblW w:w="0" w:type="auto"/>
+        <w:tblLook w:val="04A0" w:firstRow="1" w:lastRow="0" w:firstColumn="1" w:lastColumn="0" w:noHBand="0" w:noVBand="1"/>
+      </w:tblPr>
+      <w:tblGrid>
+        <w:gridCol w:w="4820"/>
+        <w:gridCol w:w="761"/>
+      </w:tblGrid>
+      <w:tr>
+        <w:trPr>
+          <w:cnfStyle w:val="100000000000" w:firstRow="1" w:lastRow="0" w:firstColumn="0" w:lastColumn="0" w:oddVBand="0" w:evenVBand="0" w:oddHBand="0" w:evenHBand="0" w:firstRowFirstColumn="0" w:firstRowLastColumn="0" w:lastRowFirstColumn="0" w:lastRowLastColumn="0"/>
+        </w:trPr>
+        <w:tc>
+          <w:tcPr>
+            <w:cnfStyle w:val="001000000000" w:firstRow="0" w:lastRow="0" w:firstColumn="1" w:lastColumn="0" w:oddVBand="0" w:evenVBand="0" w:oddHBand="0" w:evenHBand="0" w:firstRowFirstColumn="0" w:firstRowLastColumn="0" w:lastRowFirstColumn="0" w:lastRowLastColumn="0"/>
+            <w:tcW w:w="0" w:type="auto"/>
+          </w:tcPr>
+          <w:p>
+            <w:pPr>
+              <w:rPr>
+                <w:rFonts w:cs="Times New Roman"/>
+                <w:sz w:val="20"/>
+              </w:rPr>
+            </w:pPr>
+            <w:r>
+              <w:rPr>
+                <w:rFonts w:cs="Times New Roman"/>
+                <w:sz w:val="20"/>
+              </w:rPr>
+              <w:t>FLIQ audit quantity</w:t>
+            </w:r>
+          </w:p>
+        </w:tc>
+        <w:tc>
+          <w:tcPr>
+            <w:tcW w:w="0" w:type="auto"/>
+          </w:tcPr>
+          <w:p>
+            <w:pPr>
+              <w:cnfStyle w:val="100000000000" w:firstRow="1" w:lastRow="0" w:firstColumn="0" w:lastColumn="0" w:oddVBand="0" w:evenVBand="0" w:oddHBand="0" w:evenHBand="0" w:firstRowFirstColumn="0" w:firstRowLastColumn="0" w:lastRowFirstColumn="0" w:lastRowLastColumn="0"/>
+              <w:rPr>
+                <w:rFonts w:cs="Times New Roman"/>
+                <w:sz w:val="20"/>
+              </w:rPr>
+            </w:pPr>
+            <w:r>
+              <w:rPr>
+                <w:rFonts w:cs="Times New Roman"/>
+                <w:sz w:val="20"/>
+              </w:rPr>
+              <w:t>Result</w:t>
+            </w:r>
+          </w:p>
+        </w:tc>
+      </w:tr>
+      <w:tr>
+        <w:trPr>
+          <w:cnfStyle w:val="000000100000" w:firstRow="0" w:lastRow="0" w:firstColumn="0" w:lastColumn="0" w:oddVBand="0" w:evenVBand="0" w:oddHBand="1" w:evenHBand="0" w:firstRowFirstColumn="0" w:firstRowLastColumn="0" w:lastRowFirstColumn="0" w:lastRowLastColumn="0"/>
+        </w:trPr>
+        <w:tc>
+          <w:tcPr>
+            <w:cnfStyle w:val="001000000000" w:firstRow="0" w:lastRow="0" w:firstColumn="1" w:lastColumn="0" w:oddVBand="0" w:evenVBand="0" w:oddHBand="0" w:evenHBand="0" w:firstRowFirstColumn="0" w:firstRowLastColumn="0" w:lastRowFirstColumn="0" w:lastRowLastColumn="0"/>
+            <w:tcW w:w="0" w:type="auto"/>
+          </w:tcPr>
+          <w:p>
+            <w:pPr>
+              <w:rPr>
+                <w:rFonts w:cs="Times New Roman"/>
+                <w:b w:val="0"/>
+                <w:sz w:val="20"/>
+              </w:rPr>
+            </w:pPr>
+            <w:r>
+              <w:rPr>
+                <w:rFonts w:cs="Times New Roman"/>
+                <w:b w:val="0"/>
+                <w:sz w:val="20"/>
+              </w:rPr>
+              <w:t>Raw FLIQ rows</w:t>
+            </w:r>
+          </w:p>
+        </w:tc>
+        <w:tc>
+          <w:tcPr>
+            <w:tcW w:w="0" w:type="auto"/>
+          </w:tcPr>
+          <w:p>
+            <w:pPr>
+              <w:cnfStyle w:val="000000100000" w:firstRow="0" w:lastRow="0" w:firstColumn="0" w:lastColumn="0" w:oddVBand="0" w:evenVBand="0" w:oddHBand="1" w:evenHBand="0" w:firstRowFirstColumn="0" w:firstRowLastColumn="0" w:lastRowFirstColumn="0" w:lastRowLastColumn="0"/>
+              <w:rPr>
+                <w:rFonts w:cs="Times New Roman"/>
+                <w:sz w:val="20"/>
+              </w:rPr>
+            </w:pPr>
+            <w:r>
+              <w:rPr>
+                <w:rFonts w:cs="Times New Roman"/>
+                <w:sz w:val="20"/>
+              </w:rPr>
+              <w:t>405</w:t>
+            </w:r>
+          </w:p>
+        </w:tc>
+      </w:tr>
+      <w:tr>
+        <w:tc>
+          <w:tcPr>
+            <w:cnfStyle w:val="001000000000" w:firstRow="0" w:lastRow="0" w:firstColumn="1" w:lastColumn="0" w:oddVBand="0" w:evenVBand="0" w:oddHBand="0" w:evenHBand="0" w:firstRowFirstColumn="0" w:firstRowLastColumn="0" w:lastRowFirstColumn="0" w:lastRowLastColumn="0"/>
+            <w:tcW w:w="0" w:type="auto"/>
+          </w:tcPr>
+          <w:p>
+            <w:pPr>
+              <w:rPr>
+                <w:rFonts w:cs="Times New Roman"/>
+                <w:b w:val="0"/>
+                <w:sz w:val="20"/>
+                <w:lang w:val="en-US"/>
+              </w:rPr>
+            </w:pPr>
+            <w:r>
+              <w:rPr>
+                <w:rFonts w:cs="Times New Roman"/>
+                <w:b w:val="0"/>
+                <w:sz w:val="20"/>
+                <w:lang w:val="en-US"/>
+              </w:rPr>
+              <w:t>Structural rows usable for audit</w:t>
+            </w:r>
+          </w:p>
+        </w:tc>
+        <w:tc>
+          <w:tcPr>
+            <w:tcW w:w="0" w:type="auto"/>
+          </w:tcPr>
+          <w:p>
+            <w:pPr>
+              <w:cnfStyle w:val="000000000000" w:firstRow="0" w:lastRow="0" w:firstColumn="0" w:lastColumn="0" w:oddVBand="0" w:evenVBand="0" w:oddHBand="0" w:evenHBand="0" w:firstRowFirstColumn="0" w:firstRowLastColumn="0" w:lastRowFirstColumn="0" w:lastRowLastColumn="0"/>
+              <w:rPr>
+                <w:rFonts w:cs="Times New Roman"/>
+                <w:sz w:val="20"/>
+              </w:rPr>
+            </w:pPr>
+            <w:r>
+              <w:rPr>
+                <w:rFonts w:cs="Times New Roman"/>
+                <w:sz w:val="20"/>
+              </w:rPr>
+              <w:t>241</w:t>
+            </w:r>
+          </w:p>
+        </w:tc>
+      </w:tr>
+      <w:tr>
+        <w:trPr>
+          <w:cnfStyle w:val="000000100000" w:firstRow="0" w:lastRow="0" w:firstColumn="0" w:lastColumn="0" w:oddVBand="0" w:evenVBand="0" w:oddHBand="1" w:evenHBand="0" w:firstRowFirstColumn="0" w:firstRowLastColumn="0" w:lastRowFirstColumn="0" w:lastRowLastColumn="0"/>
+        </w:trPr>
+        <w:tc>
+          <w:tcPr>
+            <w:cnfStyle w:val="001000000000" w:firstRow="0" w:lastRow="0" w:firstColumn="1" w:lastColumn="0" w:oddVBand="0" w:evenVBand="0" w:oddHBand="0" w:evenHBand="0" w:firstRowFirstColumn="0" w:firstRowLastColumn="0" w:lastRowFirstColumn="0" w:lastRowLastColumn="0"/>
+            <w:tcW w:w="0" w:type="auto"/>
+          </w:tcPr>
+          <w:p>
+            <w:pPr>
+              <w:rPr>
+                <w:rFonts w:cs="Times New Roman"/>
+                <w:b w:val="0"/>
+                <w:sz w:val="20"/>
+              </w:rPr>
+            </w:pPr>
+            <w:r>
+              <w:rPr>
+                <w:rFonts w:cs="Times New Roman"/>
+                <w:b w:val="0"/>
+                <w:sz w:val="20"/>
+              </w:rPr>
+              <w:t>Settlement/rotation penalty cases</w:t>
+            </w:r>
+          </w:p>
+        </w:tc>
+        <w:tc>
+          <w:tcPr>
+            <w:tcW w:w="0" w:type="auto"/>
+          </w:tcPr>
+          <w:p>
+            <w:pPr>
+              <w:cnfStyle w:val="000000100000" w:firstRow="0" w:lastRow="0" w:firstColumn="0" w:lastColumn="0" w:oddVBand="0" w:evenVBand="0" w:oddHBand="1" w:evenHBand="0" w:firstRowFirstColumn="0" w:firstRowLastColumn="0" w:lastRowFirstColumn="0" w:lastRowLastColumn="0"/>
+              <w:rPr>
+                <w:rFonts w:cs="Times New Roman"/>
+                <w:sz w:val="20"/>
+              </w:rPr>
+            </w:pPr>
+            <w:r>
+              <w:rPr>
+                <w:rFonts w:cs="Times New Roman"/>
+                <w:sz w:val="20"/>
+              </w:rPr>
+              <w:t>80</w:t>
+            </w:r>
+          </w:p>
+        </w:tc>
+      </w:tr>
+      <w:tr>
+        <w:tc>
+          <w:tcPr>
+            <w:cnfStyle w:val="001000000000" w:firstRow="0" w:lastRow="0" w:firstColumn="1" w:lastColumn="0" w:oddVBand="0" w:evenVBand="0" w:oddHBand="0" w:evenHBand="0" w:firstRowFirstColumn="0" w:firstRowLastColumn="0" w:lastRowFirstColumn="0" w:lastRowLastColumn="0"/>
+            <w:tcW w:w="0" w:type="auto"/>
+          </w:tcPr>
+          <w:p>
+            <w:pPr>
+              <w:rPr>
+                <w:rFonts w:cs="Times New Roman"/>
+                <w:b w:val="0"/>
+                <w:sz w:val="20"/>
+              </w:rPr>
+            </w:pPr>
+            <w:r>
+              <w:rPr>
+                <w:rFonts w:cs="Times New Roman"/>
+                <w:b w:val="0"/>
+                <w:sz w:val="20"/>
+              </w:rPr>
+              <w:t>Apparent acceleration-benefit cases</w:t>
+            </w:r>
+          </w:p>
+        </w:tc>
+        <w:tc>
+          <w:tcPr>
+            <w:tcW w:w="0" w:type="auto"/>
+          </w:tcPr>
+          <w:p>
+            <w:pPr>
+              <w:cnfStyle w:val="000000000000" w:firstRow="0" w:lastRow="0" w:firstColumn="0" w:lastColumn="0" w:oddVBand="0" w:evenVBand="0" w:oddHBand="0" w:evenHBand="0" w:firstRowFirstColumn="0" w:firstRowLastColumn="0" w:lastRowFirstColumn="0" w:lastRowLastColumn="0"/>
+              <w:rPr>
+                <w:rFonts w:cs="Times New Roman"/>
+                <w:sz w:val="20"/>
+              </w:rPr>
+            </w:pPr>
+            <w:r>
+              <w:rPr>
+                <w:rFonts w:cs="Times New Roman"/>
+                <w:sz w:val="20"/>
+              </w:rPr>
+              <w:t>3</w:t>
+            </w:r>
+          </w:p>
+        </w:tc>
+      </w:tr>
+      <w:tr>
+        <w:trPr>
+          <w:cnfStyle w:val="000000100000" w:firstRow="0" w:lastRow="0" w:firstColumn="0" w:lastColumn="0" w:oddVBand="0" w:evenVBand="0" w:oddHBand="1" w:evenHBand="0" w:firstRowFirstColumn="0" w:firstRowLastColumn="0" w:lastRowFirstColumn="0" w:lastRowLastColumn="0"/>
+        </w:trPr>
+        <w:tc>
+          <w:tcPr>
+            <w:cnfStyle w:val="001000000000" w:firstRow="0" w:lastRow="0" w:firstColumn="1" w:lastColumn="0" w:oddVBand="0" w:evenVBand="0" w:oddHBand="0" w:evenHBand="0" w:firstRowFirstColumn="0" w:firstRowLastColumn="0" w:lastRowFirstColumn="0" w:lastRowLastColumn="0"/>
+            <w:tcW w:w="0" w:type="auto"/>
+          </w:tcPr>
+          <w:p>
+            <w:pPr>
+              <w:rPr>
+                <w:rFonts w:cs="Times New Roman"/>
+                <w:b w:val="0"/>
+                <w:sz w:val="20"/>
+                <w:lang w:val="en-US"/>
+              </w:rPr>
+            </w:pPr>
+            <w:r>
+              <w:rPr>
+                <w:rFonts w:cs="Times New Roman"/>
+                <w:b w:val="0"/>
+                <w:sz w:val="20"/>
+                <w:lang w:val="en-US"/>
+              </w:rPr>
+              <w:t>Acceleration-only false-safe cases</w:t>
+            </w:r>
+          </w:p>
+        </w:tc>
+        <w:tc>
+          <w:tcPr>
+            <w:tcW w:w="0" w:type="auto"/>
+          </w:tcPr>
+          <w:p>
+            <w:pPr>
+              <w:cnfStyle w:val="000000100000" w:firstRow="0" w:lastRow="0" w:firstColumn="0" w:lastColumn="0" w:oddVBand="0" w:evenVBand="0" w:oddHBand="1" w:evenHBand="0" w:firstRowFirstColumn="0" w:firstRowLastColumn="0" w:lastRowFirstColumn="0" w:lastRowLastColumn="0"/>
+              <w:rPr>
+                <w:rFonts w:cs="Times New Roman"/>
+                <w:sz w:val="20"/>
+              </w:rPr>
+            </w:pPr>
+            <w:r>
+              <w:rPr>
+                <w:rFonts w:cs="Times New Roman"/>
+                <w:sz w:val="20"/>
+              </w:rPr>
+              <w:t>3</w:t>
+            </w:r>
+          </w:p>
+        </w:tc>
+      </w:tr>
+      <w:tr>
+        <w:tc>
+          <w:tcPr>
+            <w:cnfStyle w:val="001000000000" w:firstRow="0" w:lastRow="0" w:firstColumn="1" w:lastColumn="0" w:oddVBand="0" w:evenVBand="0" w:oddHBand="0" w:evenHBand="0" w:firstRowFirstColumn="0" w:firstRowLastColumn="0" w:lastRowFirstColumn="0" w:lastRowLastColumn="0"/>
+            <w:tcW w:w="0" w:type="auto"/>
+          </w:tcPr>
+          <w:p>
+            <w:pPr>
+              <w:rPr>
+                <w:rFonts w:cs="Times New Roman"/>
+                <w:b w:val="0"/>
+                <w:sz w:val="20"/>
+                <w:lang w:val="en-US"/>
+              </w:rPr>
+            </w:pPr>
+            <w:r>
+              <w:rPr>
+                <w:rFonts w:cs="Times New Roman"/>
+                <w:b w:val="0"/>
+                <w:sz w:val="20"/>
+                <w:lang w:val="en-US"/>
+              </w:rPr>
+              <w:t>False-safe rate among apparent acceleration-benefit cases</w:t>
+            </w:r>
+          </w:p>
+        </w:tc>
+        <w:tc>
+          <w:tcPr>
+            <w:tcW w:w="0" w:type="auto"/>
+          </w:tcPr>
+          <w:p>
+            <w:pPr>
+              <w:cnfStyle w:val="000000000000" w:firstRow="0" w:lastRow="0" w:firstColumn="0" w:lastColumn="0" w:oddVBand="0" w:evenVBand="0" w:oddHBand="0" w:evenHBand="0" w:firstRowFirstColumn="0" w:firstRowLastColumn="0" w:lastRowFirstColumn="0" w:lastRowLastColumn="0"/>
+              <w:rPr>
+                <w:rFonts w:cs="Times New Roman"/>
+                <w:sz w:val="20"/>
+              </w:rPr>
+            </w:pPr>
+            <w:r>
+              <w:rPr>
+                <w:rFonts w:cs="Times New Roman"/>
+                <w:sz w:val="20"/>
+              </w:rPr>
+              <w:t>100%</w:t>
+            </w:r>
+          </w:p>
+        </w:tc>
+      </w:tr>
+      <w:tr>
+        <w:trPr>
+          <w:cnfStyle w:val="000000100000" w:firstRow="0" w:lastRow="0" w:firstColumn="0" w:lastColumn="0" w:oddVBand="0" w:evenVBand="0" w:oddHBand="1" w:evenHBand="0" w:firstRowFirstColumn="0" w:firstRowLastColumn="0" w:lastRowFirstColumn="0" w:lastRowLastColumn="0"/>
+        </w:trPr>
+        <w:tc>
+          <w:tcPr>
+            <w:cnfStyle w:val="001000000000" w:firstRow="0" w:lastRow="0" w:firstColumn="1" w:lastColumn="0" w:oddVBand="0" w:evenVBand="0" w:oddHBand="0" w:evenHBand="0" w:firstRowFirstColumn="0" w:firstRowLastColumn="0" w:lastRowFirstColumn="0" w:lastRowLastColumn="0"/>
+            <w:tcW w:w="0" w:type="auto"/>
+          </w:tcPr>
+          <w:p>
+            <w:pPr>
+              <w:rPr>
+                <w:rFonts w:cs="Times New Roman"/>
+                <w:b w:val="0"/>
+                <w:sz w:val="20"/>
+                <w:lang w:val="en-US"/>
+              </w:rPr>
+            </w:pPr>
+            <w:r>
+              <w:rPr>
+                <w:rFonts w:cs="Times New Roman"/>
+                <w:b w:val="0"/>
+                <w:sz w:val="20"/>
+                <w:lang w:val="en-US"/>
+              </w:rPr>
+              <w:t>Pre-response guardrail all-case false-safe rate</w:t>
+            </w:r>
+          </w:p>
+        </w:tc>
+        <w:tc>
+          <w:tcPr>
+            <w:tcW w:w="0" w:type="auto"/>
+          </w:tcPr>
+          <w:p>
+            <w:pPr>
+              <w:cnfStyle w:val="000000100000" w:firstRow="0" w:lastRow="0" w:firstColumn="0" w:lastColumn="0" w:oddVBand="0" w:evenVBand="0" w:oddHBand="1" w:evenHBand="0" w:firstRowFirstColumn="0" w:firstRowLastColumn="0" w:lastRowFirstColumn="0" w:lastRowLastColumn="0"/>
+              <w:rPr>
+                <w:rFonts w:cs="Times New Roman"/>
+                <w:sz w:val="20"/>
+              </w:rPr>
+            </w:pPr>
+            <w:r>
+              <w:rPr>
+                <w:rFonts w:cs="Times New Roman"/>
+                <w:sz w:val="20"/>
+              </w:rPr>
+              <w:t>8.7%</w:t>
+            </w:r>
+          </w:p>
+        </w:tc>
+      </w:tr>
+      <w:tr>
+        <w:tc>
+          <w:tcPr>
+            <w:cnfStyle w:val="001000000000" w:firstRow="0" w:lastRow="0" w:firstColumn="1" w:lastColumn="0" w:oddVBand="0" w:evenVBand="0" w:oddHBand="0" w:evenHBand="0" w:firstRowFirstColumn="0" w:firstRowLastColumn="0" w:lastRowFirstColumn="0" w:lastRowLastColumn="0"/>
+            <w:tcW w:w="0" w:type="auto"/>
+          </w:tcPr>
+          <w:p>
+            <w:pPr>
+              <w:rPr>
+                <w:rFonts w:cs="Times New Roman"/>
+                <w:b w:val="0"/>
+                <w:sz w:val="20"/>
+                <w:lang w:val="en-US"/>
+              </w:rPr>
+            </w:pPr>
+            <w:r>
+              <w:rPr>
+                <w:rFonts w:cs="Times New Roman"/>
+                <w:b w:val="0"/>
+                <w:sz w:val="20"/>
+                <w:lang w:val="en-US"/>
+              </w:rPr>
+              <w:t>Pre-response guardrail settlement/rotation penalty recall</w:t>
+            </w:r>
+          </w:p>
+        </w:tc>
+        <w:tc>
+          <w:tcPr>
+            <w:tcW w:w="0" w:type="auto"/>
+          </w:tcPr>
+          <w:p>
+            <w:pPr>
+              <w:cnfStyle w:val="000000000000" w:firstRow="0" w:lastRow="0" w:firstColumn="0" w:lastColumn="0" w:oddVBand="0" w:evenVBand="0" w:oddHBand="0" w:evenHBand="0" w:firstRowFirstColumn="0" w:firstRowLastColumn="0" w:lastRowFirstColumn="0" w:lastRowLastColumn="0"/>
+              <w:rPr>
+                <w:rFonts w:cs="Times New Roman"/>
+                <w:sz w:val="20"/>
+              </w:rPr>
+            </w:pPr>
+            <w:r>
+              <w:rPr>
+                <w:rFonts w:cs="Times New Roman"/>
+                <w:sz w:val="20"/>
+              </w:rPr>
+              <w:t>73.8%</w:t>
+            </w:r>
+          </w:p>
+        </w:tc>
+      </w:tr>
+      <w:tr>
+        <w:trPr>
+          <w:cnfStyle w:val="000000100000" w:firstRow="0" w:lastRow="0" w:firstColumn="0" w:lastColumn="0" w:oddVBand="0" w:evenVBand="0" w:oddHBand="1" w:evenHBand="0" w:firstRowFirstColumn="0" w:firstRowLastColumn="0" w:lastRowFirstColumn="0" w:lastRowLastColumn="0"/>
+        </w:trPr>
+        <w:tc>
+          <w:tcPr>
+            <w:cnfStyle w:val="001000000000" w:firstRow="0" w:lastRow="0" w:firstColumn="1" w:lastColumn="0" w:oddVBand="0" w:evenVBand="0" w:oddHBand="0" w:evenHBand="0" w:firstRowFirstColumn="0" w:firstRowLastColumn="0" w:lastRowFirstColumn="0" w:lastRowLastColumn="0"/>
+            <w:tcW w:w="0" w:type="auto"/>
+          </w:tcPr>
+          <w:p>
+            <w:pPr>
+              <w:rPr>
+                <w:rFonts w:cs="Times New Roman"/>
+                <w:b w:val="0"/>
+                <w:sz w:val="20"/>
+                <w:lang w:val="en-US"/>
+              </w:rPr>
+            </w:pPr>
+            <w:r>
+              <w:rPr>
+                <w:rFonts w:cs="Times New Roman"/>
+                <w:b w:val="0"/>
+                <w:sz w:val="20"/>
+                <w:lang w:val="en-US"/>
+              </w:rPr>
+              <w:t>Pre-response guardrail safe precision</w:t>
+            </w:r>
+          </w:p>
+        </w:tc>
+        <w:tc>
+          <w:tcPr>
+            <w:tcW w:w="0" w:type="auto"/>
+          </w:tcPr>
+          <w:p>
+            <w:pPr>
+              <w:cnfStyle w:val="000000100000" w:firstRow="0" w:lastRow="0" w:firstColumn="0" w:lastColumn="0" w:oddVBand="0" w:evenVBand="0" w:oddHBand="1" w:evenHBand="0" w:firstRowFirstColumn="0" w:firstRowLastColumn="0" w:lastRowFirstColumn="0" w:lastRowLastColumn="0"/>
+              <w:rPr>
+                <w:rFonts w:cs="Times New Roman"/>
+                <w:sz w:val="20"/>
+              </w:rPr>
+            </w:pPr>
+            <w:r>
+              <w:rPr>
+                <w:rFonts w:cs="Times New Roman"/>
+                <w:sz w:val="20"/>
+              </w:rPr>
+              <w:t>77.9%</w:t>
+            </w:r>
+          </w:p>
+        </w:tc>
+      </w:tr>
+    </w:tbl>
+    <w:p>
+      <w:pPr>
+        <w:jc w:val="both"/>
+        <w:rPr>
+          <w:rFonts w:cs="Times New Roman"/>
         </w:rPr>
       </w:pPr>
     </w:p>
     <w:p>
       <w:pPr>
-        <w:rPr>
-          <w:rFonts w:cs="Times New Roman"/>
-          <w:lang w:val="en-US"/>
-        </w:rPr>
+        <w:pStyle w:val="Heading2"/>
       </w:pPr>
       <w:r>
         <w:rPr>
-          <w:rFonts w:cs="Times New Roman"/>
-          <w:lang w:val="en-US"/>
-        </w:rPr>
-        <w:t>Figure S5.4 shows the failure-mode atlas on the Demand-Polarity Map, identifying where robust, marginal, false-conservative and false-safe screening outcomes occur.</w:t>
+          <w:b/>
+        </w:rPr>
+        <w:t>S5.9 External literature consistency benchmark</w:t>
       </w:r>
     </w:p>
     <w:p>
       <w:pPr>
+        <w:jc w:val="both"/>
         <w:rPr>
           <w:rFonts w:cs="Times New Roman"/>
           <w:lang w:val="en-US"/>
@@ -11822,67 +11565,25 @@
       <w:r>
         <w:rPr>
           <w:rFonts w:cs="Times New Roman"/>
-          <w:noProof/>
-          <w:lang w:eastAsia="es-PA"/>
-        </w:rPr>
-        <w:drawing>
-          <wp:inline distT="0" distB="0" distL="0" distR="0">
-            <wp:extent cx="5612130" cy="3848100"/>
-            <wp:effectExtent l="0" t="0" r="7620" b="0"/>
-            <wp:docPr id="6" name="Picture 6"/>
-            <wp:cNvGraphicFramePr>
-              <a:graphicFrameLocks xmlns:a="http://schemas.openxmlformats.org/drawingml/2006/main" noChangeAspect="1"/>
-            </wp:cNvGraphicFramePr>
-            <a:graphic xmlns:a="http://schemas.openxmlformats.org/drawingml/2006/main">
-              <a:graphicData uri="http://schemas.openxmlformats.org/drawingml/2006/picture">
-                <pic:pic xmlns:pic="http://schemas.openxmlformats.org/drawingml/2006/picture">
-                  <pic:nvPicPr>
-                    <pic:cNvPr id="6" name=""/>
-                    <pic:cNvPicPr/>
-                  </pic:nvPicPr>
-                  <pic:blipFill>
-                    <a:blip r:embed="rId7" cstate="print">
-                      <a:extLst>
-                        <a:ext uri="{28A0092B-C50C-407E-A947-70E740481C1C}">
-                          <a14:useLocalDpi xmlns:a14="http://schemas.microsoft.com/office/drawing/2010/main" val="0"/>
-                        </a:ext>
-                      </a:extLst>
-                    </a:blip>
-                    <a:stretch>
-                      <a:fillRect/>
-                    </a:stretch>
-                  </pic:blipFill>
-                  <pic:spPr>
-                    <a:xfrm>
-                      <a:off x="0" y="0"/>
-                      <a:ext cx="5612130" cy="3848100"/>
-                    </a:xfrm>
-                    <a:prstGeom prst="rect">
-                      <a:avLst/>
-                    </a:prstGeom>
-                  </pic:spPr>
-                </pic:pic>
-              </a:graphicData>
-            </a:graphic>
-          </wp:inline>
-        </w:drawing>
+          <w:lang w:val="en-US"/>
+        </w:rPr>
+        <w:t>As an additional literature-based consistency benchmark, recent and classical SSI studies were screened for independently reported combinations of force-side and displacement-side response. Zhang and Far (2024) provide the strongest quantitative mapping candidate because their finite-element soil-foundation-structure study was verified against shaking-table tests and reports normalized base-shear and inter-storey drift ratios for a large high-rise parametric matrix. Their reported mechanism, in which foundation rotation can reduce base shear while increasing inter-storey drift, is consistent with the mixed demand-polarity region of the present map. Yang et al. (2024) provide an independent range check under far-field long-period motions: reported SSI base-shear coefficients are generally below unity, while displacement and drift coefficients exceed unity, with the caveat that bimodal spectra can still produce shear amplification. Tao et al. (2024) further supports the spectral-shift interpretation by showing that SSI can be detrimental when period/frequency shift moves the system into an unfavorable demand region. Mylonakis and Gazetas (2000) provide the classical theoretical and recorded-motion basis for treating SSI as conditionally beneficial or detrimental, rather than automatically favorable. Tileylioglu et al. (2011) adds field evidence that foundation stiffness and damping are frequency dependent and measurable at the Garner Valley SFSI structure, supporting the physical plausibility of the reduced-model inputs.</w:t>
       </w:r>
     </w:p>
     <w:p>
       <w:pPr>
-        <w:rPr>
-          <w:rFonts w:cs="Times New Roman"/>
-          <w:b/>
+        <w:jc w:val="both"/>
+        <w:rPr>
+          <w:rFonts w:cs="Times New Roman"/>
           <w:lang w:val="en-US"/>
         </w:rPr>
       </w:pPr>
       <w:r>
         <w:rPr>
           <w:rFonts w:cs="Times New Roman"/>
-          <w:b/>
-          <w:lang w:val="en-US"/>
-        </w:rPr>
-        <w:t>Figure S5.4. Failure-mode atlas on the Demand-Polarity Map.</w:t>
+          <w:lang w:val="en-US"/>
+        </w:rPr>
+        <w:t>This literature layer is deliberately treated as external consistency evidence, not as independent nonlinear three-dimensional validation. The comparison strengthens the screening interpretation because independent studies report the same force/displacement polarity separation and the same dependence on spectral or frequency shift, but it does not establish calibrated response-history prediction. The claim boundary therefore remains unchanged: the proposed criterion is a reproducible class-screening and false-safe audit tool that flags demand-polarity risk before detailed nonlinear SSI analysis.</w:t>
       </w:r>
     </w:p>
     <w:p>
@@ -11905,185 +11606,7 @@
           <w:rFonts w:cs="Times New Roman"/>
           <w:lang w:val="en-US"/>
         </w:rPr>
-        <w:t>Figure S5.5 reports the guardrail tradeoff used to escalate low-margin releases and reduce false-safe screening decisions.</w:t>
-      </w:r>
-    </w:p>
-    <w:p>
-      <w:pPr>
-        <w:rPr>
-          <w:rFonts w:cs="Times New Roman"/>
-          <w:lang w:val="en-US"/>
-        </w:rPr>
-      </w:pPr>
-      <w:r>
-        <w:rPr>
-          <w:rFonts w:cs="Times New Roman"/>
-          <w:noProof/>
-          <w:lang w:eastAsia="es-PA"/>
-        </w:rPr>
-        <w:drawing>
-          <wp:inline distT="0" distB="0" distL="0" distR="0">
-            <wp:extent cx="5612130" cy="3640455"/>
-            <wp:effectExtent l="0" t="0" r="7620" b="0"/>
-            <wp:docPr id="9" name="Picture 9"/>
-            <wp:cNvGraphicFramePr>
-              <a:graphicFrameLocks xmlns:a="http://schemas.openxmlformats.org/drawingml/2006/main" noChangeAspect="1"/>
-            </wp:cNvGraphicFramePr>
-            <a:graphic xmlns:a="http://schemas.openxmlformats.org/drawingml/2006/main">
-              <a:graphicData uri="http://schemas.openxmlformats.org/drawingml/2006/picture">
-                <pic:pic xmlns:pic="http://schemas.openxmlformats.org/drawingml/2006/picture">
-                  <pic:nvPicPr>
-                    <pic:cNvPr id="9" name=""/>
-                    <pic:cNvPicPr/>
-                  </pic:nvPicPr>
-                  <pic:blipFill>
-                    <a:blip r:embed="rId8" cstate="print">
-                      <a:extLst>
-                        <a:ext uri="{28A0092B-C50C-407E-A947-70E740481C1C}">
-                          <a14:useLocalDpi xmlns:a14="http://schemas.microsoft.com/office/drawing/2010/main" val="0"/>
-                        </a:ext>
-                      </a:extLst>
-                    </a:blip>
-                    <a:stretch>
-                      <a:fillRect/>
-                    </a:stretch>
-                  </pic:blipFill>
-                  <pic:spPr>
-                    <a:xfrm>
-                      <a:off x="0" y="0"/>
-                      <a:ext cx="5612130" cy="3640455"/>
-                    </a:xfrm>
-                    <a:prstGeom prst="rect">
-                      <a:avLst/>
-                    </a:prstGeom>
-                  </pic:spPr>
-                </pic:pic>
-              </a:graphicData>
-            </a:graphic>
-          </wp:inline>
-        </w:drawing>
-      </w:r>
-    </w:p>
-    <w:p>
-      <w:pPr>
-        <w:rPr>
-          <w:rFonts w:cs="Times New Roman"/>
-          <w:b/>
-          <w:lang w:val="en-US"/>
-        </w:rPr>
-      </w:pPr>
-      <w:r>
-        <w:rPr>
-          <w:rFonts w:cs="Times New Roman"/>
-          <w:b/>
-          <w:lang w:val="en-US"/>
-        </w:rPr>
-        <w:t>Figure S5.5. Guardrail tradeoff for map releases.</w:t>
-      </w:r>
-    </w:p>
-    <w:p>
-      <w:pPr>
-        <w:rPr>
-          <w:rFonts w:cs="Times New Roman"/>
-          <w:lang w:val="en-US"/>
-        </w:rPr>
-      </w:pPr>
-    </w:p>
-    <w:p>
-      <w:pPr>
-        <w:rPr>
-          <w:rFonts w:cs="Times New Roman"/>
-          <w:lang w:val="en-US"/>
-        </w:rPr>
-      </w:pPr>
-      <w:r>
-        <w:rPr>
-          <w:rFonts w:cs="Times New Roman"/>
-          <w:lang w:val="en-US"/>
-        </w:rPr>
-        <w:t>Figure S5.6 shows the solver-backed demand-polarity map used as a class-prediction check rather than as a full nonlinear response-history validation.</w:t>
-      </w:r>
-    </w:p>
-    <w:p>
-      <w:pPr>
-        <w:rPr>
-          <w:rFonts w:cs="Times New Roman"/>
-          <w:lang w:val="en-US"/>
-        </w:rPr>
-      </w:pPr>
-      <w:r>
-        <w:rPr>
-          <w:rFonts w:cs="Times New Roman"/>
-          <w:noProof/>
-          <w:lang w:eastAsia="es-PA"/>
-        </w:rPr>
-        <w:drawing>
-          <wp:inline distT="0" distB="0" distL="0" distR="0">
-            <wp:extent cx="5612130" cy="4344670"/>
-            <wp:effectExtent l="0" t="0" r="7620" b="0"/>
-            <wp:docPr id="11" name="Picture 11"/>
-            <wp:cNvGraphicFramePr>
-              <a:graphicFrameLocks xmlns:a="http://schemas.openxmlformats.org/drawingml/2006/main" noChangeAspect="1"/>
-            </wp:cNvGraphicFramePr>
-            <a:graphic xmlns:a="http://schemas.openxmlformats.org/drawingml/2006/main">
-              <a:graphicData uri="http://schemas.openxmlformats.org/drawingml/2006/picture">
-                <pic:pic xmlns:pic="http://schemas.openxmlformats.org/drawingml/2006/picture">
-                  <pic:nvPicPr>
-                    <pic:cNvPr id="11" name=""/>
-                    <pic:cNvPicPr/>
-                  </pic:nvPicPr>
-                  <pic:blipFill>
-                    <a:blip r:embed="rId9">
-                      <a:extLst>
-                        <a:ext uri="{28A0092B-C50C-407E-A947-70E740481C1C}">
-                          <a14:useLocalDpi xmlns:a14="http://schemas.microsoft.com/office/drawing/2010/main" val="0"/>
-                        </a:ext>
-                      </a:extLst>
-                    </a:blip>
-                    <a:stretch>
-                      <a:fillRect/>
-                    </a:stretch>
-                  </pic:blipFill>
-                  <pic:spPr>
-                    <a:xfrm>
-                      <a:off x="0" y="0"/>
-                      <a:ext cx="5612130" cy="4344670"/>
-                    </a:xfrm>
-                    <a:prstGeom prst="rect">
-                      <a:avLst/>
-                    </a:prstGeom>
-                  </pic:spPr>
-                </pic:pic>
-              </a:graphicData>
-            </a:graphic>
-          </wp:inline>
-        </w:drawing>
-      </w:r>
-    </w:p>
-    <w:p>
-      <w:pPr>
-        <w:rPr>
-          <w:rFonts w:cs="Times New Roman"/>
-          <w:b/>
-          <w:lang w:val="en-US"/>
-        </w:rPr>
-      </w:pPr>
-      <w:r>
-        <w:rPr>
-          <w:rFonts w:cs="Times New Roman"/>
-          <w:b/>
-          <w:lang w:val="en-US"/>
-        </w:rPr>
-        <w:t>Figure S5.6. Solver-backed demand-polarity map.</w:t>
-      </w:r>
-    </w:p>
-    <w:p>
-      <w:pPr>
-        <w:rPr>
-          <w:rFonts w:cs="Times New Roman"/>
-          <w:lang w:val="en-US"/>
-        </w:rPr>
-      </w:pPr>
+      </w:r>
     </w:p>
     <w:sectPr>
       <w:pgSz w:w="12240" w:h="15840"/>

</xml_diff>